<commit_message>
Bo ngay thang / nhan test khoi tai lieu hoc vien
Slides, handbook, notebooks, screenshots, code comments: bo cac cum khong chuyen nghiep nhu 'da verify/test 29/05/2026', 'output tu phien test 29/05', 'anh chup that', va tieu de screenshot '(test 29/05/2026)'. Rebuild lai slides (Marp pptx/pdf/html), docx (pandoc), screenshots (PIL) tu nguon da don nen ban render khong con lech. Giu lai bang PASS/FAIL vi minh hoa kha nang & gioi han cua RAG/agent (chi bo nhan ngay).

Co-Authored-By: Claude Opus 4.8 (1M context) <noreply@anthropic.com>
</commit_message>
<xml_diff>
--- a/docs/TAI_LIEU_CHI_TIET.docx
+++ b/docs/TAI_LIEU_CHI_TIET.docx
@@ -413,13 +413,13 @@
         <w:t xml:space="preserve">Đọc cả bảng + code.</w:t>
       </w:r>
     </w:p>
-    <w:bookmarkStart w:id="12" w:name="X6ff25d286b87a6505caa18513818d28e6179da9"/>
+    <w:bookmarkStart w:id="12" w:name="cấu-hình-chuẩn-của-workshop"/>
     <w:p>
       <w:pPr>
         <w:pStyle w:val="Heading2"/>
       </w:pPr>
       <w:r>
-        <w:t xml:space="preserve">Cấu hình chuẩn của workshop (đã test 29/05/2026)</w:t>
+        <w:t xml:space="preserve">Cấu hình chuẩn của workshop</w:t>
       </w:r>
     </w:p>
     <w:tbl>
@@ -8752,13 +8752,13 @@
         <w:t xml:space="preserve">(đúng câu hỏi không).</w:t>
       </w:r>
     </w:p>
-    <w:bookmarkStart w:id="72" w:name="X473d7daf85dc1cefe05d24407a837cafb2254a6"/>
+    <w:bookmarkStart w:id="72" w:name="bộ-câu-hỏi-mẫu-trên-workshop-dataset"/>
     <w:p>
       <w:pPr>
         <w:pStyle w:val="Heading3"/>
       </w:pPr>
       <w:r>
-        <w:t xml:space="preserve">Bộ câu hỏi đã verify trên workshop dataset (29/05/2026)</w:t>
+        <w:t xml:space="preserve">Bộ câu hỏi mẫu trên workshop dataset</w:t>
       </w:r>
     </w:p>
     <w:p>
@@ -8776,7 +8776,7 @@
           <w:i/>
           <w:iCs/>
         </w:rPr>
-        <w:t xml:space="preserve">Ghi chú từ buổi test thật — không phải lý thuyết chung. Dùng để self-check sau khi build xong index.</w:t>
+        <w:t xml:space="preserve">Dùng để self-check sau khi build xong index — thấy rõ RAG làm tốt gì và giới hạn ở đâu.</w:t>
       </w:r>
     </w:p>
     <w:p>
@@ -8784,7 +8784,7 @@
         <w:pStyle w:val="BodyText"/>
       </w:pPr>
       <w:r>
-        <w:t xml:space="preserve">Đây là các câu hỏi đã chạy thực tế trên dataset 6 quy chế an ninh. Dùng để self-check khi học viên build xong index.</w:t>
+        <w:t xml:space="preserve">Các câu hỏi dưới đây chạy trên dataset 6 quy chế mẫu — minh họa rõ RAG làm tốt gì và vấp ở đâu.</w:t>
       </w:r>
     </w:p>
     <w:tbl>
@@ -11696,13 +11696,13 @@
       </w:r>
     </w:p>
     <w:bookmarkEnd w:id="92"/>
-    <w:bookmarkStart w:id="93" w:name="kết-quả-test-trên-workshop-29052026"/>
+    <w:bookmarkStart w:id="93" w:name="kết-quả-agent-trên-workshop-dataset"/>
     <w:p>
       <w:pPr>
         <w:pStyle w:val="Heading3"/>
       </w:pPr>
       <w:r>
-        <w:t xml:space="preserve">Kết quả test trên workshop (29/05/2026)</w:t>
+        <w:t xml:space="preserve">Kết quả agent trên workshop dataset</w:t>
       </w:r>
     </w:p>
     <w:p>
@@ -11710,7 +11710,7 @@
         <w:pStyle w:val="FirstParagraph"/>
       </w:pPr>
       <w:r>
-        <w:t xml:space="preserve">Đã test agent với 3 mode trên</w:t>
+        <w:t xml:space="preserve">Agent chạy với 3 mode trên</w:t>
       </w:r>
       <w:r>
         <w:t xml:space="preserve"> </w:t>

</xml_diff>

<commit_message>
Gop ve 1 giao dien duy nhat: Open WebUI (bo 3-track, demote Gradio app)
Theo y kien hoc sinh do roi: moi tai lieu (README, slide, handbook, kich ban, checklist, notebook) gio chi tro vao Open WebUI lam giao dien chat (giong ChatGPT, docker compose up -d -> :3000). Bo khung 3-track A/B/C -> 1 duong: hoc bang notebook + dung Open WebUI. Gradio app (2_rag/app.py) GIU lai nhung ha xuong 'vi du nang cao tuy chon', khong con trong luong hoc chinh. Thay anh demo Gradio bang anh Open WebUI THAT (qwen3:1.7b, Q&A tieng Viet) trong slide 16 + handbook; xoa 2 anh Gradio cu; them docs/capture_openwebui.py. Rebuild slides (Marp) + docx (pandoc) + diagram kien truc.

Co-Authored-By: Claude Opus 4.8 (1M context) <noreply@anthropic.com>
</commit_message>
<xml_diff>
--- a/docs/TAI_LIEU_CHI_TIET.docx
+++ b/docs/TAI_LIEU_CHI_TIET.docx
@@ -925,7 +925,7 @@
       <w:r>
         <w:drawing>
           <wp:inline>
-            <wp:extent cx="5334000" cy="3954117"/>
+            <wp:extent cx="5334000" cy="3980074"/>
             <wp:effectExtent b="0" l="0" r="0" t="0"/>
             <wp:docPr descr="Hình 1. Kiến trúc tổng thể: Local LLM + RAG + Agent (100% offline)" title="" id="10" name="Picture"/>
             <a:graphic>
@@ -946,7 +946,7 @@
                   <pic:spPr bwMode="auto">
                     <a:xfrm>
                       <a:off x="0" y="0"/>
-                      <a:ext cx="5334000" cy="3954117"/>
+                      <a:ext cx="5334000" cy="3980074"/>
                     </a:xfrm>
                     <a:prstGeom prst="rect">
                       <a:avLst/>
@@ -5119,7 +5119,7 @@
     </w:p>
     <w:bookmarkEnd w:id="45"/>
     <w:bookmarkEnd w:id="46"/>
-    <w:bookmarkStart w:id="83" w:name="phần-2--rag"/>
+    <w:bookmarkStart w:id="80" w:name="phần-2--rag"/>
     <w:p>
       <w:pPr>
         <w:pStyle w:val="Heading1"/>
@@ -8589,7 +8589,7 @@
     </w:p>
     <w:bookmarkEnd w:id="66"/>
     <w:bookmarkEnd w:id="67"/>
-    <w:bookmarkStart w:id="73" w:name="X88ff20a64e6f7bccb90ebe43c8a02a4f359c60e"/>
+    <w:bookmarkStart w:id="70" w:name="X88ff20a64e6f7bccb90ebe43c8a02a4f359c60e"/>
     <w:p>
       <w:pPr>
         <w:pStyle w:val="Heading2"/>
@@ -8601,65 +8601,6 @@
     <w:p>
       <w:pPr>
         <w:pStyle w:val="FirstParagraph"/>
-      </w:pPr>
-      <w:r>
-        <w:drawing>
-          <wp:inline>
-            <wp:extent cx="5334000" cy="3378200"/>
-            <wp:effectExtent b="0" l="0" r="0" t="0"/>
-            <wp:docPr descr="Hình 13. Gradio UI sau khi user gửi câu hỏi qua browser — câu trả lời render real-time (chụp bằng Playwright trong lúc test)" title="" id="69" name="Picture"/>
-            <a:graphic>
-              <a:graphicData uri="http://schemas.openxmlformats.org/drawingml/2006/picture">
-                <pic:pic>
-                  <pic:nvPicPr>
-                    <pic:cNvPr descr="screenshots/gradio_ui_chat_real.png" id="70" name="Picture"/>
-                    <pic:cNvPicPr>
-                      <a:picLocks noChangeArrowheads="1" noChangeAspect="1"/>
-                    </pic:cNvPicPr>
-                  </pic:nvPicPr>
-                  <pic:blipFill>
-                    <a:blip r:embed="rId68"/>
-                    <a:stretch>
-                      <a:fillRect/>
-                    </a:stretch>
-                  </pic:blipFill>
-                  <pic:spPr bwMode="auto">
-                    <a:xfrm>
-                      <a:off x="0" y="0"/>
-                      <a:ext cx="5334000" cy="3378200"/>
-                    </a:xfrm>
-                    <a:prstGeom prst="rect">
-                      <a:avLst/>
-                    </a:prstGeom>
-                    <a:noFill/>
-                    <a:ln w="9525">
-                      <a:noFill/>
-                      <a:headEnd/>
-                      <a:tailEnd/>
-                    </a:ln>
-                  </pic:spPr>
-                </pic:pic>
-              </a:graphicData>
-            </a:graphic>
-          </wp:inline>
-        </w:drawing>
-      </w:r>
-    </w:p>
-    <w:p>
-      <w:pPr>
-        <w:pStyle w:val="BodyText"/>
-      </w:pPr>
-      <w:r>
-        <w:rPr>
-          <w:i/>
-          <w:iCs/>
-        </w:rPr>
-        <w:t xml:space="preserve">Hình 13. Gradio UI sau khi user gửi câu hỏi qua browser — câu trả lời render real-time (chụp bằng Playwright trong lúc test)</w:t>
-      </w:r>
-    </w:p>
-    <w:p>
-      <w:pPr>
-        <w:pStyle w:val="BodyText"/>
       </w:pPr>
       <w:r>
         <w:rPr>
@@ -8708,7 +8649,7 @@
       <w:r>
         <w:t xml:space="preserve">(</w:t>
       </w:r>
-      <w:hyperlink r:id="rId71">
+      <w:hyperlink r:id="rId68">
         <w:r>
           <w:rPr>
             <w:rStyle w:val="Hyperlink"/>
@@ -8752,7 +8693,7 @@
         <w:t xml:space="preserve">(đúng câu hỏi không).</w:t>
       </w:r>
     </w:p>
-    <w:bookmarkStart w:id="72" w:name="bộ-câu-hỏi-mẫu-trên-workshop-dataset"/>
+    <w:bookmarkStart w:id="69" w:name="bộ-câu-hỏi-mẫu-trên-workshop-dataset"/>
     <w:p>
       <w:pPr>
         <w:pStyle w:val="Heading3"/>
@@ -9421,9 +9362,9 @@
         </w:pict>
       </w:r>
     </w:p>
-    <w:bookmarkEnd w:id="72"/>
-    <w:bookmarkEnd w:id="73"/>
-    <w:bookmarkStart w:id="82" w:name="X9fb2b2f252eb3dd33fd4c5868a7e0e01500d130"/>
+    <w:bookmarkEnd w:id="69"/>
+    <w:bookmarkEnd w:id="70"/>
+    <w:bookmarkStart w:id="79" w:name="X9fb2b2f252eb3dd33fd4c5868a7e0e01500d130"/>
     <w:p>
       <w:pPr>
         <w:pStyle w:val="Heading2"/>
@@ -9441,18 +9382,18 @@
           <wp:inline>
             <wp:extent cx="5334000" cy="498504"/>
             <wp:effectExtent b="0" l="0" r="0" t="0"/>
-            <wp:docPr descr="Hình 8. 4 rủi ro RAG + 4 rủi ro Agent — chiến lược defend khác nhau" title="" id="75" name="Picture"/>
+            <wp:docPr descr="Hình 8. 4 rủi ro RAG + 4 rủi ro Agent — chiến lược defend khác nhau" title="" id="72" name="Picture"/>
             <a:graphic>
               <a:graphicData uri="http://schemas.openxmlformats.org/drawingml/2006/picture">
                 <pic:pic>
                   <pic:nvPicPr>
-                    <pic:cNvPr descr="diagrams/08_security_risks.png" id="76" name="Picture"/>
+                    <pic:cNvPr descr="diagrams/08_security_risks.png" id="73" name="Picture"/>
                     <pic:cNvPicPr>
                       <a:picLocks noChangeArrowheads="1" noChangeAspect="1"/>
                     </pic:cNvPicPr>
                   </pic:nvPicPr>
                   <pic:blipFill>
-                    <a:blip r:embed="rId74"/>
+                    <a:blip r:embed="rId71"/>
                     <a:stretch>
                       <a:fillRect/>
                     </a:stretch>
@@ -9491,7 +9432,7 @@
         <w:t xml:space="preserve">Hình 8. 4 rủi ro RAG + 4 rủi ro Agent — chiến lược defend khác nhau</w:t>
       </w:r>
     </w:p>
-    <w:bookmarkStart w:id="77" w:name="X6a43e8eece8bba6232a625d150573114b2f16dc"/>
+    <w:bookmarkStart w:id="74" w:name="X6a43e8eece8bba6232a625d150573114b2f16dc"/>
     <w:p>
       <w:pPr>
         <w:pStyle w:val="Heading3"/>
@@ -9778,8 +9719,8 @@
         <w:t xml:space="preserve">Build lại, hỏi câu thường, xem có bị lừa không.</w:t>
       </w:r>
     </w:p>
-    <w:bookmarkEnd w:id="77"/>
-    <w:bookmarkStart w:id="80" w:name="X3f4287fe2a861d2f61670654fbe2ebfe30e499b"/>
+    <w:bookmarkEnd w:id="74"/>
+    <w:bookmarkStart w:id="77" w:name="X3f4287fe2a861d2f61670654fbe2ebfe30e499b"/>
     <w:p>
       <w:pPr>
         <w:pStyle w:val="Heading3"/>
@@ -9852,7 +9793,7 @@
       <w:r>
         <w:t xml:space="preserve"> </w:t>
       </w:r>
-      <w:hyperlink r:id="rId78">
+      <w:hyperlink r:id="rId75">
         <w:r>
           <w:rPr>
             <w:rStyle w:val="Hyperlink"/>
@@ -9915,7 +9856,7 @@
       <w:r>
         <w:t xml:space="preserve"> </w:t>
       </w:r>
-      <w:hyperlink r:id="rId79">
+      <w:hyperlink r:id="rId76">
         <w:r>
           <w:rPr>
             <w:rStyle w:val="Hyperlink"/>
@@ -10292,8 +10233,8 @@
         <w:t xml:space="preserve">: vector DB chỉ access từ application layer, không expose</w:t>
       </w:r>
     </w:p>
-    <w:bookmarkEnd w:id="80"/>
-    <w:bookmarkStart w:id="81" w:name="X61d51441f34a6508211fdbf461659dc83102c2a"/>
+    <w:bookmarkEnd w:id="77"/>
+    <w:bookmarkStart w:id="78" w:name="X61d51441f34a6508211fdbf461659dc83102c2a"/>
     <w:p>
       <w:pPr>
         <w:pStyle w:val="Heading3"/>
@@ -10567,10 +10508,10 @@
         </w:pict>
       </w:r>
     </w:p>
-    <w:bookmarkEnd w:id="81"/>
-    <w:bookmarkEnd w:id="82"/>
-    <w:bookmarkEnd w:id="83"/>
-    <w:bookmarkStart w:id="107" w:name="phần-3--agent"/>
+    <w:bookmarkEnd w:id="78"/>
+    <w:bookmarkEnd w:id="79"/>
+    <w:bookmarkEnd w:id="80"/>
+    <w:bookmarkStart w:id="104" w:name="phần-3--agent"/>
     <w:p>
       <w:pPr>
         <w:pStyle w:val="Heading1"/>
@@ -10673,7 +10614,7 @@
         <w:t xml:space="preserve">→ thấy "mưa" → trả lời "nên mang ô".</w:t>
       </w:r>
     </w:p>
-    <w:bookmarkStart w:id="89" w:name="X8b7832a5e45adcdf46a603744966a234e7eb00d"/>
+    <w:bookmarkStart w:id="86" w:name="X8b7832a5e45adcdf46a603744966a234e7eb00d"/>
     <w:p>
       <w:pPr>
         <w:pStyle w:val="Heading2"/>
@@ -10715,7 +10656,7 @@
       <w:r>
         <w:t xml:space="preserve"> </w:t>
       </w:r>
-      <w:hyperlink r:id="rId84">
+      <w:hyperlink r:id="rId81">
         <w:r>
           <w:rPr>
             <w:rStyle w:val="Hyperlink"/>
@@ -10820,7 +10761,7 @@
         <w:t xml:space="preserve">: mỗi bước là 1 LLM call → chậm nếu nhiều bước. Đây là pattern workshop dùng.</w:t>
       </w:r>
     </w:p>
-    <w:bookmarkStart w:id="88" w:name="các-pattern-khác-đọc-khi-cần"/>
+    <w:bookmarkStart w:id="85" w:name="các-pattern-khác-đọc-khi-cần"/>
     <w:p>
       <w:pPr>
         <w:pStyle w:val="Heading3"/>
@@ -10888,7 +10829,7 @@
       <w:r>
         <w:t xml:space="preserve"> </w:t>
       </w:r>
-      <w:hyperlink r:id="rId85">
+      <w:hyperlink r:id="rId82">
         <w:r>
           <w:rPr>
             <w:rStyle w:val="Hyperlink"/>
@@ -10902,7 +10843,7 @@
       <w:r>
         <w:t xml:space="preserve"> </w:t>
       </w:r>
-      <w:hyperlink r:id="rId86">
+      <w:hyperlink r:id="rId83">
         <w:r>
           <w:rPr>
             <w:rStyle w:val="Hyperlink"/>
@@ -10916,7 +10857,7 @@
       <w:r>
         <w:t xml:space="preserve"> </w:t>
       </w:r>
-      <w:hyperlink r:id="rId87">
+      <w:hyperlink r:id="rId84">
         <w:r>
           <w:rPr>
             <w:rStyle w:val="Hyperlink"/>
@@ -10969,9 +10910,9 @@
         </w:pict>
       </w:r>
     </w:p>
-    <w:bookmarkEnd w:id="88"/>
-    <w:bookmarkEnd w:id="89"/>
-    <w:bookmarkStart w:id="95" w:name="X17a3205b0b44aa435531b02cac684e0493030e8"/>
+    <w:bookmarkEnd w:id="85"/>
+    <w:bookmarkEnd w:id="86"/>
+    <w:bookmarkStart w:id="92" w:name="X17a3205b0b44aa435531b02cac684e0493030e8"/>
     <w:p>
       <w:pPr>
         <w:pStyle w:val="Heading2"/>
@@ -11043,7 +10984,7 @@
         <w:t xml:space="preserve">và đưa kết quả lại cho LLM.</w:t>
       </w:r>
     </w:p>
-    <w:bookmarkStart w:id="90" w:name="format-json-schema"/>
+    <w:bookmarkStart w:id="87" w:name="format-json-schema"/>
     <w:p>
       <w:pPr>
         <w:pStyle w:val="Heading3"/>
@@ -11466,8 +11407,8 @@
         <w:t xml:space="preserve">Pydantic AI tự sinh schema này từ type hints + docstring — đó là lý do docstring quan trọng.</w:t>
       </w:r>
     </w:p>
-    <w:bookmarkEnd w:id="90"/>
-    <w:bookmarkStart w:id="91" w:name="llm-sinh-tool-call"/>
+    <w:bookmarkEnd w:id="87"/>
+    <w:bookmarkStart w:id="88" w:name="llm-sinh-tool-call"/>
     <w:p>
       <w:pPr>
         <w:pStyle w:val="Heading3"/>
@@ -11558,8 +11499,8 @@
         <w:t xml:space="preserve">LLM tiếp tục sinh response (có thể gọi tool khác hoặc trả lời cuối).</w:t>
       </w:r>
     </w:p>
-    <w:bookmarkEnd w:id="91"/>
-    <w:bookmarkStart w:id="92" w:name="X8cd1571356d34a1540462600b1ebacac5d40c95"/>
+    <w:bookmarkEnd w:id="88"/>
+    <w:bookmarkStart w:id="89" w:name="X8cd1571356d34a1540462600b1ebacac5d40c95"/>
     <w:p>
       <w:pPr>
         <w:pStyle w:val="Heading3"/>
@@ -11695,8 +11636,8 @@
         <w:t xml:space="preserve">trở lên.</w:t>
       </w:r>
     </w:p>
-    <w:bookmarkEnd w:id="92"/>
-    <w:bookmarkStart w:id="93" w:name="kết-quả-agent-trên-workshop-dataset"/>
+    <w:bookmarkEnd w:id="89"/>
+    <w:bookmarkStart w:id="90" w:name="kết-quả-agent-trên-workshop-dataset"/>
     <w:p>
       <w:pPr>
         <w:pStyle w:val="Heading3"/>
@@ -12178,8 +12119,8 @@
         <w:t xml:space="preserve">: demo single-tool với 1.7b (chắc chắn work, nhanh). Multi-tool để học viên thử ở nhà với 4B trở lên.</w:t>
       </w:r>
     </w:p>
-    <w:bookmarkEnd w:id="93"/>
-    <w:bookmarkStart w:id="94" w:name="test-tool-calling-capability"/>
+    <w:bookmarkEnd w:id="90"/>
+    <w:bookmarkStart w:id="91" w:name="test-tool-calling-capability"/>
     <w:p>
       <w:pPr>
         <w:pStyle w:val="Heading3"/>
@@ -12694,9 +12635,9 @@
         </w:pict>
       </w:r>
     </w:p>
-    <w:bookmarkEnd w:id="94"/>
-    <w:bookmarkEnd w:id="95"/>
-    <w:bookmarkStart w:id="96" w:name="Xfd93ffb0ed539df602d2b54b97637c58d7a30df"/>
+    <w:bookmarkEnd w:id="91"/>
+    <w:bookmarkEnd w:id="92"/>
+    <w:bookmarkStart w:id="93" w:name="Xfd93ffb0ed539df602d2b54b97637c58d7a30df"/>
     <w:p>
       <w:pPr>
         <w:pStyle w:val="Heading2"/>
@@ -12792,8 +12733,8 @@
         </w:pict>
       </w:r>
     </w:p>
-    <w:bookmarkEnd w:id="96"/>
-    <w:bookmarkStart w:id="102" w:name="X3ab8509f6bc879f2c9dff26ad9bb91c565fd0bc"/>
+    <w:bookmarkEnd w:id="93"/>
+    <w:bookmarkStart w:id="99" w:name="X3ab8509f6bc879f2c9dff26ad9bb91c565fd0bc"/>
     <w:p>
       <w:pPr>
         <w:pStyle w:val="Heading2"/>
@@ -12811,18 +12752,18 @@
           <wp:inline>
             <wp:extent cx="5334000" cy="3658362"/>
             <wp:effectExtent b="0" l="0" r="0" t="0"/>
-            <wp:docPr descr="Hình 6. Kiến trúc MCP: tách tool thành server độc lập, mọi AI client đều dùng được" title="" id="98" name="Picture"/>
+            <wp:docPr descr="Hình 6. Kiến trúc MCP: tách tool thành server độc lập, mọi AI client đều dùng được" title="" id="95" name="Picture"/>
             <a:graphic>
               <a:graphicData uri="http://schemas.openxmlformats.org/drawingml/2006/picture">
                 <pic:pic>
                   <pic:nvPicPr>
-                    <pic:cNvPr descr="diagrams/06_mcp_architecture.png" id="99" name="Picture"/>
+                    <pic:cNvPr descr="diagrams/06_mcp_architecture.png" id="96" name="Picture"/>
                     <pic:cNvPicPr>
                       <a:picLocks noChangeArrowheads="1" noChangeAspect="1"/>
                     </pic:cNvPicPr>
                   </pic:nvPicPr>
                   <pic:blipFill>
-                    <a:blip r:embed="rId97"/>
+                    <a:blip r:embed="rId94"/>
                     <a:stretch>
                       <a:fillRect/>
                     </a:stretch>
@@ -12936,7 +12877,7 @@
       <w:r>
         <w:t xml:space="preserve"> </w:t>
       </w:r>
-      <w:hyperlink r:id="rId100">
+      <w:hyperlink r:id="rId97">
         <w:r>
           <w:rPr>
             <w:rStyle w:val="Hyperlink"/>
@@ -12953,7 +12894,7 @@
       <w:r>
         <w:t xml:space="preserve"> </w:t>
       </w:r>
-      <w:hyperlink r:id="rId101">
+      <w:hyperlink r:id="rId98">
         <w:r>
           <w:rPr>
             <w:rStyle w:val="Hyperlink"/>
@@ -12972,8 +12913,8 @@
         </w:pict>
       </w:r>
     </w:p>
-    <w:bookmarkEnd w:id="102"/>
-    <w:bookmarkStart w:id="106" w:name="X3317d52af087e3dbc9327edb58f577b3144710c"/>
+    <w:bookmarkEnd w:id="99"/>
+    <w:bookmarkStart w:id="103" w:name="X3317d52af087e3dbc9327edb58f577b3144710c"/>
     <w:p>
       <w:pPr>
         <w:pStyle w:val="Heading2"/>
@@ -12982,7 +12923,7 @@
         <w:t xml:space="preserve">3.5 Bảo mật Agent in-depth</w:t>
       </w:r>
     </w:p>
-    <w:bookmarkStart w:id="103" w:name="Xd5fc0d696056f8f9d2bbfb3b979cd82e5f04e38"/>
+    <w:bookmarkStart w:id="100" w:name="Xd5fc0d696056f8f9d2bbfb3b979cd82e5f04e38"/>
     <w:p>
       <w:pPr>
         <w:pStyle w:val="Heading3"/>
@@ -13321,8 +13262,8 @@
         <w:t xml:space="preserve">: tránh DoS qua file lớn</w:t>
       </w:r>
     </w:p>
-    <w:bookmarkEnd w:id="103"/>
-    <w:bookmarkStart w:id="104" w:name="Xfdda51687dc0109efad929db907650b689a9bf6"/>
+    <w:bookmarkEnd w:id="100"/>
+    <w:bookmarkStart w:id="101" w:name="Xfdda51687dc0109efad929db907650b689a9bf6"/>
     <w:p>
       <w:pPr>
         <w:pStyle w:val="Heading3"/>
@@ -13517,8 +13458,8 @@
         <w:t xml:space="preserve">+ rate limit), data exfiltration (lừa agent gửi data ra ngoài → không cấp tool egress + allowlist domain), privilege escalation (chuỗi tool đọc→ghi → audit log + scope rõ từng tool). Lưu ý khi agent của bạn có tool ghi/gửi/gọi API trả phí.</w:t>
       </w:r>
     </w:p>
-    <w:bookmarkEnd w:id="104"/>
-    <w:bookmarkStart w:id="105" w:name="Xdba5a6f69ba3855faacee16adeff2a7d476c840"/>
+    <w:bookmarkEnd w:id="101"/>
+    <w:bookmarkStart w:id="102" w:name="Xdba5a6f69ba3855faacee16adeff2a7d476c840"/>
     <w:p>
       <w:pPr>
         <w:pStyle w:val="Heading3"/>
@@ -13614,10 +13555,10 @@
         </w:pict>
       </w:r>
     </w:p>
-    <w:bookmarkEnd w:id="105"/>
-    <w:bookmarkEnd w:id="106"/>
-    <w:bookmarkEnd w:id="107"/>
-    <w:bookmarkStart w:id="108" w:name="Xb24c982a11f247ffac2866abbc85f081d7ebf56"/>
+    <w:bookmarkEnd w:id="102"/>
+    <w:bookmarkEnd w:id="103"/>
+    <w:bookmarkEnd w:id="104"/>
+    <w:bookmarkStart w:id="105" w:name="Xb24c982a11f247ffac2866abbc85f081d7ebf56"/>
     <w:p>
       <w:pPr>
         <w:pStyle w:val="Heading1"/>
@@ -13850,8 +13791,8 @@
         <w:t xml:space="preserve">Chi tiết kiến trúc nhiều tầng, monitoring (Langfuse, Prometheus), và tuân thủ pháp lý (NĐ 13/2023, DPIA) là việc của đội platform/pháp chế khi đã có hệ thống thật — không cần cho buổi học. Có tài liệu riêng khi bạn tới giai đoạn đó.</w:t>
       </w:r>
     </w:p>
-    <w:bookmarkEnd w:id="108"/>
-    <w:bookmarkStart w:id="112" w:name="phần-5--khi-nào-local-vs-cloud"/>
+    <w:bookmarkEnd w:id="105"/>
+    <w:bookmarkStart w:id="109" w:name="phần-5--khi-nào-local-vs-cloud"/>
     <w:p>
       <w:pPr>
         <w:pStyle w:val="Heading1"/>
@@ -13860,7 +13801,7 @@
         <w:t xml:space="preserve">Phần 5 — Khi nào local vs cloud</w:t>
       </w:r>
     </w:p>
-    <w:bookmarkStart w:id="109" w:name="X2b8bd35f59938b812135eb0808cd1ccb6618d6d"/>
+    <w:bookmarkStart w:id="106" w:name="X2b8bd35f59938b812135eb0808cd1ccb6618d6d"/>
     <w:p>
       <w:pPr>
         <w:pStyle w:val="Heading2"/>
@@ -14333,8 +14274,8 @@
         </w:tc>
       </w:tr>
     </w:tbl>
-    <w:bookmarkEnd w:id="109"/>
-    <w:bookmarkStart w:id="110" w:name="X5bdd8327d6c0b4c224c2048dbd79047d056442d"/>
+    <w:bookmarkEnd w:id="106"/>
+    <w:bookmarkStart w:id="107" w:name="X5bdd8327d6c0b4c224c2048dbd79047d056442d"/>
     <w:p>
       <w:pPr>
         <w:pStyle w:val="Heading2"/>
@@ -14488,8 +14429,8 @@
         <w:t xml:space="preserve">└─────────────────────┘</w:t>
       </w:r>
     </w:p>
-    <w:bookmarkEnd w:id="110"/>
-    <w:bookmarkStart w:id="111" w:name="X7fcd31e86681cfa83b91ab4337e2591fa835884"/>
+    <w:bookmarkEnd w:id="107"/>
+    <w:bookmarkStart w:id="108" w:name="X7fcd31e86681cfa83b91ab4337e2591fa835884"/>
     <w:p>
       <w:pPr>
         <w:pStyle w:val="Heading2"/>
@@ -14719,9 +14660,9 @@
         </w:pict>
       </w:r>
     </w:p>
-    <w:bookmarkEnd w:id="111"/>
-    <w:bookmarkEnd w:id="112"/>
-    <w:bookmarkStart w:id="116" w:name="phần-6--fine-tune-vs-rag"/>
+    <w:bookmarkEnd w:id="108"/>
+    <w:bookmarkEnd w:id="109"/>
+    <w:bookmarkStart w:id="113" w:name="phần-6--fine-tune-vs-rag"/>
     <w:p>
       <w:pPr>
         <w:pStyle w:val="Heading1"/>
@@ -14730,7 +14671,7 @@
         <w:t xml:space="preserve">Phần 6 — Fine-tune vs RAG</w:t>
       </w:r>
     </w:p>
-    <w:bookmarkStart w:id="113" w:name="X04bc35027288453756840cab312d1d1cdbd2d45"/>
+    <w:bookmarkStart w:id="110" w:name="X04bc35027288453756840cab312d1d1cdbd2d45"/>
     <w:p>
       <w:pPr>
         <w:pStyle w:val="Heading2"/>
@@ -15069,8 +15010,8 @@
         </w:tc>
       </w:tr>
     </w:tbl>
-    <w:bookmarkEnd w:id="113"/>
-    <w:bookmarkStart w:id="115" w:name="X7f89cc6839c1898531ca2542c8d5714f9dfb802"/>
+    <w:bookmarkEnd w:id="110"/>
+    <w:bookmarkStart w:id="112" w:name="X7f89cc6839c1898531ca2542c8d5714f9dfb802"/>
     <w:p>
       <w:pPr>
         <w:pStyle w:val="Heading2"/>
@@ -15152,7 +15093,7 @@
       <w:r>
         <w:t xml:space="preserve"> </w:t>
       </w:r>
-      <w:hyperlink r:id="rId114">
+      <w:hyperlink r:id="rId111">
         <w:r>
           <w:rPr>
             <w:rStyle w:val="Hyperlink"/>
@@ -15176,9 +15117,9 @@
         </w:pict>
       </w:r>
     </w:p>
-    <w:bookmarkEnd w:id="115"/>
-    <w:bookmarkEnd w:id="116"/>
-    <w:bookmarkStart w:id="129" w:name="phần-7--troubleshooting"/>
+    <w:bookmarkEnd w:id="112"/>
+    <w:bookmarkEnd w:id="113"/>
+    <w:bookmarkStart w:id="126" w:name="phần-7--troubleshooting"/>
     <w:p>
       <w:pPr>
         <w:pStyle w:val="Heading1"/>
@@ -15187,7 +15128,7 @@
         <w:t xml:space="preserve">Phần 7 — Troubleshooting</w:t>
       </w:r>
     </w:p>
-    <w:bookmarkStart w:id="117" w:name="X77bafb93cb417acee92f99211915ab63f9ced2e"/>
+    <w:bookmarkStart w:id="114" w:name="X77bafb93cb417acee92f99211915ab63f9ced2e"/>
     <w:p>
       <w:pPr>
         <w:pStyle w:val="Heading2"/>
@@ -15383,8 +15324,8 @@
         <w:t xml:space="preserve">Fix: hỏi cụ thể hơn. "Kiểm tra IP X" rõ hơn "X có an toàn không"</w:t>
       </w:r>
     </w:p>
-    <w:bookmarkEnd w:id="117"/>
-    <w:bookmarkStart w:id="118" w:name="X42478b3122fb0eb2869a6e1c11882bead823251"/>
+    <w:bookmarkEnd w:id="114"/>
+    <w:bookmarkStart w:id="115" w:name="X42478b3122fb0eb2869a6e1c11882bead823251"/>
     <w:p>
       <w:pPr>
         <w:pStyle w:val="Heading2"/>
@@ -15499,8 +15440,8 @@
         <w:t xml:space="preserve">: nhỏ thường bịa nhiều hơn</w:t>
       </w:r>
     </w:p>
-    <w:bookmarkEnd w:id="118"/>
-    <w:bookmarkStart w:id="119" w:name="Xf2c03e853ebc70e69c6ea432b2e30d3e3a858a1"/>
+    <w:bookmarkEnd w:id="115"/>
+    <w:bookmarkStart w:id="116" w:name="Xf2c03e853ebc70e69c6ea432b2e30d3e3a858a1"/>
     <w:p>
       <w:pPr>
         <w:pStyle w:val="Heading2"/>
@@ -15643,8 +15584,8 @@
         <w:t xml:space="preserve">: thêm bước rerank top-20 → top-5</w:t>
       </w:r>
     </w:p>
-    <w:bookmarkEnd w:id="119"/>
-    <w:bookmarkStart w:id="120" w:name="X5eafd8c2e9ab6fbe733989a549f23e066e30add"/>
+    <w:bookmarkEnd w:id="116"/>
+    <w:bookmarkStart w:id="117" w:name="X5eafd8c2e9ab6fbe733989a549f23e066e30add"/>
     <w:p>
       <w:pPr>
         <w:pStyle w:val="Heading2"/>
@@ -15783,8 +15724,8 @@
         <w:t xml:space="preserve">ollama stop &lt;other_model&gt;</w:t>
       </w:r>
     </w:p>
-    <w:bookmarkEnd w:id="120"/>
-    <w:bookmarkStart w:id="121" w:name="Xae3d93ca3a02e733ab2551257ffdafc12fc1785"/>
+    <w:bookmarkEnd w:id="117"/>
+    <w:bookmarkStart w:id="118" w:name="Xae3d93ca3a02e733ab2551257ffdafc12fc1785"/>
     <w:p>
       <w:pPr>
         <w:pStyle w:val="Heading2"/>
@@ -15914,8 +15855,8 @@
         <w:t xml:space="preserve">: GTX 1660 cũng nhanh hơn CPU 3-5×</w:t>
       </w:r>
     </w:p>
-    <w:bookmarkEnd w:id="121"/>
-    <w:bookmarkStart w:id="122" w:name="Xfe46f18d560f0a7a823a987e4b0cfecf5e6c0d0"/>
+    <w:bookmarkEnd w:id="118"/>
+    <w:bookmarkStart w:id="119" w:name="Xfe46f18d560f0a7a823a987e4b0cfecf5e6c0d0"/>
     <w:p>
       <w:pPr>
         <w:pStyle w:val="Heading2"/>
@@ -16013,14 +15954,14 @@
         <w:t xml:space="preserve">Trên Windows: tránh path có khoảng trắng (đôi khi lỗi)</w:t>
       </w:r>
     </w:p>
-    <w:bookmarkEnd w:id="122"/>
-    <w:bookmarkStart w:id="123" w:name="X45927bb66cfa53a77bc4ac1d52f527cf0af0a38"/>
+    <w:bookmarkEnd w:id="119"/>
+    <w:bookmarkStart w:id="120" w:name="X156cffafc01013499f817d1c9f59e5d8348c1e1"/>
     <w:p>
       <w:pPr>
         <w:pStyle w:val="Heading2"/>
       </w:pPr>
       <w:r>
-        <w:t xml:space="preserve">7.7 Gradio không mở localhost:7860</w:t>
+        <w:t xml:space="preserve">7.7 Open WebUI không mở localhost:3000</w:t>
       </w:r>
     </w:p>
     <w:p>
@@ -16047,16 +15988,7 @@
         </w:numPr>
       </w:pPr>
       <w:r>
-        <w:t xml:space="preserve">Check port có free không:</w:t>
-      </w:r>
-      <w:r>
-        <w:t xml:space="preserve"> </w:t>
-      </w:r>
-      <w:r>
-        <w:rPr>
-          <w:rStyle w:val="VerbatimChar"/>
-        </w:rPr>
-        <w:t xml:space="preserve">netstat -an | grep 7860</w:t>
+        <w:t xml:space="preserve">Docker Desktop đang chạy chưa? Mở app Docker, đợi trạng thái "running".</w:t>
       </w:r>
     </w:p>
     <w:p>
@@ -16068,7 +16000,7 @@
         </w:numPr>
       </w:pPr>
       <w:r>
-        <w:t xml:space="preserve">Đổi port: sửa</w:t>
+        <w:t xml:space="preserve">Container chạy chưa:</w:t>
       </w:r>
       <w:r>
         <w:t xml:space="preserve"> </w:t>
@@ -16077,13 +16009,13 @@
         <w:rPr>
           <w:rStyle w:val="VerbatimChar"/>
         </w:rPr>
-        <w:t xml:space="preserve">server_port=7861</w:t>
-      </w:r>
-      <w:r>
-        <w:t xml:space="preserve"> </w:t>
-      </w:r>
-      <w:r>
-        <w:t xml:space="preserve">trong</w:t>
+        <w:t xml:space="preserve">docker compose up -d</w:t>
+      </w:r>
+      <w:r>
+        <w:t xml:space="preserve"> </w:t>
+      </w:r>
+      <w:r>
+        <w:t xml:space="preserve">rồi</w:t>
       </w:r>
       <w:r>
         <w:t xml:space="preserve"> </w:t>
@@ -16092,7 +16024,25 @@
         <w:rPr>
           <w:rStyle w:val="VerbatimChar"/>
         </w:rPr>
-        <w:t xml:space="preserve">app.py</w:t>
+        <w:t xml:space="preserve">docker ps</w:t>
+      </w:r>
+      <w:r>
+        <w:t xml:space="preserve"> </w:t>
+      </w:r>
+      <w:r>
+        <w:t xml:space="preserve">(phải thấy</w:t>
+      </w:r>
+      <w:r>
+        <w:t xml:space="preserve"> </w:t>
+      </w:r>
+      <w:r>
+        <w:rPr>
+          <w:rStyle w:val="VerbatimChar"/>
+        </w:rPr>
+        <w:t xml:space="preserve">open-webui</w:t>
+      </w:r>
+      <w:r>
+        <w:t xml:space="preserve">).</w:t>
       </w:r>
     </w:p>
     <w:p>
@@ -16104,11 +16054,65 @@
         </w:numPr>
       </w:pPr>
       <w:r>
-        <w:t xml:space="preserve">Trên macOS, firewall có thể chặn — System Settings → Network → Firewall → cho phép Python</w:t>
-      </w:r>
-    </w:p>
-    <w:bookmarkEnd w:id="123"/>
-    <w:bookmarkStart w:id="124" w:name="X2588be92cc2c3658b253313fc278044b03369f1"/>
+        <w:t xml:space="preserve">Cổng 3000 bận: đổi mapping trong</w:t>
+      </w:r>
+      <w:r>
+        <w:t xml:space="preserve"> </w:t>
+      </w:r>
+      <w:r>
+        <w:rPr>
+          <w:rStyle w:val="VerbatimChar"/>
+        </w:rPr>
+        <w:t xml:space="preserve">docker-compose.yml</w:t>
+      </w:r>
+      <w:r>
+        <w:t xml:space="preserve"> </w:t>
+      </w:r>
+      <w:r>
+        <w:t xml:space="preserve">(vd</w:t>
+      </w:r>
+      <w:r>
+        <w:t xml:space="preserve"> </w:t>
+      </w:r>
+      <w:r>
+        <w:rPr>
+          <w:rStyle w:val="VerbatimChar"/>
+        </w:rPr>
+        <w:t xml:space="preserve">"3001:8080"</w:t>
+      </w:r>
+      <w:r>
+        <w:t xml:space="preserve">), mở http://localhost:3001.</w:t>
+      </w:r>
+    </w:p>
+    <w:p>
+      <w:pPr>
+        <w:pStyle w:val="Compact"/>
+        <w:numPr>
+          <w:ilvl w:val="0"/>
+          <w:numId w:val="1041"/>
+        </w:numPr>
+      </w:pPr>
+      <w:r>
+        <w:t xml:space="preserve">Open WebUI không thấy model: nó kết nối Ollama qua</w:t>
+      </w:r>
+      <w:r>
+        <w:t xml:space="preserve"> </w:t>
+      </w:r>
+      <w:r>
+        <w:rPr>
+          <w:rStyle w:val="VerbatimChar"/>
+        </w:rPr>
+        <w:t xml:space="preserve">host.docker.internal:11434</w:t>
+      </w:r>
+      <w:r>
+        <w:t xml:space="preserve"> </w:t>
+      </w:r>
+      <w:r>
+        <w:t xml:space="preserve">— chắc chắn Ollama đang chạy ở host.</w:t>
+      </w:r>
+    </w:p>
+    <w:bookmarkEnd w:id="120"/>
+    <w:bookmarkStart w:id="121" w:name="X2588be92cc2c3658b253313fc278044b03369f1"/>
     <w:p>
       <w:pPr>
         <w:pStyle w:val="Heading2"/>
@@ -16316,14 +16320,14 @@
         <w:t xml:space="preserve">vẫn có khuynh hướng "nghĩ ra mặt giấy" trong content chính. Dùng 1.7b cho output sạch nhất.</w:t>
       </w:r>
     </w:p>
-    <w:bookmarkEnd w:id="124"/>
-    <w:bookmarkStart w:id="125" w:name="Xbbf374636d3b19b4737ec2d42a84f581373e209"/>
+    <w:bookmarkEnd w:id="121"/>
+    <w:bookmarkStart w:id="122" w:name="X9c87e7c6f500a280bf60c4b6b3f464aa31ca3fc"/>
     <w:p>
       <w:pPr>
         <w:pStyle w:val="Heading2"/>
       </w:pPr>
       <w:r>
-        <w:t xml:space="preserve">7.9 Gradio 6.x đổi API gây error</w:t>
+        <w:t xml:space="preserve">7.9 (Tùy chọn) Gradio 6.x đổi API gây error — chỉ khi chạy app.py</w:t>
       </w:r>
     </w:p>
     <w:p>
@@ -16544,8 +16548,8 @@
         <w:t xml:space="preserve">để cover cả Gradio 4.x và 6.x — pip install version nào cũng chạy.</w:t>
       </w:r>
     </w:p>
-    <w:bookmarkEnd w:id="125"/>
-    <w:bookmarkStart w:id="126" w:name="Xf0cbc06f439db82011fcb61359326f39a65e2b5"/>
+    <w:bookmarkEnd w:id="122"/>
+    <w:bookmarkStart w:id="123" w:name="Xf0cbc06f439db82011fcb61359326f39a65e2b5"/>
     <w:p>
       <w:pPr>
         <w:pStyle w:val="Heading2"/>
@@ -16748,8 +16752,8 @@
         <w:t xml:space="preserve"> OpenAIModel</w:t>
       </w:r>
     </w:p>
-    <w:bookmarkEnd w:id="126"/>
-    <w:bookmarkStart w:id="127" w:name="Xc0f08f7442dc217e0ae8f4000cf39018be84d32"/>
+    <w:bookmarkEnd w:id="123"/>
+    <w:bookmarkStart w:id="124" w:name="Xc0f08f7442dc217e0ae8f4000cf39018be84d32"/>
     <w:p>
       <w:pPr>
         <w:pStyle w:val="Heading2"/>
@@ -16876,8 +16880,8 @@
         <w:t xml:space="preserve">trước.</w:t>
       </w:r>
     </w:p>
-    <w:bookmarkEnd w:id="127"/>
-    <w:bookmarkStart w:id="128" w:name="Xd45033f979cbf56fa1d744ce46370a83da6c199"/>
+    <w:bookmarkEnd w:id="124"/>
+    <w:bookmarkStart w:id="125" w:name="Xd45033f979cbf56fa1d744ce46370a83da6c199"/>
     <w:p>
       <w:pPr>
         <w:pStyle w:val="Heading2"/>
@@ -17049,9 +17053,9 @@
         </w:pict>
       </w:r>
     </w:p>
-    <w:bookmarkEnd w:id="128"/>
-    <w:bookmarkEnd w:id="129"/>
-    <w:bookmarkStart w:id="216" w:name="phần-8--tài-liệu-tham-khảo"/>
+    <w:bookmarkEnd w:id="125"/>
+    <w:bookmarkEnd w:id="126"/>
+    <w:bookmarkStart w:id="213" w:name="phần-8--tài-liệu-tham-khảo"/>
     <w:p>
       <w:pPr>
         <w:pStyle w:val="Heading1"/>
@@ -17084,7 +17088,7 @@
         <w:t xml:space="preserve">— tránh blog không rõ nguồn.</w:t>
       </w:r>
     </w:p>
-    <w:bookmarkStart w:id="146" w:name="Xdc19e93d93f88b175bd8a7463ef94be2e7ffc43"/>
+    <w:bookmarkStart w:id="143" w:name="Xdc19e93d93f88b175bd8a7463ef94be2e7ffc43"/>
     <w:p>
       <w:pPr>
         <w:pStyle w:val="Heading2"/>
@@ -17093,7 +17097,7 @@
         <w:t xml:space="preserve">8.1 Nhà cung cấp LLM (model weights &amp; API)</w:t>
       </w:r>
     </w:p>
-    <w:bookmarkStart w:id="138" w:name="open-source-labscompanies"/>
+    <w:bookmarkStart w:id="135" w:name="open-source-labscompanies"/>
     <w:p>
       <w:pPr>
         <w:pStyle w:val="Heading3"/>
@@ -17212,7 +17216,7 @@
             <w:pPr>
               <w:pStyle w:val="Compact"/>
             </w:pPr>
-            <w:hyperlink r:id="rId130">
+            <w:hyperlink r:id="rId127">
               <w:r>
                 <w:rPr>
                   <w:rStyle w:val="Hyperlink"/>
@@ -17272,7 +17276,7 @@
             <w:pPr>
               <w:pStyle w:val="Compact"/>
             </w:pPr>
-            <w:hyperlink r:id="rId131">
+            <w:hyperlink r:id="rId128">
               <w:r>
                 <w:rPr>
                   <w:rStyle w:val="Hyperlink"/>
@@ -17332,7 +17336,7 @@
             <w:pPr>
               <w:pStyle w:val="Compact"/>
             </w:pPr>
-            <w:hyperlink r:id="rId132">
+            <w:hyperlink r:id="rId129">
               <w:r>
                 <w:rPr>
                   <w:rStyle w:val="Hyperlink"/>
@@ -17392,7 +17396,7 @@
             <w:pPr>
               <w:pStyle w:val="Compact"/>
             </w:pPr>
-            <w:hyperlink r:id="rId133">
+            <w:hyperlink r:id="rId130">
               <w:r>
                 <w:rPr>
                   <w:rStyle w:val="Hyperlink"/>
@@ -17452,7 +17456,7 @@
             <w:pPr>
               <w:pStyle w:val="Compact"/>
             </w:pPr>
-            <w:hyperlink r:id="rId134">
+            <w:hyperlink r:id="rId131">
               <w:r>
                 <w:rPr>
                   <w:rStyle w:val="Hyperlink"/>
@@ -17496,7 +17500,7 @@
             <w:pPr>
               <w:pStyle w:val="Compact"/>
             </w:pPr>
-            <w:hyperlink r:id="rId135">
+            <w:hyperlink r:id="rId132">
               <w:r>
                 <w:rPr>
                   <w:rStyle w:val="Hyperlink"/>
@@ -17512,7 +17516,7 @@
             <w:pPr>
               <w:pStyle w:val="Compact"/>
             </w:pPr>
-            <w:hyperlink r:id="rId136">
+            <w:hyperlink r:id="rId133">
               <w:r>
                 <w:rPr>
                   <w:rStyle w:val="Hyperlink"/>
@@ -17556,7 +17560,7 @@
             <w:pPr>
               <w:pStyle w:val="Compact"/>
             </w:pPr>
-            <w:hyperlink r:id="rId137">
+            <w:hyperlink r:id="rId134">
               <w:r>
                 <w:rPr>
                   <w:rStyle w:val="Hyperlink"/>
@@ -17584,8 +17588,8 @@
         </w:tc>
       </w:tr>
     </w:tbl>
-    <w:bookmarkEnd w:id="138"/>
-    <w:bookmarkStart w:id="145" w:name="closed-source-cloud-api"/>
+    <w:bookmarkEnd w:id="135"/>
+    <w:bookmarkStart w:id="142" w:name="closed-source-cloud-api"/>
     <w:p>
       <w:pPr>
         <w:pStyle w:val="Heading3"/>
@@ -17668,7 +17672,7 @@
             <w:pPr>
               <w:pStyle w:val="Compact"/>
             </w:pPr>
-            <w:hyperlink r:id="rId139">
+            <w:hyperlink r:id="rId136">
               <w:r>
                 <w:rPr>
                   <w:rStyle w:val="Hyperlink"/>
@@ -17684,7 +17688,7 @@
             <w:pPr>
               <w:pStyle w:val="Compact"/>
             </w:pPr>
-            <w:hyperlink r:id="rId140">
+            <w:hyperlink r:id="rId137">
               <w:r>
                 <w:rPr>
                   <w:rStyle w:val="Hyperlink"/>
@@ -17723,7 +17727,7 @@
             <w:pPr>
               <w:pStyle w:val="Compact"/>
             </w:pPr>
-            <w:hyperlink r:id="rId141">
+            <w:hyperlink r:id="rId138">
               <w:r>
                 <w:rPr>
                   <w:rStyle w:val="Hyperlink"/>
@@ -17739,7 +17743,7 @@
             <w:pPr>
               <w:pStyle w:val="Compact"/>
             </w:pPr>
-            <w:hyperlink r:id="rId142">
+            <w:hyperlink r:id="rId139">
               <w:r>
                 <w:rPr>
                   <w:rStyle w:val="Hyperlink"/>
@@ -17778,7 +17782,7 @@
             <w:pPr>
               <w:pStyle w:val="Compact"/>
             </w:pPr>
-            <w:hyperlink r:id="rId143">
+            <w:hyperlink r:id="rId140">
               <w:r>
                 <w:rPr>
                   <w:rStyle w:val="Hyperlink"/>
@@ -17794,7 +17798,7 @@
             <w:pPr>
               <w:pStyle w:val="Compact"/>
             </w:pPr>
-            <w:hyperlink r:id="rId144">
+            <w:hyperlink r:id="rId141">
               <w:r>
                 <w:rPr>
                   <w:rStyle w:val="Hyperlink"/>
@@ -17806,9 +17810,9 @@
         </w:tc>
       </w:tr>
     </w:tbl>
-    <w:bookmarkEnd w:id="145"/>
-    <w:bookmarkEnd w:id="146"/>
-    <w:bookmarkStart w:id="155" w:name="X44dd7843cc26c0770341de4b662aa0c31e97c66"/>
+    <w:bookmarkEnd w:id="142"/>
+    <w:bookmarkEnd w:id="143"/>
+    <w:bookmarkStart w:id="152" w:name="X44dd7843cc26c0770341de4b662aa0c31e97c66"/>
     <w:p>
       <w:pPr>
         <w:pStyle w:val="Heading2"/>
@@ -17885,7 +17889,7 @@
             <w:pPr>
               <w:pStyle w:val="Compact"/>
             </w:pPr>
-            <w:hyperlink r:id="rId147">
+            <w:hyperlink r:id="rId144">
               <w:r>
                 <w:rPr>
                   <w:rStyle w:val="Hyperlink"/>
@@ -17901,7 +17905,7 @@
             <w:pPr>
               <w:pStyle w:val="Compact"/>
             </w:pPr>
-            <w:hyperlink r:id="rId148">
+            <w:hyperlink r:id="rId145">
               <w:r>
                 <w:rPr>
                   <w:rStyle w:val="Hyperlink"/>
@@ -17934,7 +17938,7 @@
             <w:pPr>
               <w:pStyle w:val="Compact"/>
             </w:pPr>
-            <w:hyperlink r:id="rId149">
+            <w:hyperlink r:id="rId146">
               <w:r>
                 <w:rPr>
                   <w:rStyle w:val="Hyperlink"/>
@@ -18022,7 +18026,7 @@
             <w:pPr>
               <w:pStyle w:val="Compact"/>
             </w:pPr>
-            <w:hyperlink r:id="rId150">
+            <w:hyperlink r:id="rId147">
               <w:r>
                 <w:rPr>
                   <w:rStyle w:val="Hyperlink"/>
@@ -18038,7 +18042,7 @@
             <w:pPr>
               <w:pStyle w:val="Compact"/>
             </w:pPr>
-            <w:hyperlink r:id="rId151">
+            <w:hyperlink r:id="rId148">
               <w:r>
                 <w:rPr>
                   <w:rStyle w:val="Hyperlink"/>
@@ -18077,7 +18081,7 @@
             <w:pPr>
               <w:pStyle w:val="Compact"/>
             </w:pPr>
-            <w:hyperlink r:id="rId152">
+            <w:hyperlink r:id="rId149">
               <w:r>
                 <w:rPr>
                   <w:rStyle w:val="Hyperlink"/>
@@ -18093,7 +18097,7 @@
             <w:pPr>
               <w:pStyle w:val="Compact"/>
             </w:pPr>
-            <w:hyperlink r:id="rId153">
+            <w:hyperlink r:id="rId150">
               <w:r>
                 <w:rPr>
                   <w:rStyle w:val="Hyperlink"/>
@@ -18143,7 +18147,7 @@
             <w:pPr>
               <w:pStyle w:val="Compact"/>
             </w:pPr>
-            <w:hyperlink r:id="rId154">
+            <w:hyperlink r:id="rId151">
               <w:r>
                 <w:rPr>
                   <w:rStyle w:val="Hyperlink"/>
@@ -18155,8 +18159,8 @@
         </w:tc>
       </w:tr>
     </w:tbl>
-    <w:bookmarkEnd w:id="155"/>
-    <w:bookmarkStart w:id="166" w:name="X0a8c9d7ca5fd6c058ef6f18b7aa9c75b330cc40"/>
+    <w:bookmarkEnd w:id="152"/>
+    <w:bookmarkStart w:id="163" w:name="X0a8c9d7ca5fd6c058ef6f18b7aa9c75b330cc40"/>
     <w:p>
       <w:pPr>
         <w:pStyle w:val="Heading2"/>
@@ -18233,7 +18237,7 @@
             <w:pPr>
               <w:pStyle w:val="Compact"/>
             </w:pPr>
-            <w:hyperlink r:id="rId156">
+            <w:hyperlink r:id="rId153">
               <w:r>
                 <w:rPr>
                   <w:rStyle w:val="Hyperlink"/>
@@ -18249,7 +18253,7 @@
             <w:pPr>
               <w:pStyle w:val="Compact"/>
             </w:pPr>
-            <w:hyperlink r:id="rId157">
+            <w:hyperlink r:id="rId154">
               <w:r>
                 <w:rPr>
                   <w:rStyle w:val="Hyperlink"/>
@@ -18282,7 +18286,7 @@
             <w:pPr>
               <w:pStyle w:val="Compact"/>
             </w:pPr>
-            <w:hyperlink r:id="rId158">
+            <w:hyperlink r:id="rId155">
               <w:r>
                 <w:rPr>
                   <w:rStyle w:val="Hyperlink"/>
@@ -18298,7 +18302,7 @@
             <w:pPr>
               <w:pStyle w:val="Compact"/>
             </w:pPr>
-            <w:hyperlink r:id="rId159">
+            <w:hyperlink r:id="rId156">
               <w:r>
                 <w:rPr>
                   <w:rStyle w:val="Hyperlink"/>
@@ -18331,7 +18335,7 @@
             <w:pPr>
               <w:pStyle w:val="Compact"/>
             </w:pPr>
-            <w:hyperlink r:id="rId160">
+            <w:hyperlink r:id="rId157">
               <w:r>
                 <w:rPr>
                   <w:rStyle w:val="Hyperlink"/>
@@ -18347,7 +18351,7 @@
             <w:pPr>
               <w:pStyle w:val="Compact"/>
             </w:pPr>
-            <w:hyperlink r:id="rId161">
+            <w:hyperlink r:id="rId158">
               <w:r>
                 <w:rPr>
                   <w:rStyle w:val="Hyperlink"/>
@@ -18380,7 +18384,7 @@
             <w:pPr>
               <w:pStyle w:val="Compact"/>
             </w:pPr>
-            <w:hyperlink r:id="rId162">
+            <w:hyperlink r:id="rId159">
               <w:r>
                 <w:rPr>
                   <w:rStyle w:val="Hyperlink"/>
@@ -18396,7 +18400,7 @@
             <w:pPr>
               <w:pStyle w:val="Compact"/>
             </w:pPr>
-            <w:hyperlink r:id="rId163">
+            <w:hyperlink r:id="rId160">
               <w:r>
                 <w:rPr>
                   <w:rStyle w:val="Hyperlink"/>
@@ -18440,7 +18444,7 @@
             <w:pPr>
               <w:pStyle w:val="Compact"/>
             </w:pPr>
-            <w:hyperlink r:id="rId164">
+            <w:hyperlink r:id="rId161">
               <w:r>
                 <w:rPr>
                   <w:rStyle w:val="Hyperlink"/>
@@ -18490,7 +18494,7 @@
             <w:pPr>
               <w:pStyle w:val="Compact"/>
             </w:pPr>
-            <w:hyperlink r:id="rId165">
+            <w:hyperlink r:id="rId162">
               <w:r>
                 <w:rPr>
                   <w:rStyle w:val="Hyperlink"/>
@@ -18502,8 +18506,8 @@
         </w:tc>
       </w:tr>
     </w:tbl>
-    <w:bookmarkEnd w:id="166"/>
-    <w:bookmarkStart w:id="175" w:name="X6cef33d2193996fdd3fdc1e750d4fc06a296677"/>
+    <w:bookmarkEnd w:id="163"/>
+    <w:bookmarkStart w:id="172" w:name="X6cef33d2193996fdd3fdc1e750d4fc06a296677"/>
     <w:p>
       <w:pPr>
         <w:pStyle w:val="Heading2"/>
@@ -18568,7 +18572,7 @@
             <w:pPr>
               <w:pStyle w:val="Compact"/>
             </w:pPr>
-            <w:hyperlink r:id="rId167">
+            <w:hyperlink r:id="rId164">
               <w:r>
                 <w:rPr>
                   <w:rStyle w:val="Hyperlink"/>
@@ -18601,7 +18605,7 @@
             <w:pPr>
               <w:pStyle w:val="Compact"/>
             </w:pPr>
-            <w:hyperlink r:id="rId168">
+            <w:hyperlink r:id="rId165">
               <w:r>
                 <w:rPr>
                   <w:rStyle w:val="Hyperlink"/>
@@ -18618,7 +18622,7 @@
             <w:r>
               <w:t xml:space="preserve"> </w:t>
             </w:r>
-            <w:hyperlink r:id="rId169">
+            <w:hyperlink r:id="rId166">
               <w:r>
                 <w:rPr>
                   <w:rStyle w:val="Hyperlink"/>
@@ -18651,7 +18655,7 @@
             <w:pPr>
               <w:pStyle w:val="Compact"/>
             </w:pPr>
-            <w:hyperlink r:id="rId87">
+            <w:hyperlink r:id="rId84">
               <w:r>
                 <w:rPr>
                   <w:rStyle w:val="Hyperlink"/>
@@ -18684,7 +18688,7 @@
             <w:pPr>
               <w:pStyle w:val="Compact"/>
             </w:pPr>
-            <w:hyperlink r:id="rId170">
+            <w:hyperlink r:id="rId167">
               <w:r>
                 <w:rPr>
                   <w:rStyle w:val="Hyperlink"/>
@@ -18701,7 +18705,7 @@
             <w:r>
               <w:t xml:space="preserve"> </w:t>
             </w:r>
-            <w:hyperlink r:id="rId171">
+            <w:hyperlink r:id="rId168">
               <w:r>
                 <w:rPr>
                   <w:rStyle w:val="Hyperlink"/>
@@ -18734,7 +18738,7 @@
             <w:pPr>
               <w:pStyle w:val="Compact"/>
             </w:pPr>
-            <w:hyperlink r:id="rId172">
+            <w:hyperlink r:id="rId169">
               <w:r>
                 <w:rPr>
                   <w:rStyle w:val="Hyperlink"/>
@@ -18767,7 +18771,7 @@
             <w:pPr>
               <w:pStyle w:val="Compact"/>
             </w:pPr>
-            <w:hyperlink r:id="rId173">
+            <w:hyperlink r:id="rId170">
               <w:r>
                 <w:rPr>
                   <w:rStyle w:val="Hyperlink"/>
@@ -18806,7 +18810,7 @@
             <w:pPr>
               <w:pStyle w:val="Compact"/>
             </w:pPr>
-            <w:hyperlink r:id="rId86">
+            <w:hyperlink r:id="rId83">
               <w:r>
                 <w:rPr>
                   <w:rStyle w:val="Hyperlink"/>
@@ -18839,7 +18843,7 @@
             <w:pPr>
               <w:pStyle w:val="Compact"/>
             </w:pPr>
-            <w:hyperlink r:id="rId174">
+            <w:hyperlink r:id="rId171">
               <w:r>
                 <w:rPr>
                   <w:rStyle w:val="Hyperlink"/>
@@ -18878,7 +18882,7 @@
             <w:pPr>
               <w:pStyle w:val="Compact"/>
             </w:pPr>
-            <w:hyperlink r:id="rId100">
+            <w:hyperlink r:id="rId97">
               <w:r>
                 <w:rPr>
                   <w:rStyle w:val="Hyperlink"/>
@@ -18890,8 +18894,8 @@
         </w:tc>
       </w:tr>
     </w:tbl>
-    <w:bookmarkEnd w:id="175"/>
-    <w:bookmarkStart w:id="182" w:name="X011570783de1287755e50c3f490af8b8964278f"/>
+    <w:bookmarkEnd w:id="172"/>
+    <w:bookmarkStart w:id="179" w:name="X011570783de1287755e50c3f490af8b8964278f"/>
     <w:p>
       <w:pPr>
         <w:pStyle w:val="Heading2"/>
@@ -18952,17 +18956,17 @@
               <w:t xml:space="preserve"> </w:t>
             </w:r>
             <w:r>
-              <w:t xml:space="preserve">(workshop dùng)</w:t>
-            </w:r>
-          </w:p>
-        </w:tc>
-        <w:tc>
-          <w:tcPr/>
-          <w:p>
-            <w:pPr>
-              <w:pStyle w:val="Compact"/>
-            </w:pPr>
-            <w:hyperlink r:id="rId176">
+              <w:t xml:space="preserve">(tùy chọn, UI tự code)</w:t>
+            </w:r>
+          </w:p>
+        </w:tc>
+        <w:tc>
+          <w:tcPr/>
+          <w:p>
+            <w:pPr>
+              <w:pStyle w:val="Compact"/>
+            </w:pPr>
+            <w:hyperlink r:id="rId173">
               <w:r>
                 <w:rPr>
                   <w:rStyle w:val="Hyperlink"/>
@@ -18995,7 +18999,7 @@
             <w:pPr>
               <w:pStyle w:val="Compact"/>
             </w:pPr>
-            <w:hyperlink r:id="rId177">
+            <w:hyperlink r:id="rId174">
               <w:r>
                 <w:rPr>
                   <w:rStyle w:val="Hyperlink"/>
@@ -19034,7 +19038,7 @@
             <w:pPr>
               <w:pStyle w:val="Compact"/>
             </w:pPr>
-            <w:hyperlink r:id="rId178">
+            <w:hyperlink r:id="rId175">
               <w:r>
                 <w:rPr>
                   <w:rStyle w:val="Hyperlink"/>
@@ -19059,15 +19063,21 @@
               </w:rPr>
               <w:t xml:space="preserve">Open WebUI</w:t>
             </w:r>
-          </w:p>
-        </w:tc>
-        <w:tc>
-          <w:tcPr/>
-          <w:p>
-            <w:pPr>
-              <w:pStyle w:val="Compact"/>
-            </w:pPr>
-            <w:hyperlink r:id="rId179">
+            <w:r>
+              <w:t xml:space="preserve"> </w:t>
+            </w:r>
+            <w:r>
+              <w:t xml:space="preserve">(workshop dùng)</w:t>
+            </w:r>
+          </w:p>
+        </w:tc>
+        <w:tc>
+          <w:tcPr/>
+          <w:p>
+            <w:pPr>
+              <w:pStyle w:val="Compact"/>
+            </w:pPr>
+            <w:hyperlink r:id="rId176">
               <w:r>
                 <w:rPr>
                   <w:rStyle w:val="Hyperlink"/>
@@ -19084,7 +19094,7 @@
             <w:r>
               <w:t xml:space="preserve"> </w:t>
             </w:r>
-            <w:hyperlink r:id="rId180">
+            <w:hyperlink r:id="rId177">
               <w:r>
                 <w:rPr>
                   <w:rStyle w:val="Hyperlink"/>
@@ -19117,7 +19127,7 @@
             <w:pPr>
               <w:pStyle w:val="Compact"/>
             </w:pPr>
-            <w:hyperlink r:id="rId181">
+            <w:hyperlink r:id="rId178">
               <w:r>
                 <w:rPr>
                   <w:rStyle w:val="Hyperlink"/>
@@ -19129,8 +19139,8 @@
         </w:tc>
       </w:tr>
     </w:tbl>
-    <w:bookmarkEnd w:id="182"/>
-    <w:bookmarkStart w:id="184" w:name="X082dd34c61e8e62b7c7863d3fda7caa433b35da"/>
+    <w:bookmarkEnd w:id="179"/>
+    <w:bookmarkStart w:id="181" w:name="X082dd34c61e8e62b7c7863d3fda7caa433b35da"/>
     <w:p>
       <w:pPr>
         <w:pStyle w:val="Heading2"/>
@@ -19246,7 +19256,7 @@
       <w:r>
         <w:t xml:space="preserve">(</w:t>
       </w:r>
-      <w:hyperlink r:id="rId71">
+      <w:hyperlink r:id="rId68">
         <w:r>
           <w:rPr>
             <w:rStyle w:val="Hyperlink"/>
@@ -19273,7 +19283,7 @@
       <w:r>
         <w:t xml:space="preserve">(</w:t>
       </w:r>
-      <w:hyperlink r:id="rId183">
+      <w:hyperlink r:id="rId180">
         <w:r>
           <w:rPr>
             <w:rStyle w:val="Hyperlink"/>
@@ -19312,7 +19322,7 @@
       <w:r>
         <w:t xml:space="preserve">(</w:t>
       </w:r>
-      <w:hyperlink r:id="rId114">
+      <w:hyperlink r:id="rId111">
         <w:r>
           <w:rPr>
             <w:rStyle w:val="Hyperlink"/>
@@ -19324,8 +19334,8 @@
         <w:t xml:space="preserve">).</w:t>
       </w:r>
     </w:p>
-    <w:bookmarkEnd w:id="184"/>
-    <w:bookmarkStart w:id="189" w:name="X14ec8f5b1622609a9f583df5640a9e05ed39ace"/>
+    <w:bookmarkEnd w:id="181"/>
+    <w:bookmarkStart w:id="186" w:name="X14ec8f5b1622609a9f583df5640a9e05ed39ace"/>
     <w:p>
       <w:pPr>
         <w:pStyle w:val="Heading2"/>
@@ -19396,7 +19406,7 @@
             <w:pPr>
               <w:pStyle w:val="Compact"/>
             </w:pPr>
-            <w:hyperlink r:id="rId185">
+            <w:hyperlink r:id="rId182">
               <w:r>
                 <w:rPr>
                   <w:rStyle w:val="Hyperlink"/>
@@ -19429,7 +19439,7 @@
             <w:pPr>
               <w:pStyle w:val="Compact"/>
             </w:pPr>
-            <w:hyperlink r:id="rId186">
+            <w:hyperlink r:id="rId183">
               <w:r>
                 <w:rPr>
                   <w:rStyle w:val="Hyperlink"/>
@@ -19462,7 +19472,7 @@
             <w:pPr>
               <w:pStyle w:val="Compact"/>
             </w:pPr>
-            <w:hyperlink r:id="rId187">
+            <w:hyperlink r:id="rId184">
               <w:r>
                 <w:rPr>
                   <w:rStyle w:val="Hyperlink"/>
@@ -19495,7 +19505,7 @@
             <w:pPr>
               <w:pStyle w:val="Compact"/>
             </w:pPr>
-            <w:hyperlink r:id="rId188">
+            <w:hyperlink r:id="rId185">
               <w:r>
                 <w:rPr>
                   <w:rStyle w:val="Hyperlink"/>
@@ -19534,7 +19544,7 @@
             <w:pPr>
               <w:pStyle w:val="Compact"/>
             </w:pPr>
-            <w:hyperlink r:id="rId79">
+            <w:hyperlink r:id="rId76">
               <w:r>
                 <w:rPr>
                   <w:rStyle w:val="Hyperlink"/>
@@ -19546,8 +19556,8 @@
         </w:tc>
       </w:tr>
     </w:tbl>
-    <w:bookmarkEnd w:id="189"/>
-    <w:bookmarkStart w:id="196" w:name="Xc7ed05af28feb682c190837c8bc1a9af1ba32c8"/>
+    <w:bookmarkEnd w:id="186"/>
+    <w:bookmarkStart w:id="193" w:name="Xc7ed05af28feb682c190837c8bc1a9af1ba32c8"/>
     <w:p>
       <w:pPr>
         <w:pStyle w:val="Heading2"/>
@@ -19667,7 +19677,7 @@
             <w:pPr>
               <w:pStyle w:val="Compact"/>
             </w:pPr>
-            <w:hyperlink r:id="rId190">
+            <w:hyperlink r:id="rId187">
               <w:r>
                 <w:rPr>
                   <w:rStyle w:val="Hyperlink"/>
@@ -19728,7 +19738,7 @@
             <w:pPr>
               <w:pStyle w:val="Compact"/>
             </w:pPr>
-            <w:hyperlink r:id="rId84">
+            <w:hyperlink r:id="rId81">
               <w:r>
                 <w:rPr>
                   <w:rStyle w:val="Hyperlink"/>
@@ -19789,7 +19799,7 @@
             <w:pPr>
               <w:pStyle w:val="Compact"/>
             </w:pPr>
-            <w:hyperlink r:id="rId191">
+            <w:hyperlink r:id="rId188">
               <w:r>
                 <w:rPr>
                   <w:rStyle w:val="Hyperlink"/>
@@ -19850,7 +19860,7 @@
             <w:pPr>
               <w:pStyle w:val="Compact"/>
             </w:pPr>
-            <w:hyperlink r:id="rId192">
+            <w:hyperlink r:id="rId189">
               <w:r>
                 <w:rPr>
                   <w:rStyle w:val="Hyperlink"/>
@@ -19911,7 +19921,7 @@
             <w:pPr>
               <w:pStyle w:val="Compact"/>
             </w:pPr>
-            <w:hyperlink r:id="rId78">
+            <w:hyperlink r:id="rId75">
               <w:r>
                 <w:rPr>
                   <w:rStyle w:val="Hyperlink"/>
@@ -19972,7 +19982,7 @@
             <w:pPr>
               <w:pStyle w:val="Compact"/>
             </w:pPr>
-            <w:hyperlink r:id="rId193">
+            <w:hyperlink r:id="rId190">
               <w:r>
                 <w:rPr>
                   <w:rStyle w:val="Hyperlink"/>
@@ -20027,7 +20037,7 @@
             <w:pPr>
               <w:pStyle w:val="Compact"/>
             </w:pPr>
-            <w:hyperlink r:id="rId194">
+            <w:hyperlink r:id="rId191">
               <w:r>
                 <w:rPr>
                   <w:rStyle w:val="Hyperlink"/>
@@ -20082,7 +20092,7 @@
             <w:pPr>
               <w:pStyle w:val="Compact"/>
             </w:pPr>
-            <w:hyperlink r:id="rId195">
+            <w:hyperlink r:id="rId192">
               <w:r>
                 <w:rPr>
                   <w:rStyle w:val="Hyperlink"/>
@@ -20094,8 +20104,8 @@
         </w:tc>
       </w:tr>
     </w:tbl>
-    <w:bookmarkEnd w:id="196"/>
-    <w:bookmarkStart w:id="203" w:name="Xcd001e6730cf48d19baf540729163167a4350db"/>
+    <w:bookmarkEnd w:id="193"/>
+    <w:bookmarkStart w:id="200" w:name="Xcd001e6730cf48d19baf540729163167a4350db"/>
     <w:p>
       <w:pPr>
         <w:pStyle w:val="Heading2"/>
@@ -20186,7 +20196,7 @@
             <w:pPr>
               <w:pStyle w:val="Compact"/>
             </w:pPr>
-            <w:hyperlink r:id="rId197">
+            <w:hyperlink r:id="rId194">
               <w:r>
                 <w:rPr>
                   <w:rStyle w:val="Hyperlink"/>
@@ -20230,7 +20240,7 @@
             <w:pPr>
               <w:pStyle w:val="Compact"/>
             </w:pPr>
-            <w:hyperlink r:id="rId198">
+            <w:hyperlink r:id="rId195">
               <w:r>
                 <w:rPr>
                   <w:rStyle w:val="Hyperlink"/>
@@ -20280,7 +20290,7 @@
             <w:pPr>
               <w:pStyle w:val="Compact"/>
             </w:pPr>
-            <w:hyperlink r:id="rId199">
+            <w:hyperlink r:id="rId196">
               <w:r>
                 <w:rPr>
                   <w:rStyle w:val="Hyperlink"/>
@@ -20324,7 +20334,7 @@
             <w:pPr>
               <w:pStyle w:val="Compact"/>
             </w:pPr>
-            <w:hyperlink r:id="rId200">
+            <w:hyperlink r:id="rId197">
               <w:r>
                 <w:rPr>
                   <w:rStyle w:val="Hyperlink"/>
@@ -20368,7 +20378,7 @@
             <w:pPr>
               <w:pStyle w:val="Compact"/>
             </w:pPr>
-            <w:hyperlink r:id="rId201">
+            <w:hyperlink r:id="rId198">
               <w:r>
                 <w:rPr>
                   <w:rStyle w:val="Hyperlink"/>
@@ -20412,7 +20422,7 @@
             <w:pPr>
               <w:pStyle w:val="Compact"/>
             </w:pPr>
-            <w:hyperlink r:id="rId202">
+            <w:hyperlink r:id="rId199">
               <w:r>
                 <w:rPr>
                   <w:rStyle w:val="Hyperlink"/>
@@ -20424,8 +20434,8 @@
         </w:tc>
       </w:tr>
     </w:tbl>
-    <w:bookmarkEnd w:id="203"/>
-    <w:bookmarkStart w:id="206" w:name="X08937572949dd7c9fa04fb3f18b6ea1349e11db"/>
+    <w:bookmarkEnd w:id="200"/>
+    <w:bookmarkStart w:id="203" w:name="X08937572949dd7c9fa04fb3f18b6ea1349e11db"/>
     <w:p>
       <w:pPr>
         <w:pStyle w:val="Heading2"/>
@@ -20451,7 +20461,7 @@
       <w:r>
         <w:t xml:space="preserve">(</w:t>
       </w:r>
-      <w:hyperlink r:id="rId204">
+      <w:hyperlink r:id="rId201">
         <w:r>
           <w:rPr>
             <w:rStyle w:val="Hyperlink"/>
@@ -20478,7 +20488,7 @@
       <w:r>
         <w:t xml:space="preserve">(</w:t>
       </w:r>
-      <w:hyperlink r:id="rId205">
+      <w:hyperlink r:id="rId202">
         <w:r>
           <w:rPr>
             <w:rStyle w:val="Hyperlink"/>
@@ -20490,8 +20500,8 @@
         <w:t xml:space="preserve">) — model &amp; kỹ thuật mới.</w:t>
       </w:r>
     </w:p>
-    <w:bookmarkEnd w:id="206"/>
-    <w:bookmarkStart w:id="211" w:name="Xf339164448bf29985a99b2ada7551988d18d607"/>
+    <w:bookmarkEnd w:id="203"/>
+    <w:bookmarkStart w:id="208" w:name="Xf339164448bf29985a99b2ada7551988d18d607"/>
     <w:p>
       <w:pPr>
         <w:pStyle w:val="Heading2"/>
@@ -20582,7 +20592,7 @@
             <w:pPr>
               <w:pStyle w:val="Compact"/>
             </w:pPr>
-            <w:hyperlink r:id="rId207">
+            <w:hyperlink r:id="rId204">
               <w:r>
                 <w:rPr>
                   <w:rStyle w:val="Hyperlink"/>
@@ -20626,7 +20636,7 @@
             <w:pPr>
               <w:pStyle w:val="Compact"/>
             </w:pPr>
-            <w:hyperlink r:id="rId208">
+            <w:hyperlink r:id="rId205">
               <w:r>
                 <w:rPr>
                   <w:rStyle w:val="Hyperlink"/>
@@ -20670,7 +20680,7 @@
             <w:pPr>
               <w:pStyle w:val="Compact"/>
             </w:pPr>
-            <w:hyperlink r:id="rId207">
+            <w:hyperlink r:id="rId204">
               <w:r>
                 <w:rPr>
                   <w:rStyle w:val="Hyperlink"/>
@@ -20714,7 +20724,7 @@
             <w:pPr>
               <w:pStyle w:val="Compact"/>
             </w:pPr>
-            <w:hyperlink r:id="rId209">
+            <w:hyperlink r:id="rId206">
               <w:r>
                 <w:rPr>
                   <w:rStyle w:val="Hyperlink"/>
@@ -20758,7 +20768,7 @@
             <w:pPr>
               <w:pStyle w:val="Compact"/>
             </w:pPr>
-            <w:hyperlink r:id="rId210">
+            <w:hyperlink r:id="rId207">
               <w:r>
                 <w:rPr>
                   <w:rStyle w:val="Hyperlink"/>
@@ -20770,8 +20780,8 @@
         </w:tc>
       </w:tr>
     </w:tbl>
-    <w:bookmarkEnd w:id="211"/>
-    <w:bookmarkStart w:id="214" w:name="Xcba3139b96dacb5f9b764aeace9786b3e5a135c"/>
+    <w:bookmarkEnd w:id="208"/>
+    <w:bookmarkStart w:id="211" w:name="Xcba3139b96dacb5f9b764aeace9786b3e5a135c"/>
     <w:p>
       <w:pPr>
         <w:pStyle w:val="Heading2"/>
@@ -20842,7 +20852,7 @@
             <w:r>
               <w:t xml:space="preserve"> </w:t>
             </w:r>
-            <w:hyperlink r:id="rId212">
+            <w:hyperlink r:id="rId209">
               <w:r>
                 <w:rPr>
                   <w:rStyle w:val="Hyperlink"/>
@@ -20881,7 +20891,7 @@
             <w:r>
               <w:t xml:space="preserve"> </w:t>
             </w:r>
-            <w:hyperlink r:id="rId213">
+            <w:hyperlink r:id="rId210">
               <w:r>
                 <w:rPr>
                   <w:rStyle w:val="Hyperlink"/>
@@ -20972,8 +20982,8 @@
         </w:pict>
       </w:r>
     </w:p>
-    <w:bookmarkEnd w:id="214"/>
-    <w:bookmarkStart w:id="215" w:name="lời-kết"/>
+    <w:bookmarkEnd w:id="211"/>
+    <w:bookmarkStart w:id="212" w:name="lời-kết"/>
     <w:p>
       <w:pPr>
         <w:pStyle w:val="Heading2"/>
@@ -21111,8 +21121,8 @@
         <w:t xml:space="preserve">Chúc các bạn build được dự án AI có ý nghĩa cho đơn vị mình.</w:t>
       </w:r>
     </w:p>
-    <w:bookmarkEnd w:id="215"/>
-    <w:bookmarkEnd w:id="216"/>
+    <w:bookmarkEnd w:id="212"/>
+    <w:bookmarkEnd w:id="213"/>
     <w:sectPr>
       <w:footerReference w:type="default" r:id="rId10"/>
       <w:footnotePr>

</xml_diff>

<commit_message>
Vá nhất quán sau khi gộp Open WebUI: Docker thành prereq + prep pre-pull image
Theo ra soat doi nghich: (1) Docker Desktop gio la dieu kien BAT BUOC cho UI Open WebUI -> them vao bang chuan bi cua README + 0_setup + them muc 'Chuan bi truoc khi bat dau' trong handbook. (2) INSTRUCTOR_CHECKLIST + KICH_BAN: them buoc PRE-PULL image Open WebUI (docker compose pull ~1GB) + start Ollama + test/verify Open WebUI cu the truoc buoi (tranh khoa demo mo man). (3) Sua narrative sai: Open WebUI co RAG RIENG (keo-tha tai lieu), KHONG dung rag_minimal.py cua hoc vien -> lam ro o kich ban + handbook. (4) Demote not Gradio trong docs/README + 2_rag/README; sua dem '5 anh'->'4 anh'. Rebuild docx.

Co-Authored-By: Claude Opus 4.8 (1M context) <noreply@anthropic.com>
</commit_message>
<xml_diff>
--- a/docs/TAI_LIEU_CHI_TIET.docx
+++ b/docs/TAI_LIEU_CHI_TIET.docx
@@ -287,7 +287,7 @@
         </w:p>
       </w:sdtContent>
     </w:sdt>
-    <w:bookmarkStart w:id="14" w:name="X77617e1789bc91b49850a033f3f0d85d8357216"/>
+    <w:bookmarkStart w:id="16" w:name="X77617e1789bc91b49850a033f3f0d85d8357216"/>
     <w:p>
       <w:pPr>
         <w:pStyle w:val="Heading1"/>
@@ -1182,31 +1182,13 @@
       </w:r>
     </w:p>
     <w:bookmarkEnd w:id="13"/>
-    <w:bookmarkEnd w:id="14"/>
-    <w:bookmarkStart w:id="17" w:name="Xf46f8ccc2134e59ef86bf8857792b2a930309a2"/>
-    <w:p>
-      <w:pPr>
-        <w:pStyle w:val="Heading1"/>
-      </w:pPr>
-      <w:r>
-        <w:t xml:space="preserve">Phần 0 — Bản đồ giải mã thuật ngữ (cho người mới)</w:t>
-      </w:r>
-    </w:p>
-    <w:p>
-      <w:pPr>
-        <w:pStyle w:val="BlockText"/>
-      </w:pPr>
-      <w:r>
-        <w:t xml:space="preserve">Dành cho bạn lần đầu tiếp xúc LLM (không cần background kỹ thuật). Không cần thuộc lòng — tra lại khi gặp trong code/bài giảng.</w:t>
-      </w:r>
-    </w:p>
-    <w:bookmarkStart w:id="15" w:name="X50e05b4ee98d25ae46f8657ac07c550510033f9"/>
-    <w:p>
-      <w:pPr>
-        <w:pStyle w:val="Heading3"/>
-      </w:pPr>
-      <w:r>
-        <w:t xml:space="preserve">🟢 8 từ PHẢI biết (hiểu workshop là cần đủ 8 từ này)</w:t>
+    <w:bookmarkStart w:id="15" w:name="chuẩn-bị-trước-khi-bắt-đầu"/>
+    <w:p>
+      <w:pPr>
+        <w:pStyle w:val="Heading2"/>
+      </w:pPr>
+      <w:r>
+        <w:t xml:space="preserve">Chuẩn bị trước khi bắt đầu</w:t>
       </w:r>
     </w:p>
     <w:tbl>
@@ -1231,34 +1213,194 @@
               <w:pStyle w:val="Compact"/>
             </w:pPr>
             <w:r>
-              <w:t xml:space="preserve">Thuật ngữ</w:t>
-            </w:r>
-          </w:p>
-        </w:tc>
-        <w:tc>
-          <w:tcPr/>
-          <w:p>
-            <w:pPr>
-              <w:pStyle w:val="Compact"/>
-            </w:pPr>
-            <w:r>
-              <w:t xml:space="preserve">Hiểu nôm na</w:t>
-            </w:r>
-          </w:p>
-        </w:tc>
-        <w:tc>
-          <w:tcPr/>
-          <w:p>
-            <w:pPr>
-              <w:pStyle w:val="Compact"/>
-            </w:pPr>
-            <w:r>
-              <w:t xml:space="preserve">Ví dụ</w:t>
+              <w:t xml:space="preserve">Thành phần</w:t>
+            </w:r>
+          </w:p>
+        </w:tc>
+        <w:tc>
+          <w:tcPr/>
+          <w:p>
+            <w:pPr>
+              <w:pStyle w:val="Compact"/>
+            </w:pPr>
+            <w:r>
+              <w:t xml:space="preserve">Tối thiểu</w:t>
+            </w:r>
+          </w:p>
+        </w:tc>
+        <w:tc>
+          <w:tcPr/>
+          <w:p>
+            <w:pPr>
+              <w:pStyle w:val="Compact"/>
+            </w:pPr>
+            <w:r>
+              <w:t xml:space="preserve">Ghi chú</w:t>
             </w:r>
           </w:p>
         </w:tc>
       </w:tr>
       <w:tr>
+        <w:tc>
+          <w:tcPr/>
+          <w:p>
+            <w:pPr>
+              <w:pStyle w:val="Compact"/>
+            </w:pPr>
+            <w:r>
+              <w:t xml:space="preserve">RAM</w:t>
+            </w:r>
+          </w:p>
+        </w:tc>
+        <w:tc>
+          <w:tcPr/>
+          <w:p>
+            <w:pPr>
+              <w:pStyle w:val="Compact"/>
+            </w:pPr>
+            <w:r>
+              <w:t xml:space="preserve">8GB (16GB khuyến nghị)</w:t>
+            </w:r>
+          </w:p>
+        </w:tc>
+        <w:tc>
+          <w:tcPr/>
+          <w:p>
+            <w:pPr>
+              <w:pStyle w:val="Compact"/>
+            </w:pPr>
+            <w:r>
+              <w:t xml:space="preserve">qwen3:1.7b chạy tốt trên 8GB</w:t>
+            </w:r>
+          </w:p>
+        </w:tc>
+      </w:tr>
+      <w:tr>
+        <w:tc>
+          <w:tcPr/>
+          <w:p>
+            <w:pPr>
+              <w:pStyle w:val="Compact"/>
+            </w:pPr>
+            <w:r>
+              <w:t xml:space="preserve">Ổ trống</w:t>
+            </w:r>
+          </w:p>
+        </w:tc>
+        <w:tc>
+          <w:tcPr/>
+          <w:p>
+            <w:pPr>
+              <w:pStyle w:val="Compact"/>
+            </w:pPr>
+            <w:r>
+              <w:t xml:space="preserve">~5GB</w:t>
+            </w:r>
+          </w:p>
+        </w:tc>
+        <w:tc>
+          <w:tcPr/>
+          <w:p>
+            <w:pPr>
+              <w:pStyle w:val="Compact"/>
+            </w:pPr>
+            <w:r>
+              <w:t xml:space="preserve">model ~1.7GB + image Docker (nếu dùng Open WebUI)</w:t>
+            </w:r>
+          </w:p>
+        </w:tc>
+      </w:tr>
+      <w:tr>
+        <w:tc>
+          <w:tcPr/>
+          <w:p>
+            <w:pPr>
+              <w:pStyle w:val="Compact"/>
+            </w:pPr>
+            <w:r>
+              <w:t xml:space="preserve">Python</w:t>
+            </w:r>
+          </w:p>
+        </w:tc>
+        <w:tc>
+          <w:tcPr/>
+          <w:p>
+            <w:pPr>
+              <w:pStyle w:val="Compact"/>
+            </w:pPr>
+            <w:r>
+              <w:t xml:space="preserve">3.10+</w:t>
+            </w:r>
+          </w:p>
+        </w:tc>
+        <w:tc>
+          <w:tcPr/>
+          <w:p>
+            <w:pPr>
+              <w:pStyle w:val="Compact"/>
+            </w:pPr>
+            <w:r>
+              <w:t xml:space="preserve">cho notebook + script CLI</w:t>
+            </w:r>
+          </w:p>
+        </w:tc>
+      </w:tr>
+      <w:tr>
+        <w:tc>
+          <w:tcPr/>
+          <w:p>
+            <w:pPr>
+              <w:pStyle w:val="Compact"/>
+            </w:pPr>
+            <w:r>
+              <w:t xml:space="preserve">Ollama</w:t>
+            </w:r>
+          </w:p>
+        </w:tc>
+        <w:tc>
+          <w:tcPr/>
+          <w:p>
+            <w:pPr>
+              <w:pStyle w:val="Compact"/>
+            </w:pPr>
+            <w:r>
+              <w:t xml:space="preserve">cài qua</w:t>
+            </w:r>
+            <w:r>
+              <w:t xml:space="preserve"> </w:t>
+            </w:r>
+            <w:r>
+              <w:rPr>
+                <w:rStyle w:val="VerbatimChar"/>
+              </w:rPr>
+              <w:t xml:space="preserve">0_setup/setup</w:t>
+            </w:r>
+          </w:p>
+        </w:tc>
+        <w:tc>
+          <w:tcPr/>
+          <w:p>
+            <w:pPr>
+              <w:pStyle w:val="Compact"/>
+            </w:pPr>
+            <w:r>
+              <w:t xml:space="preserve">chạy LLM + embedding</w:t>
+            </w:r>
+          </w:p>
+        </w:tc>
+      </w:tr>
+      <w:tr>
+        <w:tc>
+          <w:tcPr/>
+          <w:p>
+            <w:pPr>
+              <w:pStyle w:val="Compact"/>
+            </w:pPr>
+            <w:r>
+              <w:t xml:space="preserve">Docker Desktop</w:t>
+            </w:r>
+          </w:p>
+        </w:tc>
         <w:tc>
           <w:tcPr/>
           <w:p>
@@ -1270,397 +1412,138 @@
                 <w:b/>
                 <w:bCs/>
               </w:rPr>
-              <w:t xml:space="preserve">LLM</w:t>
+              <w:t xml:space="preserve">chỉ cần nếu dùng Open WebUI</w:t>
+            </w:r>
+          </w:p>
+        </w:tc>
+        <w:tc>
+          <w:tcPr/>
+          <w:p>
+            <w:pPr>
+              <w:pStyle w:val="Compact"/>
+            </w:pPr>
+            <w:r>
+              <w:t xml:space="preserve">giao diện chat khuyến nghị —</w:t>
             </w:r>
             <w:r>
               <w:t xml:space="preserve"> </w:t>
             </w:r>
-            <w:r>
-              <w:t xml:space="preserve">(Large Language Model)</w:t>
-            </w:r>
-          </w:p>
-        </w:tc>
-        <w:tc>
-          <w:tcPr/>
-          <w:p>
-            <w:pPr>
-              <w:pStyle w:val="Compact"/>
-            </w:pPr>
-            <w:r>
-              <w:t xml:space="preserve">"Bộ não" AI đã học từ lượng văn bản khổng lồ; bản chất là</w:t>
+            <w:hyperlink r:id="rId14">
+              <w:r>
+                <w:rPr>
+                  <w:rStyle w:val="Hyperlink"/>
+                </w:rPr>
+                <w:t xml:space="preserve">tải về</w:t>
+              </w:r>
+            </w:hyperlink>
+            <w:r>
+              <w:t xml:space="preserve">;</w:t>
             </w:r>
             <w:r>
               <w:t xml:space="preserve"> </w:t>
             </w:r>
-            <w:r>
-              <w:rPr>
-                <w:b/>
-                <w:bCs/>
-              </w:rPr>
-              <w:t xml:space="preserve">đoán chữ tiếp theo theo xác suất</w:t>
-            </w:r>
-            <w:r>
-              <w:t xml:space="preserve"> </w:t>
-            </w:r>
-            <w:r>
-              <w:t xml:space="preserve">— nên đôi khi đoán sai mà vẫn nói chắc nịch ("bịa")</w:t>
-            </w:r>
-          </w:p>
-        </w:tc>
-        <w:tc>
-          <w:tcPr/>
-          <w:p>
-            <w:pPr>
-              <w:pStyle w:val="Compact"/>
-            </w:pPr>
-            <w:r>
-              <w:t xml:space="preserve">ChatGPT, Qwen3, Llama</w:t>
-            </w:r>
-          </w:p>
-        </w:tc>
-      </w:tr>
-      <w:tr>
-        <w:tc>
-          <w:tcPr/>
-          <w:p>
-            <w:pPr>
-              <w:pStyle w:val="Compact"/>
-            </w:pPr>
-            <w:r>
-              <w:rPr>
-                <w:b/>
-                <w:bCs/>
-              </w:rPr>
-              <w:t xml:space="preserve">Model</w:t>
-            </w:r>
-          </w:p>
-        </w:tc>
-        <w:tc>
-          <w:tcPr/>
-          <w:p>
-            <w:pPr>
-              <w:pStyle w:val="Compact"/>
-            </w:pPr>
-            <w:r>
-              <w:t xml:space="preserve">File chứa "bộ não" đó (vài trăm MB đến vài chục GB)</w:t>
-            </w:r>
-          </w:p>
-        </w:tc>
-        <w:tc>
-          <w:tcPr/>
-          <w:p>
-            <w:pPr>
-              <w:pStyle w:val="Compact"/>
-            </w:pPr>
             <w:r>
               <w:rPr>
                 <w:rStyle w:val="VerbatimChar"/>
               </w:rPr>
-              <w:t xml:space="preserve">qwen3:1.7b</w:t>
+              <w:t xml:space="preserve">setup</w:t>
             </w:r>
             <w:r>
               <w:t xml:space="preserve"> </w:t>
             </w:r>
             <w:r>
-              <w:t xml:space="preserve">= file 1.4 GB</w:t>
-            </w:r>
-          </w:p>
-        </w:tc>
-      </w:tr>
-      <w:tr>
-        <w:tc>
-          <w:tcPr/>
-          <w:p>
-            <w:pPr>
-              <w:pStyle w:val="Compact"/>
-            </w:pPr>
-            <w:r>
-              <w:rPr>
-                <w:b/>
-                <w:bCs/>
-              </w:rPr>
-              <w:t xml:space="preserve">Token</w:t>
-            </w:r>
-          </w:p>
-        </w:tc>
-        <w:tc>
-          <w:tcPr/>
-          <w:p>
-            <w:pPr>
-              <w:pStyle w:val="Compact"/>
-            </w:pPr>
-            <w:r>
-              <w:t xml:space="preserve">Mẩu chữ LLM đọc/sinh từng mẩu một. Tiếng Việt tốn token hơn tiếng Anh (dấu + âm tiết)</w:t>
-            </w:r>
-          </w:p>
-        </w:tc>
-        <w:tc>
-          <w:tcPr/>
-          <w:p>
-            <w:pPr>
-              <w:pStyle w:val="Compact"/>
-            </w:pPr>
-            <w:r>
-              <w:t xml:space="preserve">"xin chào" ≈ 2-3 token</w:t>
-            </w:r>
-          </w:p>
-        </w:tc>
-      </w:tr>
-      <w:tr>
-        <w:tc>
-          <w:tcPr/>
-          <w:p>
-            <w:pPr>
-              <w:pStyle w:val="Compact"/>
-            </w:pPr>
-            <w:r>
-              <w:rPr>
-                <w:b/>
-                <w:bCs/>
-              </w:rPr>
-              <w:t xml:space="preserve">Embedding</w:t>
-            </w:r>
-          </w:p>
-        </w:tc>
-        <w:tc>
-          <w:tcPr/>
-          <w:p>
-            <w:pPr>
-              <w:pStyle w:val="Compact"/>
-            </w:pPr>
-            <w:r>
-              <w:t xml:space="preserve">Biến đoạn chữ thành</w:t>
-            </w:r>
-            <w:r>
-              <w:t xml:space="preserve"> </w:t>
-            </w:r>
-            <w:r>
-              <w:rPr>
-                <w:b/>
-                <w:bCs/>
-              </w:rPr>
-              <w:t xml:space="preserve">dãy số (vector)</w:t>
-            </w:r>
-            <w:r>
-              <w:t xml:space="preserve">; nghĩa giống nhau → dãy số gần nhau</w:t>
-            </w:r>
-          </w:p>
-        </w:tc>
-        <w:tc>
-          <w:tcPr/>
-          <w:p>
-            <w:pPr>
-              <w:pStyle w:val="Compact"/>
-            </w:pPr>
-            <w:r>
-              <w:t xml:space="preserve">"xe máy" ↔ "xe đạp" gần nhau</w:t>
-            </w:r>
-          </w:p>
-        </w:tc>
-      </w:tr>
-      <w:tr>
-        <w:tc>
-          <w:tcPr/>
-          <w:p>
-            <w:pPr>
-              <w:pStyle w:val="Compact"/>
-            </w:pPr>
-            <w:r>
-              <w:rPr>
-                <w:b/>
-                <w:bCs/>
-              </w:rPr>
-              <w:t xml:space="preserve">RAG</w:t>
-            </w:r>
-          </w:p>
-        </w:tc>
-        <w:tc>
-          <w:tcPr/>
-          <w:p>
-            <w:pPr>
-              <w:pStyle w:val="Compact"/>
-            </w:pPr>
-            <w:r>
-              <w:t xml:space="preserve">Cho LLM</w:t>
-            </w:r>
-            <w:r>
-              <w:t xml:space="preserve"> </w:t>
-            </w:r>
-            <w:r>
-              <w:rPr>
-                <w:b/>
-                <w:bCs/>
-              </w:rPr>
-              <w:t xml:space="preserve">tra tài liệu của bạn TRƯỚC khi</w:t>
-            </w:r>
-            <w:r>
-              <w:t xml:space="preserve"> </w:t>
-            </w:r>
-            <w:r>
-              <w:t xml:space="preserve">trả lời</w:t>
-            </w:r>
-          </w:p>
-        </w:tc>
-        <w:tc>
-          <w:tcPr/>
-          <w:p>
-            <w:pPr>
-              <w:pStyle w:val="Compact"/>
-            </w:pPr>
-            <w:r>
-              <w:t xml:space="preserve">hỏi → tìm đoạn liên quan → LLM trả lời + trích nguồn</w:t>
-            </w:r>
-          </w:p>
-        </w:tc>
-      </w:tr>
-      <w:tr>
-        <w:tc>
-          <w:tcPr/>
-          <w:p>
-            <w:pPr>
-              <w:pStyle w:val="Compact"/>
-            </w:pPr>
-            <w:r>
-              <w:rPr>
-                <w:b/>
-                <w:bCs/>
-              </w:rPr>
-              <w:t xml:space="preserve">Agent</w:t>
-            </w:r>
-          </w:p>
-        </w:tc>
-        <w:tc>
-          <w:tcPr/>
-          <w:p>
-            <w:pPr>
-              <w:pStyle w:val="Compact"/>
-            </w:pPr>
-            <w:r>
-              <w:t xml:space="preserve">LLM biết tự</w:t>
-            </w:r>
-            <w:r>
-              <w:t xml:space="preserve"> </w:t>
-            </w:r>
-            <w:r>
-              <w:rPr>
-                <w:b/>
-                <w:bCs/>
-              </w:rPr>
-              <w:t xml:space="preserve">gọi công cụ (tool) để hành động</w:t>
-            </w:r>
-            <w:r>
-              <w:t xml:space="preserve">, không chỉ trả lời</w:t>
-            </w:r>
-          </w:p>
-        </w:tc>
-        <w:tc>
-          <w:tcPr/>
-          <w:p>
-            <w:pPr>
-              <w:pStyle w:val="Compact"/>
-            </w:pPr>
-            <w:r>
-              <w:t xml:space="preserve">"mấy giờ?" → gọi tool</w:t>
-            </w:r>
-            <w:r>
-              <w:t xml:space="preserve"> </w:t>
-            </w:r>
-            <w:r>
-              <w:rPr>
-                <w:rStyle w:val="VerbatimChar"/>
-              </w:rPr>
-              <w:t xml:space="preserve">get_time</w:t>
-            </w:r>
-          </w:p>
-        </w:tc>
-      </w:tr>
-      <w:tr>
-        <w:tc>
-          <w:tcPr/>
-          <w:p>
-            <w:pPr>
-              <w:pStyle w:val="Compact"/>
-            </w:pPr>
-            <w:r>
-              <w:rPr>
-                <w:b/>
-                <w:bCs/>
-              </w:rPr>
-              <w:t xml:space="preserve">Tool</w:t>
-            </w:r>
-          </w:p>
-        </w:tc>
-        <w:tc>
-          <w:tcPr/>
-          <w:p>
-            <w:pPr>
-              <w:pStyle w:val="Compact"/>
-            </w:pPr>
-            <w:r>
-              <w:t xml:space="preserve">Một function (vd Python) mà agent có thể gọi</w:t>
-            </w:r>
-          </w:p>
-        </w:tc>
-        <w:tc>
-          <w:tcPr/>
-          <w:p>
-            <w:pPr>
-              <w:pStyle w:val="Compact"/>
-            </w:pPr>
-            <w:r>
-              <w:t xml:space="preserve">đọc file, gọi API, tính toán</w:t>
-            </w:r>
-          </w:p>
-        </w:tc>
-      </w:tr>
-      <w:tr>
-        <w:tc>
-          <w:tcPr/>
-          <w:p>
-            <w:pPr>
-              <w:pStyle w:val="Compact"/>
-            </w:pPr>
-            <w:r>
-              <w:rPr>
-                <w:b/>
-                <w:bCs/>
-              </w:rPr>
-              <w:t xml:space="preserve">Offline / Local</w:t>
-            </w:r>
-          </w:p>
-        </w:tc>
-        <w:tc>
-          <w:tcPr/>
-          <w:p>
-            <w:pPr>
-              <w:pStyle w:val="Compact"/>
-            </w:pPr>
-            <w:r>
-              <w:t xml:space="preserve">Chạy 100% trên máy bạn, không gửi dữ liệu đi đâu</w:t>
-            </w:r>
-          </w:p>
-        </w:tc>
-        <w:tc>
-          <w:tcPr/>
-          <w:p>
-            <w:pPr>
-              <w:pStyle w:val="Compact"/>
-            </w:pPr>
-            <w:r>
-              <w:t xml:space="preserve">trục cốt lõi của workshop</w:t>
+              <w:t xml:space="preserve">KHÔNG tự cài</w:t>
             </w:r>
           </w:p>
         </w:tc>
       </w:tr>
     </w:tbl>
+    <w:p>
+      <w:pPr>
+        <w:pStyle w:val="BlockText"/>
+      </w:pPr>
+      <w:r>
+        <w:t xml:space="preserve">Học bằng</w:t>
+      </w:r>
+      <w:r>
+        <w:t xml:space="preserve"> </w:t>
+      </w:r>
+      <w:r>
+        <w:rPr>
+          <w:b/>
+          <w:bCs/>
+        </w:rPr>
+        <w:t xml:space="preserve">notebook/CLI</w:t>
+      </w:r>
+      <w:r>
+        <w:t xml:space="preserve">: chỉ cần Ollama + Python. Dùng giao diện</w:t>
+      </w:r>
+      <w:r>
+        <w:t xml:space="preserve"> </w:t>
+      </w:r>
+      <w:r>
+        <w:rPr>
+          <w:b/>
+          <w:bCs/>
+        </w:rPr>
+        <w:t xml:space="preserve">Open WebUI</w:t>
+      </w:r>
+      <w:r>
+        <w:t xml:space="preserve"> </w:t>
+      </w:r>
+      <w:r>
+        <w:t xml:space="preserve">(đẹp như ChatGPT, kéo–thả tài liệu để hỏi đáp): cài thêm Docker Desktop. Lưu ý: RAG trong Open WebUI là</w:t>
+      </w:r>
+      <w:r>
+        <w:t xml:space="preserve"> </w:t>
+      </w:r>
+      <w:r>
+        <w:rPr>
+          <w:b/>
+          <w:bCs/>
+        </w:rPr>
+        <w:t xml:space="preserve">độc lập</w:t>
+      </w:r>
+      <w:r>
+        <w:t xml:space="preserve"> </w:t>
+      </w:r>
+      <w:r>
+        <w:t xml:space="preserve">với pipeline RAG bạn tự code ở Phần 2 — cả hai đều hữu ích, một cái không cần code, một cái dạy bạn cơ chế bên trong.</w:t>
+      </w:r>
+    </w:p>
+    <w:p>
+      <w:r>
+        <w:pict>
+          <v:rect style="width:0;height:1.5pt" o:hralign="center" o:hrstd="t" o:hr="t"/>
+        </w:pict>
+      </w:r>
+    </w:p>
     <w:bookmarkEnd w:id="15"/>
-    <w:bookmarkStart w:id="16" w:name="X0a7120e82d9a3b56b291622b8274d21223d413e"/>
+    <w:bookmarkEnd w:id="16"/>
+    <w:bookmarkStart w:id="19" w:name="Xf46f8ccc2134e59ef86bf8857792b2a930309a2"/>
+    <w:p>
+      <w:pPr>
+        <w:pStyle w:val="Heading1"/>
+      </w:pPr>
+      <w:r>
+        <w:t xml:space="preserve">Phần 0 — Bản đồ giải mã thuật ngữ (cho người mới)</w:t>
+      </w:r>
+    </w:p>
+    <w:p>
+      <w:pPr>
+        <w:pStyle w:val="BlockText"/>
+      </w:pPr>
+      <w:r>
+        <w:t xml:space="preserve">Dành cho bạn lần đầu tiếp xúc LLM (không cần background kỹ thuật). Không cần thuộc lòng — tra lại khi gặp trong code/bài giảng.</w:t>
+      </w:r>
+    </w:p>
+    <w:bookmarkStart w:id="17" w:name="X50e05b4ee98d25ae46f8657ac07c550510033f9"/>
     <w:p>
       <w:pPr>
         <w:pStyle w:val="Heading3"/>
       </w:pPr>
       <w:r>
-        <w:t xml:space="preserve">🟡 Tra khi gặp (không cần nhớ trước)</w:t>
+        <w:t xml:space="preserve">🟢 8 từ PHẢI biết (hiểu workshop là cần đủ 8 từ này)</w:t>
       </w:r>
     </w:p>
     <w:tbl>
@@ -1724,6 +1607,460 @@
                 <w:b/>
                 <w:bCs/>
               </w:rPr>
+              <w:t xml:space="preserve">LLM</w:t>
+            </w:r>
+            <w:r>
+              <w:t xml:space="preserve"> </w:t>
+            </w:r>
+            <w:r>
+              <w:t xml:space="preserve">(Large Language Model)</w:t>
+            </w:r>
+          </w:p>
+        </w:tc>
+        <w:tc>
+          <w:tcPr/>
+          <w:p>
+            <w:pPr>
+              <w:pStyle w:val="Compact"/>
+            </w:pPr>
+            <w:r>
+              <w:t xml:space="preserve">"Bộ não" AI đã học từ lượng văn bản khổng lồ; bản chất là</w:t>
+            </w:r>
+            <w:r>
+              <w:t xml:space="preserve"> </w:t>
+            </w:r>
+            <w:r>
+              <w:rPr>
+                <w:b/>
+                <w:bCs/>
+              </w:rPr>
+              <w:t xml:space="preserve">đoán chữ tiếp theo theo xác suất</w:t>
+            </w:r>
+            <w:r>
+              <w:t xml:space="preserve"> </w:t>
+            </w:r>
+            <w:r>
+              <w:t xml:space="preserve">— nên đôi khi đoán sai mà vẫn nói chắc nịch ("bịa")</w:t>
+            </w:r>
+          </w:p>
+        </w:tc>
+        <w:tc>
+          <w:tcPr/>
+          <w:p>
+            <w:pPr>
+              <w:pStyle w:val="Compact"/>
+            </w:pPr>
+            <w:r>
+              <w:t xml:space="preserve">ChatGPT, Qwen3, Llama</w:t>
+            </w:r>
+          </w:p>
+        </w:tc>
+      </w:tr>
+      <w:tr>
+        <w:tc>
+          <w:tcPr/>
+          <w:p>
+            <w:pPr>
+              <w:pStyle w:val="Compact"/>
+            </w:pPr>
+            <w:r>
+              <w:rPr>
+                <w:b/>
+                <w:bCs/>
+              </w:rPr>
+              <w:t xml:space="preserve">Model</w:t>
+            </w:r>
+          </w:p>
+        </w:tc>
+        <w:tc>
+          <w:tcPr/>
+          <w:p>
+            <w:pPr>
+              <w:pStyle w:val="Compact"/>
+            </w:pPr>
+            <w:r>
+              <w:t xml:space="preserve">File chứa "bộ não" đó (vài trăm MB đến vài chục GB)</w:t>
+            </w:r>
+          </w:p>
+        </w:tc>
+        <w:tc>
+          <w:tcPr/>
+          <w:p>
+            <w:pPr>
+              <w:pStyle w:val="Compact"/>
+            </w:pPr>
+            <w:r>
+              <w:rPr>
+                <w:rStyle w:val="VerbatimChar"/>
+              </w:rPr>
+              <w:t xml:space="preserve">qwen3:1.7b</w:t>
+            </w:r>
+            <w:r>
+              <w:t xml:space="preserve"> </w:t>
+            </w:r>
+            <w:r>
+              <w:t xml:space="preserve">= file 1.4 GB</w:t>
+            </w:r>
+          </w:p>
+        </w:tc>
+      </w:tr>
+      <w:tr>
+        <w:tc>
+          <w:tcPr/>
+          <w:p>
+            <w:pPr>
+              <w:pStyle w:val="Compact"/>
+            </w:pPr>
+            <w:r>
+              <w:rPr>
+                <w:b/>
+                <w:bCs/>
+              </w:rPr>
+              <w:t xml:space="preserve">Token</w:t>
+            </w:r>
+          </w:p>
+        </w:tc>
+        <w:tc>
+          <w:tcPr/>
+          <w:p>
+            <w:pPr>
+              <w:pStyle w:val="Compact"/>
+            </w:pPr>
+            <w:r>
+              <w:t xml:space="preserve">Mẩu chữ LLM đọc/sinh từng mẩu một. Tiếng Việt tốn token hơn tiếng Anh (dấu + âm tiết)</w:t>
+            </w:r>
+          </w:p>
+        </w:tc>
+        <w:tc>
+          <w:tcPr/>
+          <w:p>
+            <w:pPr>
+              <w:pStyle w:val="Compact"/>
+            </w:pPr>
+            <w:r>
+              <w:t xml:space="preserve">"xin chào" ≈ 2-3 token</w:t>
+            </w:r>
+          </w:p>
+        </w:tc>
+      </w:tr>
+      <w:tr>
+        <w:tc>
+          <w:tcPr/>
+          <w:p>
+            <w:pPr>
+              <w:pStyle w:val="Compact"/>
+            </w:pPr>
+            <w:r>
+              <w:rPr>
+                <w:b/>
+                <w:bCs/>
+              </w:rPr>
+              <w:t xml:space="preserve">Embedding</w:t>
+            </w:r>
+          </w:p>
+        </w:tc>
+        <w:tc>
+          <w:tcPr/>
+          <w:p>
+            <w:pPr>
+              <w:pStyle w:val="Compact"/>
+            </w:pPr>
+            <w:r>
+              <w:t xml:space="preserve">Biến đoạn chữ thành</w:t>
+            </w:r>
+            <w:r>
+              <w:t xml:space="preserve"> </w:t>
+            </w:r>
+            <w:r>
+              <w:rPr>
+                <w:b/>
+                <w:bCs/>
+              </w:rPr>
+              <w:t xml:space="preserve">dãy số (vector)</w:t>
+            </w:r>
+            <w:r>
+              <w:t xml:space="preserve">; nghĩa giống nhau → dãy số gần nhau</w:t>
+            </w:r>
+          </w:p>
+        </w:tc>
+        <w:tc>
+          <w:tcPr/>
+          <w:p>
+            <w:pPr>
+              <w:pStyle w:val="Compact"/>
+            </w:pPr>
+            <w:r>
+              <w:t xml:space="preserve">"xe máy" ↔ "xe đạp" gần nhau</w:t>
+            </w:r>
+          </w:p>
+        </w:tc>
+      </w:tr>
+      <w:tr>
+        <w:tc>
+          <w:tcPr/>
+          <w:p>
+            <w:pPr>
+              <w:pStyle w:val="Compact"/>
+            </w:pPr>
+            <w:r>
+              <w:rPr>
+                <w:b/>
+                <w:bCs/>
+              </w:rPr>
+              <w:t xml:space="preserve">RAG</w:t>
+            </w:r>
+          </w:p>
+        </w:tc>
+        <w:tc>
+          <w:tcPr/>
+          <w:p>
+            <w:pPr>
+              <w:pStyle w:val="Compact"/>
+            </w:pPr>
+            <w:r>
+              <w:t xml:space="preserve">Cho LLM</w:t>
+            </w:r>
+            <w:r>
+              <w:t xml:space="preserve"> </w:t>
+            </w:r>
+            <w:r>
+              <w:rPr>
+                <w:b/>
+                <w:bCs/>
+              </w:rPr>
+              <w:t xml:space="preserve">tra tài liệu của bạn TRƯỚC khi</w:t>
+            </w:r>
+            <w:r>
+              <w:t xml:space="preserve"> </w:t>
+            </w:r>
+            <w:r>
+              <w:t xml:space="preserve">trả lời</w:t>
+            </w:r>
+          </w:p>
+        </w:tc>
+        <w:tc>
+          <w:tcPr/>
+          <w:p>
+            <w:pPr>
+              <w:pStyle w:val="Compact"/>
+            </w:pPr>
+            <w:r>
+              <w:t xml:space="preserve">hỏi → tìm đoạn liên quan → LLM trả lời + trích nguồn</w:t>
+            </w:r>
+          </w:p>
+        </w:tc>
+      </w:tr>
+      <w:tr>
+        <w:tc>
+          <w:tcPr/>
+          <w:p>
+            <w:pPr>
+              <w:pStyle w:val="Compact"/>
+            </w:pPr>
+            <w:r>
+              <w:rPr>
+                <w:b/>
+                <w:bCs/>
+              </w:rPr>
+              <w:t xml:space="preserve">Agent</w:t>
+            </w:r>
+          </w:p>
+        </w:tc>
+        <w:tc>
+          <w:tcPr/>
+          <w:p>
+            <w:pPr>
+              <w:pStyle w:val="Compact"/>
+            </w:pPr>
+            <w:r>
+              <w:t xml:space="preserve">LLM biết tự</w:t>
+            </w:r>
+            <w:r>
+              <w:t xml:space="preserve"> </w:t>
+            </w:r>
+            <w:r>
+              <w:rPr>
+                <w:b/>
+                <w:bCs/>
+              </w:rPr>
+              <w:t xml:space="preserve">gọi công cụ (tool) để hành động</w:t>
+            </w:r>
+            <w:r>
+              <w:t xml:space="preserve">, không chỉ trả lời</w:t>
+            </w:r>
+          </w:p>
+        </w:tc>
+        <w:tc>
+          <w:tcPr/>
+          <w:p>
+            <w:pPr>
+              <w:pStyle w:val="Compact"/>
+            </w:pPr>
+            <w:r>
+              <w:t xml:space="preserve">"mấy giờ?" → gọi tool</w:t>
+            </w:r>
+            <w:r>
+              <w:t xml:space="preserve"> </w:t>
+            </w:r>
+            <w:r>
+              <w:rPr>
+                <w:rStyle w:val="VerbatimChar"/>
+              </w:rPr>
+              <w:t xml:space="preserve">get_time</w:t>
+            </w:r>
+          </w:p>
+        </w:tc>
+      </w:tr>
+      <w:tr>
+        <w:tc>
+          <w:tcPr/>
+          <w:p>
+            <w:pPr>
+              <w:pStyle w:val="Compact"/>
+            </w:pPr>
+            <w:r>
+              <w:rPr>
+                <w:b/>
+                <w:bCs/>
+              </w:rPr>
+              <w:t xml:space="preserve">Tool</w:t>
+            </w:r>
+          </w:p>
+        </w:tc>
+        <w:tc>
+          <w:tcPr/>
+          <w:p>
+            <w:pPr>
+              <w:pStyle w:val="Compact"/>
+            </w:pPr>
+            <w:r>
+              <w:t xml:space="preserve">Một function (vd Python) mà agent có thể gọi</w:t>
+            </w:r>
+          </w:p>
+        </w:tc>
+        <w:tc>
+          <w:tcPr/>
+          <w:p>
+            <w:pPr>
+              <w:pStyle w:val="Compact"/>
+            </w:pPr>
+            <w:r>
+              <w:t xml:space="preserve">đọc file, gọi API, tính toán</w:t>
+            </w:r>
+          </w:p>
+        </w:tc>
+      </w:tr>
+      <w:tr>
+        <w:tc>
+          <w:tcPr/>
+          <w:p>
+            <w:pPr>
+              <w:pStyle w:val="Compact"/>
+            </w:pPr>
+            <w:r>
+              <w:rPr>
+                <w:b/>
+                <w:bCs/>
+              </w:rPr>
+              <w:t xml:space="preserve">Offline / Local</w:t>
+            </w:r>
+          </w:p>
+        </w:tc>
+        <w:tc>
+          <w:tcPr/>
+          <w:p>
+            <w:pPr>
+              <w:pStyle w:val="Compact"/>
+            </w:pPr>
+            <w:r>
+              <w:t xml:space="preserve">Chạy 100% trên máy bạn, không gửi dữ liệu đi đâu</w:t>
+            </w:r>
+          </w:p>
+        </w:tc>
+        <w:tc>
+          <w:tcPr/>
+          <w:p>
+            <w:pPr>
+              <w:pStyle w:val="Compact"/>
+            </w:pPr>
+            <w:r>
+              <w:t xml:space="preserve">trục cốt lõi của workshop</w:t>
+            </w:r>
+          </w:p>
+        </w:tc>
+      </w:tr>
+    </w:tbl>
+    <w:bookmarkEnd w:id="17"/>
+    <w:bookmarkStart w:id="18" w:name="X0a7120e82d9a3b56b291622b8274d21223d413e"/>
+    <w:p>
+      <w:pPr>
+        <w:pStyle w:val="Heading3"/>
+      </w:pPr>
+      <w:r>
+        <w:t xml:space="preserve">🟡 Tra khi gặp (không cần nhớ trước)</w:t>
+      </w:r>
+    </w:p>
+    <w:tbl>
+      <w:tblPr>
+        <w:tblStyle w:val="Table"/>
+        <w:tblW w:type="auto" w:w="0"/>
+        <w:tblLook w:firstRow="1" w:lastRow="0" w:firstColumn="0" w:lastColumn="0" w:noHBand="0" w:noVBand="0" w:val="0020"/>
+      </w:tblPr>
+      <w:tblGrid>
+        <w:gridCol w:w="2640"/>
+        <w:gridCol w:w="2640"/>
+        <w:gridCol w:w="2640"/>
+      </w:tblGrid>
+      <w:tr>
+        <w:trPr>
+          <w:tblHeader w:val="on"/>
+        </w:trPr>
+        <w:tc>
+          <w:tcPr/>
+          <w:p>
+            <w:pPr>
+              <w:pStyle w:val="Compact"/>
+            </w:pPr>
+            <w:r>
+              <w:t xml:space="preserve">Thuật ngữ</w:t>
+            </w:r>
+          </w:p>
+        </w:tc>
+        <w:tc>
+          <w:tcPr/>
+          <w:p>
+            <w:pPr>
+              <w:pStyle w:val="Compact"/>
+            </w:pPr>
+            <w:r>
+              <w:t xml:space="preserve">Hiểu nôm na</w:t>
+            </w:r>
+          </w:p>
+        </w:tc>
+        <w:tc>
+          <w:tcPr/>
+          <w:p>
+            <w:pPr>
+              <w:pStyle w:val="Compact"/>
+            </w:pPr>
+            <w:r>
+              <w:t xml:space="preserve">Ví dụ</w:t>
+            </w:r>
+          </w:p>
+        </w:tc>
+      </w:tr>
+      <w:tr>
+        <w:tc>
+          <w:tcPr/>
+          <w:p>
+            <w:pPr>
+              <w:pStyle w:val="Compact"/>
+            </w:pPr>
+            <w:r>
+              <w:rPr>
+                <w:b/>
+                <w:bCs/>
+              </w:rPr>
               <w:t xml:space="preserve">Tham số</w:t>
             </w:r>
             <w:r>
@@ -2316,9 +2653,9 @@
         </w:pict>
       </w:r>
     </w:p>
-    <w:bookmarkEnd w:id="16"/>
-    <w:bookmarkEnd w:id="17"/>
-    <w:bookmarkStart w:id="46" w:name="phần-1--local-llm-với-ollama"/>
+    <w:bookmarkEnd w:id="18"/>
+    <w:bookmarkEnd w:id="19"/>
+    <w:bookmarkStart w:id="48" w:name="phần-1--local-llm-với-ollama"/>
     <w:p>
       <w:pPr>
         <w:pStyle w:val="Heading1"/>
@@ -2327,7 +2664,7 @@
         <w:t xml:space="preserve">Phần 1 — Local LLM với Ollama</w:t>
       </w:r>
     </w:p>
-    <w:bookmarkStart w:id="18" w:name="X4e45f15fad06c423e6d0e7f51c0f944306a6005"/>
+    <w:bookmarkStart w:id="20" w:name="X4e45f15fad06c423e6d0e7f51c0f944306a6005"/>
     <w:p>
       <w:pPr>
         <w:pStyle w:val="Heading2"/>
@@ -2628,8 +2965,8 @@
         <w:t xml:space="preserve">: model Q4 chiếm RAM ≈ (số tỷ tham số) × 0.7 GB. Đổi model = đổi 1 string, không cần cài lại gì.</w:t>
       </w:r>
     </w:p>
-    <w:bookmarkEnd w:id="18"/>
-    <w:bookmarkStart w:id="25" w:name="X4c1af9a3c7dc13306a73f8a49fff069954688ab"/>
+    <w:bookmarkEnd w:id="20"/>
+    <w:bookmarkStart w:id="27" w:name="X4c1af9a3c7dc13306a73f8a49fff069954688ab"/>
     <w:p>
       <w:pPr>
         <w:pStyle w:val="Heading2"/>
@@ -3078,7 +3415,7 @@
         <w:t xml:space="preserve">: Q4_K_M là tradeoff tốt nhất. Đây là default của Ollama khi pull model.</w:t>
       </w:r>
     </w:p>
-    <w:bookmarkStart w:id="23" w:name="gguf"/>
+    <w:bookmarkStart w:id="25" w:name="gguf"/>
     <w:p>
       <w:pPr>
         <w:pStyle w:val="Heading3"/>
@@ -3143,7 +3480,7 @@
       <w:r>
         <w:t xml:space="preserve"> </w:t>
       </w:r>
-      <w:hyperlink r:id="rId19">
+      <w:hyperlink r:id="rId21">
         <w:r>
           <w:rPr>
             <w:rStyle w:val="Hyperlink"/>
@@ -3184,7 +3521,7 @@
       <w:r>
         <w:t xml:space="preserve"> </w:t>
       </w:r>
-      <w:hyperlink r:id="rId20">
+      <w:hyperlink r:id="rId22">
         <w:r>
           <w:rPr>
             <w:rStyle w:val="Hyperlink"/>
@@ -3207,7 +3544,7 @@
       <w:r>
         <w:t xml:space="preserve"> </w:t>
       </w:r>
-      <w:hyperlink r:id="rId21">
+      <w:hyperlink r:id="rId23">
         <w:r>
           <w:rPr>
             <w:rStyle w:val="Hyperlink"/>
@@ -3230,7 +3567,7 @@
       <w:r>
         <w:t xml:space="preserve"> </w:t>
       </w:r>
-      <w:hyperlink r:id="rId22">
+      <w:hyperlink r:id="rId24">
         <w:r>
           <w:rPr>
             <w:rStyle w:val="Hyperlink"/>
@@ -3306,8 +3643,8 @@
         <w:t xml:space="preserve">là tự đủ để chạy. Khác với HuggingFace cần nhiều file (config.json, tokenizer.json, model.safetensors...).</w:t>
       </w:r>
     </w:p>
-    <w:bookmarkEnd w:id="23"/>
-    <w:bookmarkStart w:id="24" w:name="pull-format-khác-qua-ollama"/>
+    <w:bookmarkEnd w:id="25"/>
+    <w:bookmarkStart w:id="26" w:name="pull-format-khác-qua-ollama"/>
     <w:p>
       <w:pPr>
         <w:pStyle w:val="Heading3"/>
@@ -3393,9 +3730,9 @@
         </w:pict>
       </w:r>
     </w:p>
-    <w:bookmarkEnd w:id="24"/>
-    <w:bookmarkEnd w:id="25"/>
-    <w:bookmarkStart w:id="40" w:name="X61191f23be36f49179ade1a9e1de916be3c943b"/>
+    <w:bookmarkEnd w:id="26"/>
+    <w:bookmarkEnd w:id="27"/>
+    <w:bookmarkStart w:id="42" w:name="X61191f23be36f49179ade1a9e1de916be3c943b"/>
     <w:p>
       <w:pPr>
         <w:pStyle w:val="Heading2"/>
@@ -3404,7 +3741,7 @@
         <w:t xml:space="preserve">1.2 Bản đồ model open-source 2026</w:t>
       </w:r>
     </w:p>
-    <w:bookmarkStart w:id="32" w:name="top-model-tiếng-việt"/>
+    <w:bookmarkStart w:id="34" w:name="top-model-tiếng-việt"/>
     <w:p>
       <w:pPr>
         <w:pStyle w:val="Heading3"/>
@@ -3547,7 +3884,7 @@
             <w:pPr>
               <w:pStyle w:val="Compact"/>
             </w:pPr>
-            <w:hyperlink r:id="rId26">
+            <w:hyperlink r:id="rId28">
               <w:r>
                 <w:rPr>
                   <w:rStyle w:val="Hyperlink"/>
@@ -3619,7 +3956,7 @@
             <w:pPr>
               <w:pStyle w:val="Compact"/>
             </w:pPr>
-            <w:hyperlink r:id="rId27">
+            <w:hyperlink r:id="rId29">
               <w:r>
                 <w:rPr>
                   <w:rStyle w:val="Hyperlink"/>
@@ -3691,7 +4028,7 @@
             <w:pPr>
               <w:pStyle w:val="Compact"/>
             </w:pPr>
-            <w:hyperlink r:id="rId28">
+            <w:hyperlink r:id="rId30">
               <w:r>
                 <w:rPr>
                   <w:rStyle w:val="Hyperlink"/>
@@ -3763,7 +4100,7 @@
             <w:pPr>
               <w:pStyle w:val="Compact"/>
             </w:pPr>
-            <w:hyperlink r:id="rId29">
+            <w:hyperlink r:id="rId31">
               <w:r>
                 <w:rPr>
                   <w:rStyle w:val="Hyperlink"/>
@@ -3829,7 +4166,7 @@
             <w:pPr>
               <w:pStyle w:val="Compact"/>
             </w:pPr>
-            <w:hyperlink r:id="rId30">
+            <w:hyperlink r:id="rId32">
               <w:r>
                 <w:rPr>
                   <w:rStyle w:val="Hyperlink"/>
@@ -3901,7 +4238,7 @@
             <w:pPr>
               <w:pStyle w:val="Compact"/>
             </w:pPr>
-            <w:hyperlink r:id="rId31">
+            <w:hyperlink r:id="rId33">
               <w:r>
                 <w:rPr>
                   <w:rStyle w:val="Hyperlink"/>
@@ -3913,8 +4250,8 @@
         </w:tc>
       </w:tr>
     </w:tbl>
-    <w:bookmarkEnd w:id="32"/>
-    <w:bookmarkStart w:id="33" w:name="quy-tắc-chọn-model-theo-use-case"/>
+    <w:bookmarkEnd w:id="34"/>
+    <w:bookmarkStart w:id="35" w:name="quy-tắc-chọn-model-theo-use-case"/>
     <w:p>
       <w:pPr>
         <w:pStyle w:val="Heading3"/>
@@ -4205,8 +4542,8 @@
         </w:tc>
       </w:tr>
     </w:tbl>
-    <w:bookmarkEnd w:id="33"/>
-    <w:bookmarkStart w:id="39" w:name="embedding-model"/>
+    <w:bookmarkEnd w:id="35"/>
+    <w:bookmarkStart w:id="41" w:name="embedding-model"/>
     <w:p>
       <w:pPr>
         <w:pStyle w:val="Heading3"/>
@@ -4343,7 +4680,7 @@
             <w:pPr>
               <w:pStyle w:val="Compact"/>
             </w:pPr>
-            <w:hyperlink r:id="rId34">
+            <w:hyperlink r:id="rId36">
               <w:r>
                 <w:rPr>
                   <w:rStyle w:val="Hyperlink"/>
@@ -4419,7 +4756,7 @@
             <w:pPr>
               <w:pStyle w:val="Compact"/>
             </w:pPr>
-            <w:hyperlink r:id="rId35">
+            <w:hyperlink r:id="rId37">
               <w:r>
                 <w:rPr>
                   <w:rStyle w:val="Hyperlink"/>
@@ -4485,7 +4822,7 @@
             <w:pPr>
               <w:pStyle w:val="Compact"/>
             </w:pPr>
-            <w:hyperlink r:id="rId36">
+            <w:hyperlink r:id="rId38">
               <w:r>
                 <w:rPr>
                   <w:rStyle w:val="Hyperlink"/>
@@ -4551,7 +4888,7 @@
             <w:pPr>
               <w:pStyle w:val="Compact"/>
             </w:pPr>
-            <w:hyperlink r:id="rId37">
+            <w:hyperlink r:id="rId39">
               <w:r>
                 <w:rPr>
                   <w:rStyle w:val="Hyperlink"/>
@@ -4583,7 +4920,7 @@
       <w:r>
         <w:t xml:space="preserve"> </w:t>
       </w:r>
-      <w:hyperlink r:id="rId38">
+      <w:hyperlink r:id="rId40">
         <w:r>
           <w:rPr>
             <w:rStyle w:val="Hyperlink"/>
@@ -4639,9 +4976,9 @@
         </w:pict>
       </w:r>
     </w:p>
-    <w:bookmarkEnd w:id="39"/>
-    <w:bookmarkEnd w:id="40"/>
-    <w:bookmarkStart w:id="42" w:name="Xaa380b74f4e52c703e1665b7412e6ba78b3df8c"/>
+    <w:bookmarkEnd w:id="41"/>
+    <w:bookmarkEnd w:id="42"/>
+    <w:bookmarkStart w:id="44" w:name="Xaa380b74f4e52c703e1665b7412e6ba78b3df8c"/>
     <w:p>
       <w:pPr>
         <w:pStyle w:val="Heading2"/>
@@ -4868,135 +5205,6 @@
       </w:r>
       <w:r>
         <w:t xml:space="preserve">cho few-shot) — đọc khi cần ở</w:t>
-      </w:r>
-      <w:r>
-        <w:t xml:space="preserve"> </w:t>
-      </w:r>
-      <w:hyperlink r:id="rId41">
-        <w:r>
-          <w:rPr>
-            <w:rStyle w:val="Hyperlink"/>
-          </w:rPr>
-          <w:t xml:space="preserve">docs Ollama</w:t>
-        </w:r>
-      </w:hyperlink>
-      <w:r>
-        <w:t xml:space="preserve">.</w:t>
-      </w:r>
-    </w:p>
-    <w:p>
-      <w:r>
-        <w:pict>
-          <v:rect style="width:0;height:1.5pt" o:hralign="center" o:hrstd="t" o:hr="t"/>
-        </w:pict>
-      </w:r>
-    </w:p>
-    <w:bookmarkEnd w:id="42"/>
-    <w:bookmarkStart w:id="44" w:name="Xe7186a4275e0be6d07958d3d1e0c651f692b486"/>
-    <w:p>
-      <w:pPr>
-        <w:pStyle w:val="Heading2"/>
-      </w:pPr>
-      <w:r>
-        <w:t xml:space="preserve">1.4 Tốc độ &amp; vài tinh chỉnh</w:t>
-      </w:r>
-    </w:p>
-    <w:p>
-      <w:pPr>
-        <w:pStyle w:val="FirstParagraph"/>
-      </w:pPr>
-      <w:r>
-        <w:rPr>
-          <w:b/>
-          <w:bCs/>
-        </w:rPr>
-        <w:t xml:space="preserve">Đo tốc độ</w:t>
-      </w:r>
-      <w:r>
-        <w:t xml:space="preserve">: chạy</w:t>
-      </w:r>
-      <w:r>
-        <w:t xml:space="preserve"> </w:t>
-      </w:r>
-      <w:r>
-        <w:rPr>
-          <w:rStyle w:val="VerbatimChar"/>
-        </w:rPr>
-        <w:t xml:space="preserve">ollama run qwen3:1.7b --verbose</w:t>
-      </w:r>
-      <w:r>
-        <w:t xml:space="preserve"> </w:t>
-      </w:r>
-      <w:r>
-        <w:t xml:space="preserve">→ Ollama in số tok/s.</w:t>
-      </w:r>
-    </w:p>
-    <w:p>
-      <w:pPr>
-        <w:pStyle w:val="BodyText"/>
-      </w:pPr>
-      <w:r>
-        <w:t xml:space="preserve">Tốc độ tham khảo:</w:t>
-      </w:r>
-      <w:r>
-        <w:t xml:space="preserve"> </w:t>
-      </w:r>
-      <w:r>
-        <w:t xml:space="preserve">| Máy | qwen3:1.7b |</w:t>
-      </w:r>
-      <w:r>
-        <w:t xml:space="preserve"> </w:t>
-      </w:r>
-      <w:r>
-        <w:t xml:space="preserve">|---|---|</w:t>
-      </w:r>
-      <w:r>
-        <w:t xml:space="preserve"> </w:t>
-      </w:r>
-      <w:r>
-        <w:t xml:space="preserve">| M1/M2 Mac (Metal) | 50-90 tok/s |</w:t>
-      </w:r>
-      <w:r>
-        <w:t xml:space="preserve"> </w:t>
-      </w:r>
-      <w:r>
-        <w:t xml:space="preserve">| RTX 3060 (GPU) | 80-120 tok/s |</w:t>
-      </w:r>
-      <w:r>
-        <w:t xml:space="preserve"> </w:t>
-      </w:r>
-      <w:r>
-        <w:t xml:space="preserve">| Intel i5 (CPU only) | 50-73 tok/s |</w:t>
-      </w:r>
-    </w:p>
-    <w:p>
-      <w:pPr>
-        <w:pStyle w:val="BodyText"/>
-      </w:pPr>
-      <w:r>
-        <w:rPr>
-          <w:b/>
-          <w:bCs/>
-        </w:rPr>
-        <w:t xml:space="preserve">Tinh chỉnh hay dùng</w:t>
-      </w:r>
-      <w:r>
-        <w:t xml:space="preserve">: đặt</w:t>
-      </w:r>
-      <w:r>
-        <w:t xml:space="preserve"> </w:t>
-      </w:r>
-      <w:r>
-        <w:rPr>
-          <w:rStyle w:val="VerbatimChar"/>
-        </w:rPr>
-        <w:t xml:space="preserve">OLLAMA_KEEP_ALIVE=30m</w:t>
-      </w:r>
-      <w:r>
-        <w:t xml:space="preserve"> </w:t>
-      </w:r>
-      <w:r>
-        <w:t xml:space="preserve">để model không bị unload giữa các câu hỏi (đỡ chờ load lại). Các biến môi trường khác (số GPU layer, parallel request...) chỉ cần khi vận hành server nhiều user — xem</w:t>
       </w:r>
       <w:r>
         <w:t xml:space="preserve"> </w:t>
@@ -5013,8 +5221,137 @@
         <w:t xml:space="preserve">.</w:t>
       </w:r>
     </w:p>
+    <w:p>
+      <w:r>
+        <w:pict>
+          <v:rect style="width:0;height:1.5pt" o:hralign="center" o:hrstd="t" o:hr="t"/>
+        </w:pict>
+      </w:r>
+    </w:p>
     <w:bookmarkEnd w:id="44"/>
-    <w:bookmarkStart w:id="45" w:name="X72fc266a9aed7f6c40549f6c9b6524e067512be"/>
+    <w:bookmarkStart w:id="46" w:name="Xe7186a4275e0be6d07958d3d1e0c651f692b486"/>
+    <w:p>
+      <w:pPr>
+        <w:pStyle w:val="Heading2"/>
+      </w:pPr>
+      <w:r>
+        <w:t xml:space="preserve">1.4 Tốc độ &amp; vài tinh chỉnh</w:t>
+      </w:r>
+    </w:p>
+    <w:p>
+      <w:pPr>
+        <w:pStyle w:val="FirstParagraph"/>
+      </w:pPr>
+      <w:r>
+        <w:rPr>
+          <w:b/>
+          <w:bCs/>
+        </w:rPr>
+        <w:t xml:space="preserve">Đo tốc độ</w:t>
+      </w:r>
+      <w:r>
+        <w:t xml:space="preserve">: chạy</w:t>
+      </w:r>
+      <w:r>
+        <w:t xml:space="preserve"> </w:t>
+      </w:r>
+      <w:r>
+        <w:rPr>
+          <w:rStyle w:val="VerbatimChar"/>
+        </w:rPr>
+        <w:t xml:space="preserve">ollama run qwen3:1.7b --verbose</w:t>
+      </w:r>
+      <w:r>
+        <w:t xml:space="preserve"> </w:t>
+      </w:r>
+      <w:r>
+        <w:t xml:space="preserve">→ Ollama in số tok/s.</w:t>
+      </w:r>
+    </w:p>
+    <w:p>
+      <w:pPr>
+        <w:pStyle w:val="BodyText"/>
+      </w:pPr>
+      <w:r>
+        <w:t xml:space="preserve">Tốc độ tham khảo:</w:t>
+      </w:r>
+      <w:r>
+        <w:t xml:space="preserve"> </w:t>
+      </w:r>
+      <w:r>
+        <w:t xml:space="preserve">| Máy | qwen3:1.7b |</w:t>
+      </w:r>
+      <w:r>
+        <w:t xml:space="preserve"> </w:t>
+      </w:r>
+      <w:r>
+        <w:t xml:space="preserve">|---|---|</w:t>
+      </w:r>
+      <w:r>
+        <w:t xml:space="preserve"> </w:t>
+      </w:r>
+      <w:r>
+        <w:t xml:space="preserve">| M1/M2 Mac (Metal) | 50-90 tok/s |</w:t>
+      </w:r>
+      <w:r>
+        <w:t xml:space="preserve"> </w:t>
+      </w:r>
+      <w:r>
+        <w:t xml:space="preserve">| RTX 3060 (GPU) | 80-120 tok/s |</w:t>
+      </w:r>
+      <w:r>
+        <w:t xml:space="preserve"> </w:t>
+      </w:r>
+      <w:r>
+        <w:t xml:space="preserve">| Intel i5 (CPU only) | 50-73 tok/s |</w:t>
+      </w:r>
+    </w:p>
+    <w:p>
+      <w:pPr>
+        <w:pStyle w:val="BodyText"/>
+      </w:pPr>
+      <w:r>
+        <w:rPr>
+          <w:b/>
+          <w:bCs/>
+        </w:rPr>
+        <w:t xml:space="preserve">Tinh chỉnh hay dùng</w:t>
+      </w:r>
+      <w:r>
+        <w:t xml:space="preserve">: đặt</w:t>
+      </w:r>
+      <w:r>
+        <w:t xml:space="preserve"> </w:t>
+      </w:r>
+      <w:r>
+        <w:rPr>
+          <w:rStyle w:val="VerbatimChar"/>
+        </w:rPr>
+        <w:t xml:space="preserve">OLLAMA_KEEP_ALIVE=30m</w:t>
+      </w:r>
+      <w:r>
+        <w:t xml:space="preserve"> </w:t>
+      </w:r>
+      <w:r>
+        <w:t xml:space="preserve">để model không bị unload giữa các câu hỏi (đỡ chờ load lại). Các biến môi trường khác (số GPU layer, parallel request...) chỉ cần khi vận hành server nhiều user — xem</w:t>
+      </w:r>
+      <w:r>
+        <w:t xml:space="preserve"> </w:t>
+      </w:r>
+      <w:hyperlink r:id="rId45">
+        <w:r>
+          <w:rPr>
+            <w:rStyle w:val="Hyperlink"/>
+          </w:rPr>
+          <w:t xml:space="preserve">docs Ollama</w:t>
+        </w:r>
+      </w:hyperlink>
+      <w:r>
+        <w:t xml:space="preserve">.</w:t>
+      </w:r>
+    </w:p>
+    <w:bookmarkEnd w:id="46"/>
+    <w:bookmarkStart w:id="47" w:name="X72fc266a9aed7f6c40549f6c9b6524e067512be"/>
     <w:p>
       <w:pPr>
         <w:pStyle w:val="Heading2"/>
@@ -5117,9 +5454,9 @@
         </w:pict>
       </w:r>
     </w:p>
-    <w:bookmarkEnd w:id="45"/>
-    <w:bookmarkEnd w:id="46"/>
-    <w:bookmarkStart w:id="80" w:name="phần-2--rag"/>
+    <w:bookmarkEnd w:id="47"/>
+    <w:bookmarkEnd w:id="48"/>
+    <w:bookmarkStart w:id="82" w:name="phần-2--rag"/>
     <w:p>
       <w:pPr>
         <w:pStyle w:val="Heading1"/>
@@ -5207,7 +5544,7 @@
         <w:t xml:space="preserve">eneration (sinh câu trả lời).</w:t>
       </w:r>
     </w:p>
-    <w:bookmarkStart w:id="51" w:name="X858a42b5903a2c2125896665808b076d9063b35"/>
+    <w:bookmarkStart w:id="53" w:name="X858a42b5903a2c2125896665808b076d9063b35"/>
     <w:p>
       <w:pPr>
         <w:pStyle w:val="Heading2"/>
@@ -5319,7 +5656,7 @@
         <w:t xml:space="preserve">Nhờ vậy máy "so sánh nghĩa" được, không chỉ so từ khoá. Hỏi "reset mật khẩu" vẫn tìm ra tài liệu ghi "đổi mật khẩu".</w:t>
       </w:r>
     </w:p>
-    <w:bookmarkStart w:id="47" w:name="cosine-similarity--thước-đo-độ-gần"/>
+    <w:bookmarkStart w:id="49" w:name="cosine-similarity--thước-đo-độ-gần"/>
     <w:p>
       <w:pPr>
         <w:pStyle w:val="Heading3"/>
@@ -5474,8 +5811,8 @@
         <w:t xml:space="preserve">.</w:t>
       </w:r>
     </w:p>
-    <w:bookmarkEnd w:id="47"/>
-    <w:bookmarkStart w:id="48" w:name="số-chiều-của-vector"/>
+    <w:bookmarkEnd w:id="49"/>
+    <w:bookmarkStart w:id="50" w:name="số-chiều-của-vector"/>
     <w:p>
       <w:pPr>
         <w:pStyle w:val="Heading3"/>
@@ -5516,8 +5853,8 @@
         <w:t xml:space="preserve">cho 1024 số — nhiều chiều hơn để phân biệt nhiều sắc thái nghĩa hơn. bge-m3 chỉ tốt hơn nomic ~5-10% trên tiếng Việt, nhưng nặng hơn 4× (1.2 GB vs 274 MB).</w:t>
       </w:r>
     </w:p>
-    <w:bookmarkEnd w:id="48"/>
-    <w:bookmarkStart w:id="49" w:name="thử-trực-quan"/>
+    <w:bookmarkEnd w:id="50"/>
+    <w:bookmarkStart w:id="51" w:name="thử-trực-quan"/>
     <w:p>
       <w:pPr>
         <w:pStyle w:val="Heading3"/>
@@ -5968,8 +6305,8 @@
         <w:t xml:space="preserve">được embedding làm gì.</w:t>
       </w:r>
     </w:p>
-    <w:bookmarkEnd w:id="49"/>
-    <w:bookmarkStart w:id="50" w:name="embedding-multilingual"/>
+    <w:bookmarkEnd w:id="51"/>
+    <w:bookmarkStart w:id="52" w:name="embedding-multilingual"/>
     <w:p>
       <w:pPr>
         <w:pStyle w:val="Heading3"/>
@@ -6057,9 +6394,9 @@
         </w:pict>
       </w:r>
     </w:p>
-    <w:bookmarkEnd w:id="50"/>
-    <w:bookmarkEnd w:id="51"/>
-    <w:bookmarkStart w:id="59" w:name="X1e4793ffa842ad68eea0791c9d3dc203905eafa"/>
+    <w:bookmarkEnd w:id="52"/>
+    <w:bookmarkEnd w:id="53"/>
+    <w:bookmarkStart w:id="61" w:name="X1e4793ffa842ad68eea0791c9d3dc203905eafa"/>
     <w:p>
       <w:pPr>
         <w:pStyle w:val="Heading2"/>
@@ -6107,7 +6444,7 @@
         <w:t xml:space="preserve">: cần hiểu vậy là đủ. 5 chiến lược code bên dưới dành cho ai muốn tự cài — bỏ qua không sao. Workshop dùng cách 1 (fixed-size) và cách 4 (theo heading).</w:t>
       </w:r>
     </w:p>
-    <w:bookmarkStart w:id="52" w:name="X154b65cabb2b923fc7a54493fe479788218cee9"/>
+    <w:bookmarkStart w:id="54" w:name="X154b65cabb2b923fc7a54493fe479788218cee9"/>
     <w:p>
       <w:pPr>
         <w:pStyle w:val="Heading3"/>
@@ -6373,8 +6710,8 @@
         <w:t xml:space="preserve">: dataset đồng nhất, không quan trọng cấu trúc.</w:t>
       </w:r>
     </w:p>
-    <w:bookmarkEnd w:id="52"/>
-    <w:bookmarkStart w:id="53" w:name="X79f0b81e7b5fee9453337440e987879c9accfd1"/>
+    <w:bookmarkEnd w:id="54"/>
+    <w:bookmarkStart w:id="55" w:name="X79f0b81e7b5fee9453337440e987879c9accfd1"/>
     <w:p>
       <w:pPr>
         <w:pStyle w:val="Heading3"/>
@@ -7209,8 +7546,8 @@
         <w:t xml:space="preserve">: tài liệu có cấu trúc đoạn rõ (như Markdown, văn bản hành chính).</w:t>
       </w:r>
     </w:p>
-    <w:bookmarkEnd w:id="53"/>
-    <w:bookmarkStart w:id="54" w:name="Xe2eaa95bc79f7f4204cc916fef25d7cce8d7cb6"/>
+    <w:bookmarkEnd w:id="55"/>
+    <w:bookmarkStart w:id="56" w:name="Xe2eaa95bc79f7f4204cc916fef25d7cce8d7cb6"/>
     <w:p>
       <w:pPr>
         <w:pStyle w:val="Heading3"/>
@@ -7722,8 +8059,8 @@
         <w:t xml:space="preserve">: tốn embedding cost, chậm hơn 5-10x.</w:t>
       </w:r>
     </w:p>
-    <w:bookmarkEnd w:id="54"/>
-    <w:bookmarkStart w:id="55" w:name="X485eb91e81efe48d2f4b736b5dbec3fedf1da9b"/>
+    <w:bookmarkEnd w:id="56"/>
+    <w:bookmarkStart w:id="57" w:name="X485eb91e81efe48d2f4b736b5dbec3fedf1da9b"/>
     <w:p>
       <w:pPr>
         <w:pStyle w:val="Heading3"/>
@@ -7991,8 +8328,8 @@
         <w:t xml:space="preserve">: tài liệu Markdown có cấu trúc heading (như dataset trong workshop này).</w:t>
       </w:r>
     </w:p>
-    <w:bookmarkEnd w:id="55"/>
-    <w:bookmarkStart w:id="57" w:name="X5758b040aac3fc60058540a52f138a9ac404fce"/>
+    <w:bookmarkEnd w:id="57"/>
+    <w:bookmarkStart w:id="59" w:name="X5758b040aac3fc60058540a52f138a9ac404fce"/>
     <w:p>
       <w:pPr>
         <w:pStyle w:val="Heading3"/>
@@ -8011,7 +8348,7 @@
       <w:r>
         <w:t xml:space="preserve"> </w:t>
       </w:r>
-      <w:hyperlink r:id="rId56">
+      <w:hyperlink r:id="rId58">
         <w:r>
           <w:rPr>
             <w:rStyle w:val="Hyperlink"/>
@@ -8023,8 +8360,8 @@
         <w:t xml:space="preserve">.</w:t>
       </w:r>
     </w:p>
-    <w:bookmarkEnd w:id="57"/>
-    <w:bookmarkStart w:id="58" w:name="quy-tắc-chọn-nhanh"/>
+    <w:bookmarkEnd w:id="59"/>
+    <w:bookmarkStart w:id="60" w:name="quy-tắc-chọn-nhanh"/>
     <w:p>
       <w:pPr>
         <w:pStyle w:val="Heading3"/>
@@ -8096,9 +8433,9 @@
         </w:pict>
       </w:r>
     </w:p>
-    <w:bookmarkEnd w:id="58"/>
-    <w:bookmarkEnd w:id="59"/>
-    <w:bookmarkStart w:id="60" w:name="X69c71c88a388d67b9b3099f8a8bfead677e4ba8"/>
+    <w:bookmarkEnd w:id="60"/>
+    <w:bookmarkEnd w:id="61"/>
+    <w:bookmarkStart w:id="62" w:name="X69c71c88a388d67b9b3099f8a8bfead677e4ba8"/>
     <w:p>
       <w:pPr>
         <w:pStyle w:val="Heading2"/>
@@ -8194,8 +8531,8 @@
         </w:pict>
       </w:r>
     </w:p>
-    <w:bookmarkEnd w:id="60"/>
-    <w:bookmarkStart w:id="67" w:name="Xdf03a4d45d3d3e00d297412dad54956da1a1780"/>
+    <w:bookmarkEnd w:id="62"/>
+    <w:bookmarkStart w:id="69" w:name="Xdf03a4d45d3d3e00d297412dad54956da1a1780"/>
     <w:p>
       <w:pPr>
         <w:pStyle w:val="Heading2"/>
@@ -8213,18 +8550,18 @@
           <wp:inline>
             <wp:extent cx="5334000" cy="2484120"/>
             <wp:effectExtent b="0" l="0" r="0" t="0"/>
-            <wp:docPr descr="Hình 10. Output thực tế của python rag_minimal.py: retrieve top-3 + sinh câu trả lời có trích nguồn" title="" id="62" name="Picture"/>
+            <wp:docPr descr="Hình 10. Output thực tế của python rag_minimal.py: retrieve top-3 + sinh câu trả lời có trích nguồn" title="" id="64" name="Picture"/>
             <a:graphic>
               <a:graphicData uri="http://schemas.openxmlformats.org/drawingml/2006/picture">
                 <pic:pic>
                   <pic:nvPicPr>
-                    <pic:cNvPr descr="screenshots/terminal_rag_query.png" id="63" name="Picture"/>
+                    <pic:cNvPr descr="screenshots/terminal_rag_query.png" id="65" name="Picture"/>
                     <pic:cNvPicPr>
                       <a:picLocks noChangeArrowheads="1" noChangeAspect="1"/>
                     </pic:cNvPicPr>
                   </pic:nvPicPr>
                   <pic:blipFill>
-                    <a:blip r:embed="rId61"/>
+                    <a:blip r:embed="rId63"/>
                     <a:stretch>
                       <a:fillRect/>
                     </a:stretch>
@@ -8263,7 +8600,7 @@
         <w:t xml:space="preserve">Hình 10. Output thực tế của python rag_minimal.py: retrieve top-3 + sinh câu trả lời có trích nguồn</w:t>
       </w:r>
     </w:p>
-    <w:bookmarkStart w:id="64" w:name="template-cơ-bản-đã-dùng"/>
+    <w:bookmarkStart w:id="66" w:name="template-cơ-bản-đã-dùng"/>
     <w:p>
       <w:pPr>
         <w:pStyle w:val="Heading3"/>
@@ -8316,8 +8653,8 @@
         <w:t xml:space="preserve">Trả lời ngắn gọn, trích nguồn:</w:t>
       </w:r>
     </w:p>
-    <w:bookmarkEnd w:id="64"/>
-    <w:bookmarkStart w:id="65" w:name="template-nâng-cao-production"/>
+    <w:bookmarkEnd w:id="66"/>
+    <w:bookmarkStart w:id="67" w:name="template-nâng-cao-production"/>
     <w:p>
       <w:pPr>
         <w:pStyle w:val="Heading3"/>
@@ -8505,8 +8842,8 @@
         <w:t xml:space="preserve">=== TRẢ LỜI ===</w:t>
       </w:r>
     </w:p>
-    <w:bookmarkEnd w:id="65"/>
-    <w:bookmarkStart w:id="66" w:name="Xbe4a7e14f79878d680dbc8d3997d69a8fa3b098"/>
+    <w:bookmarkEnd w:id="67"/>
+    <w:bookmarkStart w:id="68" w:name="Xbe4a7e14f79878d680dbc8d3997d69a8fa3b098"/>
     <w:p>
       <w:pPr>
         <w:pStyle w:val="Heading3"/>
@@ -8587,9 +8924,9 @@
         </w:pict>
       </w:r>
     </w:p>
-    <w:bookmarkEnd w:id="66"/>
-    <w:bookmarkEnd w:id="67"/>
-    <w:bookmarkStart w:id="70" w:name="X88ff20a64e6f7bccb90ebe43c8a02a4f359c60e"/>
+    <w:bookmarkEnd w:id="68"/>
+    <w:bookmarkEnd w:id="69"/>
+    <w:bookmarkStart w:id="72" w:name="X88ff20a64e6f7bccb90ebe43c8a02a4f359c60e"/>
     <w:p>
       <w:pPr>
         <w:pStyle w:val="Heading2"/>
@@ -8649,7 +8986,7 @@
       <w:r>
         <w:t xml:space="preserve">(</w:t>
       </w:r>
-      <w:hyperlink r:id="rId68">
+      <w:hyperlink r:id="rId70">
         <w:r>
           <w:rPr>
             <w:rStyle w:val="Hyperlink"/>
@@ -8693,7 +9030,7 @@
         <w:t xml:space="preserve">(đúng câu hỏi không).</w:t>
       </w:r>
     </w:p>
-    <w:bookmarkStart w:id="69" w:name="bộ-câu-hỏi-mẫu-trên-workshop-dataset"/>
+    <w:bookmarkStart w:id="71" w:name="bộ-câu-hỏi-mẫu-trên-workshop-dataset"/>
     <w:p>
       <w:pPr>
         <w:pStyle w:val="Heading3"/>
@@ -9362,9 +9699,9 @@
         </w:pict>
       </w:r>
     </w:p>
-    <w:bookmarkEnd w:id="69"/>
-    <w:bookmarkEnd w:id="70"/>
-    <w:bookmarkStart w:id="79" w:name="X9fb2b2f252eb3dd33fd4c5868a7e0e01500d130"/>
+    <w:bookmarkEnd w:id="71"/>
+    <w:bookmarkEnd w:id="72"/>
+    <w:bookmarkStart w:id="81" w:name="X9fb2b2f252eb3dd33fd4c5868a7e0e01500d130"/>
     <w:p>
       <w:pPr>
         <w:pStyle w:val="Heading2"/>
@@ -9382,18 +9719,18 @@
           <wp:inline>
             <wp:extent cx="5334000" cy="498504"/>
             <wp:effectExtent b="0" l="0" r="0" t="0"/>
-            <wp:docPr descr="Hình 8. 4 rủi ro RAG + 4 rủi ro Agent — chiến lược defend khác nhau" title="" id="72" name="Picture"/>
+            <wp:docPr descr="Hình 8. 4 rủi ro RAG + 4 rủi ro Agent — chiến lược defend khác nhau" title="" id="74" name="Picture"/>
             <a:graphic>
               <a:graphicData uri="http://schemas.openxmlformats.org/drawingml/2006/picture">
                 <pic:pic>
                   <pic:nvPicPr>
-                    <pic:cNvPr descr="diagrams/08_security_risks.png" id="73" name="Picture"/>
+                    <pic:cNvPr descr="diagrams/08_security_risks.png" id="75" name="Picture"/>
                     <pic:cNvPicPr>
                       <a:picLocks noChangeArrowheads="1" noChangeAspect="1"/>
                     </pic:cNvPicPr>
                   </pic:nvPicPr>
                   <pic:blipFill>
-                    <a:blip r:embed="rId71"/>
+                    <a:blip r:embed="rId73"/>
                     <a:stretch>
                       <a:fillRect/>
                     </a:stretch>
@@ -9432,7 +9769,7 @@
         <w:t xml:space="preserve">Hình 8. 4 rủi ro RAG + 4 rủi ro Agent — chiến lược defend khác nhau</w:t>
       </w:r>
     </w:p>
-    <w:bookmarkStart w:id="74" w:name="X6a43e8eece8bba6232a625d150573114b2f16dc"/>
+    <w:bookmarkStart w:id="76" w:name="X6a43e8eece8bba6232a625d150573114b2f16dc"/>
     <w:p>
       <w:pPr>
         <w:pStyle w:val="Heading3"/>
@@ -9719,8 +10056,8 @@
         <w:t xml:space="preserve">Build lại, hỏi câu thường, xem có bị lừa không.</w:t>
       </w:r>
     </w:p>
-    <w:bookmarkEnd w:id="74"/>
-    <w:bookmarkStart w:id="77" w:name="X3f4287fe2a861d2f61670654fbe2ebfe30e499b"/>
+    <w:bookmarkEnd w:id="76"/>
+    <w:bookmarkStart w:id="79" w:name="X3f4287fe2a861d2f61670654fbe2ebfe30e499b"/>
     <w:p>
       <w:pPr>
         <w:pStyle w:val="Heading3"/>
@@ -9793,7 +10130,7 @@
       <w:r>
         <w:t xml:space="preserve"> </w:t>
       </w:r>
-      <w:hyperlink r:id="rId75">
+      <w:hyperlink r:id="rId77">
         <w:r>
           <w:rPr>
             <w:rStyle w:val="Hyperlink"/>
@@ -9856,7 +10193,7 @@
       <w:r>
         <w:t xml:space="preserve"> </w:t>
       </w:r>
-      <w:hyperlink r:id="rId76">
+      <w:hyperlink r:id="rId78">
         <w:r>
           <w:rPr>
             <w:rStyle w:val="Hyperlink"/>
@@ -10233,8 +10570,8 @@
         <w:t xml:space="preserve">: vector DB chỉ access từ application layer, không expose</w:t>
       </w:r>
     </w:p>
-    <w:bookmarkEnd w:id="77"/>
-    <w:bookmarkStart w:id="78" w:name="X61d51441f34a6508211fdbf461659dc83102c2a"/>
+    <w:bookmarkEnd w:id="79"/>
+    <w:bookmarkStart w:id="80" w:name="X61d51441f34a6508211fdbf461659dc83102c2a"/>
     <w:p>
       <w:pPr>
         <w:pStyle w:val="Heading3"/>
@@ -10508,10 +10845,10 @@
         </w:pict>
       </w:r>
     </w:p>
-    <w:bookmarkEnd w:id="78"/>
-    <w:bookmarkEnd w:id="79"/>
     <w:bookmarkEnd w:id="80"/>
-    <w:bookmarkStart w:id="104" w:name="phần-3--agent"/>
+    <w:bookmarkEnd w:id="81"/>
+    <w:bookmarkEnd w:id="82"/>
+    <w:bookmarkStart w:id="106" w:name="phần-3--agent"/>
     <w:p>
       <w:pPr>
         <w:pStyle w:val="Heading1"/>
@@ -10614,7 +10951,7 @@
         <w:t xml:space="preserve">→ thấy "mưa" → trả lời "nên mang ô".</w:t>
       </w:r>
     </w:p>
-    <w:bookmarkStart w:id="86" w:name="X8b7832a5e45adcdf46a603744966a234e7eb00d"/>
+    <w:bookmarkStart w:id="88" w:name="X8b7832a5e45adcdf46a603744966a234e7eb00d"/>
     <w:p>
       <w:pPr>
         <w:pStyle w:val="Heading2"/>
@@ -10656,7 +10993,7 @@
       <w:r>
         <w:t xml:space="preserve"> </w:t>
       </w:r>
-      <w:hyperlink r:id="rId81">
+      <w:hyperlink r:id="rId83">
         <w:r>
           <w:rPr>
             <w:rStyle w:val="Hyperlink"/>
@@ -10761,7 +11098,7 @@
         <w:t xml:space="preserve">: mỗi bước là 1 LLM call → chậm nếu nhiều bước. Đây là pattern workshop dùng.</w:t>
       </w:r>
     </w:p>
-    <w:bookmarkStart w:id="85" w:name="các-pattern-khác-đọc-khi-cần"/>
+    <w:bookmarkStart w:id="87" w:name="các-pattern-khác-đọc-khi-cần"/>
     <w:p>
       <w:pPr>
         <w:pStyle w:val="Heading3"/>
@@ -10829,7 +11166,7 @@
       <w:r>
         <w:t xml:space="preserve"> </w:t>
       </w:r>
-      <w:hyperlink r:id="rId82">
+      <w:hyperlink r:id="rId84">
         <w:r>
           <w:rPr>
             <w:rStyle w:val="Hyperlink"/>
@@ -10843,7 +11180,7 @@
       <w:r>
         <w:t xml:space="preserve"> </w:t>
       </w:r>
-      <w:hyperlink r:id="rId83">
+      <w:hyperlink r:id="rId85">
         <w:r>
           <w:rPr>
             <w:rStyle w:val="Hyperlink"/>
@@ -10857,7 +11194,7 @@
       <w:r>
         <w:t xml:space="preserve"> </w:t>
       </w:r>
-      <w:hyperlink r:id="rId84">
+      <w:hyperlink r:id="rId86">
         <w:r>
           <w:rPr>
             <w:rStyle w:val="Hyperlink"/>
@@ -10910,9 +11247,9 @@
         </w:pict>
       </w:r>
     </w:p>
-    <w:bookmarkEnd w:id="85"/>
-    <w:bookmarkEnd w:id="86"/>
-    <w:bookmarkStart w:id="92" w:name="X17a3205b0b44aa435531b02cac684e0493030e8"/>
+    <w:bookmarkEnd w:id="87"/>
+    <w:bookmarkEnd w:id="88"/>
+    <w:bookmarkStart w:id="94" w:name="X17a3205b0b44aa435531b02cac684e0493030e8"/>
     <w:p>
       <w:pPr>
         <w:pStyle w:val="Heading2"/>
@@ -10984,7 +11321,7 @@
         <w:t xml:space="preserve">và đưa kết quả lại cho LLM.</w:t>
       </w:r>
     </w:p>
-    <w:bookmarkStart w:id="87" w:name="format-json-schema"/>
+    <w:bookmarkStart w:id="89" w:name="format-json-schema"/>
     <w:p>
       <w:pPr>
         <w:pStyle w:val="Heading3"/>
@@ -11407,8 +11744,8 @@
         <w:t xml:space="preserve">Pydantic AI tự sinh schema này từ type hints + docstring — đó là lý do docstring quan trọng.</w:t>
       </w:r>
     </w:p>
-    <w:bookmarkEnd w:id="87"/>
-    <w:bookmarkStart w:id="88" w:name="llm-sinh-tool-call"/>
+    <w:bookmarkEnd w:id="89"/>
+    <w:bookmarkStart w:id="90" w:name="llm-sinh-tool-call"/>
     <w:p>
       <w:pPr>
         <w:pStyle w:val="Heading3"/>
@@ -11499,8 +11836,8 @@
         <w:t xml:space="preserve">LLM tiếp tục sinh response (có thể gọi tool khác hoặc trả lời cuối).</w:t>
       </w:r>
     </w:p>
-    <w:bookmarkEnd w:id="88"/>
-    <w:bookmarkStart w:id="89" w:name="X8cd1571356d34a1540462600b1ebacac5d40c95"/>
+    <w:bookmarkEnd w:id="90"/>
+    <w:bookmarkStart w:id="91" w:name="X8cd1571356d34a1540462600b1ebacac5d40c95"/>
     <w:p>
       <w:pPr>
         <w:pStyle w:val="Heading3"/>
@@ -11636,8 +11973,8 @@
         <w:t xml:space="preserve">trở lên.</w:t>
       </w:r>
     </w:p>
-    <w:bookmarkEnd w:id="89"/>
-    <w:bookmarkStart w:id="90" w:name="kết-quả-agent-trên-workshop-dataset"/>
+    <w:bookmarkEnd w:id="91"/>
+    <w:bookmarkStart w:id="92" w:name="kết-quả-agent-trên-workshop-dataset"/>
     <w:p>
       <w:pPr>
         <w:pStyle w:val="Heading3"/>
@@ -12119,8 +12456,8 @@
         <w:t xml:space="preserve">: demo single-tool với 1.7b (chắc chắn work, nhanh). Multi-tool để học viên thử ở nhà với 4B trở lên.</w:t>
       </w:r>
     </w:p>
-    <w:bookmarkEnd w:id="90"/>
-    <w:bookmarkStart w:id="91" w:name="test-tool-calling-capability"/>
+    <w:bookmarkEnd w:id="92"/>
+    <w:bookmarkStart w:id="93" w:name="test-tool-calling-capability"/>
     <w:p>
       <w:pPr>
         <w:pStyle w:val="Heading3"/>
@@ -12635,9 +12972,9 @@
         </w:pict>
       </w:r>
     </w:p>
-    <w:bookmarkEnd w:id="91"/>
-    <w:bookmarkEnd w:id="92"/>
-    <w:bookmarkStart w:id="93" w:name="Xfd93ffb0ed539df602d2b54b97637c58d7a30df"/>
+    <w:bookmarkEnd w:id="93"/>
+    <w:bookmarkEnd w:id="94"/>
+    <w:bookmarkStart w:id="95" w:name="Xfd93ffb0ed539df602d2b54b97637c58d7a30df"/>
     <w:p>
       <w:pPr>
         <w:pStyle w:val="Heading2"/>
@@ -12733,8 +13070,8 @@
         </w:pict>
       </w:r>
     </w:p>
-    <w:bookmarkEnd w:id="93"/>
-    <w:bookmarkStart w:id="99" w:name="X3ab8509f6bc879f2c9dff26ad9bb91c565fd0bc"/>
+    <w:bookmarkEnd w:id="95"/>
+    <w:bookmarkStart w:id="101" w:name="X3ab8509f6bc879f2c9dff26ad9bb91c565fd0bc"/>
     <w:p>
       <w:pPr>
         <w:pStyle w:val="Heading2"/>
@@ -12752,18 +13089,18 @@
           <wp:inline>
             <wp:extent cx="5334000" cy="3658362"/>
             <wp:effectExtent b="0" l="0" r="0" t="0"/>
-            <wp:docPr descr="Hình 6. Kiến trúc MCP: tách tool thành server độc lập, mọi AI client đều dùng được" title="" id="95" name="Picture"/>
+            <wp:docPr descr="Hình 6. Kiến trúc MCP: tách tool thành server độc lập, mọi AI client đều dùng được" title="" id="97" name="Picture"/>
             <a:graphic>
               <a:graphicData uri="http://schemas.openxmlformats.org/drawingml/2006/picture">
                 <pic:pic>
                   <pic:nvPicPr>
-                    <pic:cNvPr descr="diagrams/06_mcp_architecture.png" id="96" name="Picture"/>
+                    <pic:cNvPr descr="diagrams/06_mcp_architecture.png" id="98" name="Picture"/>
                     <pic:cNvPicPr>
                       <a:picLocks noChangeArrowheads="1" noChangeAspect="1"/>
                     </pic:cNvPicPr>
                   </pic:nvPicPr>
                   <pic:blipFill>
-                    <a:blip r:embed="rId94"/>
+                    <a:blip r:embed="rId96"/>
                     <a:stretch>
                       <a:fillRect/>
                     </a:stretch>
@@ -12877,7 +13214,7 @@
       <w:r>
         <w:t xml:space="preserve"> </w:t>
       </w:r>
-      <w:hyperlink r:id="rId97">
+      <w:hyperlink r:id="rId99">
         <w:r>
           <w:rPr>
             <w:rStyle w:val="Hyperlink"/>
@@ -12894,7 +13231,7 @@
       <w:r>
         <w:t xml:space="preserve"> </w:t>
       </w:r>
-      <w:hyperlink r:id="rId98">
+      <w:hyperlink r:id="rId100">
         <w:r>
           <w:rPr>
             <w:rStyle w:val="Hyperlink"/>
@@ -12913,8 +13250,8 @@
         </w:pict>
       </w:r>
     </w:p>
-    <w:bookmarkEnd w:id="99"/>
-    <w:bookmarkStart w:id="103" w:name="X3317d52af087e3dbc9327edb58f577b3144710c"/>
+    <w:bookmarkEnd w:id="101"/>
+    <w:bookmarkStart w:id="105" w:name="X3317d52af087e3dbc9327edb58f577b3144710c"/>
     <w:p>
       <w:pPr>
         <w:pStyle w:val="Heading2"/>
@@ -12923,7 +13260,7 @@
         <w:t xml:space="preserve">3.5 Bảo mật Agent in-depth</w:t>
       </w:r>
     </w:p>
-    <w:bookmarkStart w:id="100" w:name="Xd5fc0d696056f8f9d2bbfb3b979cd82e5f04e38"/>
+    <w:bookmarkStart w:id="102" w:name="Xd5fc0d696056f8f9d2bbfb3b979cd82e5f04e38"/>
     <w:p>
       <w:pPr>
         <w:pStyle w:val="Heading3"/>
@@ -13262,8 +13599,8 @@
         <w:t xml:space="preserve">: tránh DoS qua file lớn</w:t>
       </w:r>
     </w:p>
-    <w:bookmarkEnd w:id="100"/>
-    <w:bookmarkStart w:id="101" w:name="Xfdda51687dc0109efad929db907650b689a9bf6"/>
+    <w:bookmarkEnd w:id="102"/>
+    <w:bookmarkStart w:id="103" w:name="Xfdda51687dc0109efad929db907650b689a9bf6"/>
     <w:p>
       <w:pPr>
         <w:pStyle w:val="Heading3"/>
@@ -13458,8 +13795,8 @@
         <w:t xml:space="preserve">+ rate limit), data exfiltration (lừa agent gửi data ra ngoài → không cấp tool egress + allowlist domain), privilege escalation (chuỗi tool đọc→ghi → audit log + scope rõ từng tool). Lưu ý khi agent của bạn có tool ghi/gửi/gọi API trả phí.</w:t>
       </w:r>
     </w:p>
-    <w:bookmarkEnd w:id="101"/>
-    <w:bookmarkStart w:id="102" w:name="Xdba5a6f69ba3855faacee16adeff2a7d476c840"/>
+    <w:bookmarkEnd w:id="103"/>
+    <w:bookmarkStart w:id="104" w:name="Xdba5a6f69ba3855faacee16adeff2a7d476c840"/>
     <w:p>
       <w:pPr>
         <w:pStyle w:val="Heading3"/>
@@ -13555,10 +13892,10 @@
         </w:pict>
       </w:r>
     </w:p>
-    <w:bookmarkEnd w:id="102"/>
-    <w:bookmarkEnd w:id="103"/>
     <w:bookmarkEnd w:id="104"/>
-    <w:bookmarkStart w:id="105" w:name="Xb24c982a11f247ffac2866abbc85f081d7ebf56"/>
+    <w:bookmarkEnd w:id="105"/>
+    <w:bookmarkEnd w:id="106"/>
+    <w:bookmarkStart w:id="107" w:name="Xb24c982a11f247ffac2866abbc85f081d7ebf56"/>
     <w:p>
       <w:pPr>
         <w:pStyle w:val="Heading1"/>
@@ -13791,8 +14128,8 @@
         <w:t xml:space="preserve">Chi tiết kiến trúc nhiều tầng, monitoring (Langfuse, Prometheus), và tuân thủ pháp lý (NĐ 13/2023, DPIA) là việc của đội platform/pháp chế khi đã có hệ thống thật — không cần cho buổi học. Có tài liệu riêng khi bạn tới giai đoạn đó.</w:t>
       </w:r>
     </w:p>
-    <w:bookmarkEnd w:id="105"/>
-    <w:bookmarkStart w:id="109" w:name="phần-5--khi-nào-local-vs-cloud"/>
+    <w:bookmarkEnd w:id="107"/>
+    <w:bookmarkStart w:id="111" w:name="phần-5--khi-nào-local-vs-cloud"/>
     <w:p>
       <w:pPr>
         <w:pStyle w:val="Heading1"/>
@@ -13801,7 +14138,7 @@
         <w:t xml:space="preserve">Phần 5 — Khi nào local vs cloud</w:t>
       </w:r>
     </w:p>
-    <w:bookmarkStart w:id="106" w:name="X2b8bd35f59938b812135eb0808cd1ccb6618d6d"/>
+    <w:bookmarkStart w:id="108" w:name="X2b8bd35f59938b812135eb0808cd1ccb6618d6d"/>
     <w:p>
       <w:pPr>
         <w:pStyle w:val="Heading2"/>
@@ -14274,8 +14611,8 @@
         </w:tc>
       </w:tr>
     </w:tbl>
-    <w:bookmarkEnd w:id="106"/>
-    <w:bookmarkStart w:id="107" w:name="X5bdd8327d6c0b4c224c2048dbd79047d056442d"/>
+    <w:bookmarkEnd w:id="108"/>
+    <w:bookmarkStart w:id="109" w:name="X5bdd8327d6c0b4c224c2048dbd79047d056442d"/>
     <w:p>
       <w:pPr>
         <w:pStyle w:val="Heading2"/>
@@ -14429,8 +14766,8 @@
         <w:t xml:space="preserve">└─────────────────────┘</w:t>
       </w:r>
     </w:p>
-    <w:bookmarkEnd w:id="107"/>
-    <w:bookmarkStart w:id="108" w:name="X7fcd31e86681cfa83b91ab4337e2591fa835884"/>
+    <w:bookmarkEnd w:id="109"/>
+    <w:bookmarkStart w:id="110" w:name="X7fcd31e86681cfa83b91ab4337e2591fa835884"/>
     <w:p>
       <w:pPr>
         <w:pStyle w:val="Heading2"/>
@@ -14660,9 +14997,9 @@
         </w:pict>
       </w:r>
     </w:p>
-    <w:bookmarkEnd w:id="108"/>
-    <w:bookmarkEnd w:id="109"/>
-    <w:bookmarkStart w:id="113" w:name="phần-6--fine-tune-vs-rag"/>
+    <w:bookmarkEnd w:id="110"/>
+    <w:bookmarkEnd w:id="111"/>
+    <w:bookmarkStart w:id="115" w:name="phần-6--fine-tune-vs-rag"/>
     <w:p>
       <w:pPr>
         <w:pStyle w:val="Heading1"/>
@@ -14671,7 +15008,7 @@
         <w:t xml:space="preserve">Phần 6 — Fine-tune vs RAG</w:t>
       </w:r>
     </w:p>
-    <w:bookmarkStart w:id="110" w:name="X04bc35027288453756840cab312d1d1cdbd2d45"/>
+    <w:bookmarkStart w:id="112" w:name="X04bc35027288453756840cab312d1d1cdbd2d45"/>
     <w:p>
       <w:pPr>
         <w:pStyle w:val="Heading2"/>
@@ -15010,8 +15347,8 @@
         </w:tc>
       </w:tr>
     </w:tbl>
-    <w:bookmarkEnd w:id="110"/>
-    <w:bookmarkStart w:id="112" w:name="X7f89cc6839c1898531ca2542c8d5714f9dfb802"/>
+    <w:bookmarkEnd w:id="112"/>
+    <w:bookmarkStart w:id="114" w:name="X7f89cc6839c1898531ca2542c8d5714f9dfb802"/>
     <w:p>
       <w:pPr>
         <w:pStyle w:val="Heading2"/>
@@ -15093,7 +15430,7 @@
       <w:r>
         <w:t xml:space="preserve"> </w:t>
       </w:r>
-      <w:hyperlink r:id="rId111">
+      <w:hyperlink r:id="rId113">
         <w:r>
           <w:rPr>
             <w:rStyle w:val="Hyperlink"/>
@@ -15117,9 +15454,9 @@
         </w:pict>
       </w:r>
     </w:p>
-    <w:bookmarkEnd w:id="112"/>
-    <w:bookmarkEnd w:id="113"/>
-    <w:bookmarkStart w:id="126" w:name="phần-7--troubleshooting"/>
+    <w:bookmarkEnd w:id="114"/>
+    <w:bookmarkEnd w:id="115"/>
+    <w:bookmarkStart w:id="128" w:name="phần-7--troubleshooting"/>
     <w:p>
       <w:pPr>
         <w:pStyle w:val="Heading1"/>
@@ -15128,7 +15465,7 @@
         <w:t xml:space="preserve">Phần 7 — Troubleshooting</w:t>
       </w:r>
     </w:p>
-    <w:bookmarkStart w:id="114" w:name="X77bafb93cb417acee92f99211915ab63f9ced2e"/>
+    <w:bookmarkStart w:id="116" w:name="X77bafb93cb417acee92f99211915ab63f9ced2e"/>
     <w:p>
       <w:pPr>
         <w:pStyle w:val="Heading2"/>
@@ -15324,8 +15661,8 @@
         <w:t xml:space="preserve">Fix: hỏi cụ thể hơn. "Kiểm tra IP X" rõ hơn "X có an toàn không"</w:t>
       </w:r>
     </w:p>
-    <w:bookmarkEnd w:id="114"/>
-    <w:bookmarkStart w:id="115" w:name="X42478b3122fb0eb2869a6e1c11882bead823251"/>
+    <w:bookmarkEnd w:id="116"/>
+    <w:bookmarkStart w:id="117" w:name="X42478b3122fb0eb2869a6e1c11882bead823251"/>
     <w:p>
       <w:pPr>
         <w:pStyle w:val="Heading2"/>
@@ -15440,8 +15777,8 @@
         <w:t xml:space="preserve">: nhỏ thường bịa nhiều hơn</w:t>
       </w:r>
     </w:p>
-    <w:bookmarkEnd w:id="115"/>
-    <w:bookmarkStart w:id="116" w:name="Xf2c03e853ebc70e69c6ea432b2e30d3e3a858a1"/>
+    <w:bookmarkEnd w:id="117"/>
+    <w:bookmarkStart w:id="118" w:name="Xf2c03e853ebc70e69c6ea432b2e30d3e3a858a1"/>
     <w:p>
       <w:pPr>
         <w:pStyle w:val="Heading2"/>
@@ -15584,8 +15921,8 @@
         <w:t xml:space="preserve">: thêm bước rerank top-20 → top-5</w:t>
       </w:r>
     </w:p>
-    <w:bookmarkEnd w:id="116"/>
-    <w:bookmarkStart w:id="117" w:name="X5eafd8c2e9ab6fbe733989a549f23e066e30add"/>
+    <w:bookmarkEnd w:id="118"/>
+    <w:bookmarkStart w:id="119" w:name="X5eafd8c2e9ab6fbe733989a549f23e066e30add"/>
     <w:p>
       <w:pPr>
         <w:pStyle w:val="Heading2"/>
@@ -15724,8 +16061,8 @@
         <w:t xml:space="preserve">ollama stop &lt;other_model&gt;</w:t>
       </w:r>
     </w:p>
-    <w:bookmarkEnd w:id="117"/>
-    <w:bookmarkStart w:id="118" w:name="Xae3d93ca3a02e733ab2551257ffdafc12fc1785"/>
+    <w:bookmarkEnd w:id="119"/>
+    <w:bookmarkStart w:id="120" w:name="Xae3d93ca3a02e733ab2551257ffdafc12fc1785"/>
     <w:p>
       <w:pPr>
         <w:pStyle w:val="Heading2"/>
@@ -15855,8 +16192,8 @@
         <w:t xml:space="preserve">: GTX 1660 cũng nhanh hơn CPU 3-5×</w:t>
       </w:r>
     </w:p>
-    <w:bookmarkEnd w:id="118"/>
-    <w:bookmarkStart w:id="119" w:name="Xfe46f18d560f0a7a823a987e4b0cfecf5e6c0d0"/>
+    <w:bookmarkEnd w:id="120"/>
+    <w:bookmarkStart w:id="121" w:name="Xfe46f18d560f0a7a823a987e4b0cfecf5e6c0d0"/>
     <w:p>
       <w:pPr>
         <w:pStyle w:val="Heading2"/>
@@ -15954,8 +16291,8 @@
         <w:t xml:space="preserve">Trên Windows: tránh path có khoảng trắng (đôi khi lỗi)</w:t>
       </w:r>
     </w:p>
-    <w:bookmarkEnd w:id="119"/>
-    <w:bookmarkStart w:id="120" w:name="X156cffafc01013499f817d1c9f59e5d8348c1e1"/>
+    <w:bookmarkEnd w:id="121"/>
+    <w:bookmarkStart w:id="122" w:name="X156cffafc01013499f817d1c9f59e5d8348c1e1"/>
     <w:p>
       <w:pPr>
         <w:pStyle w:val="Heading2"/>
@@ -16111,206 +16448,261 @@
         <w:t xml:space="preserve">— chắc chắn Ollama đang chạy ở host.</w:t>
       </w:r>
     </w:p>
-    <w:bookmarkEnd w:id="120"/>
-    <w:bookmarkStart w:id="121" w:name="X2588be92cc2c3658b253313fc278044b03369f1"/>
-    <w:p>
-      <w:pPr>
-        <w:pStyle w:val="Heading2"/>
-      </w:pPr>
-      <w:r>
-        <w:t xml:space="preserve">7.8 Qwen3 output có block</w:t>
-      </w:r>
-      <w:r>
-        <w:t xml:space="preserve"> </w:t>
-      </w:r>
-      <w:r>
-        <w:rPr>
-          <w:rStyle w:val="VerbatimChar"/>
-        </w:rPr>
-        <w:t xml:space="preserve">&lt;think&gt;...&lt;/think&gt;</w:t>
-      </w:r>
-      <w:r>
-        <w:t xml:space="preserve"> </w:t>
-      </w:r>
-      <w:r>
-        <w:t xml:space="preserve">dài</w:t>
-      </w:r>
-    </w:p>
-    <w:p>
-      <w:pPr>
-        <w:pStyle w:val="FirstParagraph"/>
-      </w:pPr>
+    <w:p>
+      <w:pPr>
+        <w:pStyle w:val="BlockText"/>
+      </w:pPr>
+      <w:r>
+        <w:t xml:space="preserve">🎓</w:t>
+      </w:r>
+      <w:r>
+        <w:t xml:space="preserve"> </w:t>
+      </w:r>
       <w:r>
         <w:rPr>
           <w:b/>
           <w:bCs/>
         </w:rPr>
-        <w:t xml:space="preserve">Triệu chứng</w:t>
-      </w:r>
-      <w:r>
-        <w:t xml:space="preserve">: chạy ollama chat ra block thinking trước câu trả lời.</w:t>
-      </w:r>
-    </w:p>
-    <w:p>
-      <w:pPr>
-        <w:pStyle w:val="BodyText"/>
-      </w:pPr>
+        <w:t xml:space="preserve">Giảng viên:</w:t>
+      </w:r>
+      <w:r>
+        <w:t xml:space="preserve"> </w:t>
+      </w:r>
+      <w:r>
+        <w:t xml:space="preserve">trước buổi chạy</w:t>
+      </w:r>
+      <w:r>
+        <w:t xml:space="preserve"> </w:t>
+      </w:r>
+      <w:r>
+        <w:rPr>
+          <w:rStyle w:val="VerbatimChar"/>
+        </w:rPr>
+        <w:t xml:space="preserve">docker compose pull</w:t>
+      </w:r>
+      <w:r>
+        <w:t xml:space="preserve"> </w:t>
+      </w:r>
+      <w:r>
+        <w:t xml:space="preserve">để</w:t>
+      </w:r>
+      <w:r>
+        <w:t xml:space="preserve"> </w:t>
+      </w:r>
       <w:r>
         <w:rPr>
           <w:b/>
           <w:bCs/>
         </w:rPr>
-        <w:t xml:space="preserve">Nguyên nhân</w:t>
-      </w:r>
-      <w:r>
-        <w:t xml:space="preserve">: Qwen3 mặc định bật thinking mode.</w:t>
-      </w:r>
-    </w:p>
-    <w:p>
-      <w:pPr>
-        <w:pStyle w:val="BodyText"/>
+        <w:t xml:space="preserve">tải sẵn image Open WebUI</w:t>
+      </w:r>
+      <w:r>
+        <w:t xml:space="preserve"> </w:t>
+      </w:r>
+      <w:r>
+        <w:t xml:space="preserve">(~1GB, 5–10') — tránh demo bị khóa giữa giờ.</w:t>
+      </w:r>
+    </w:p>
+    <w:bookmarkEnd w:id="122"/>
+    <w:bookmarkStart w:id="123" w:name="X2588be92cc2c3658b253313fc278044b03369f1"/>
+    <w:p>
+      <w:pPr>
+        <w:pStyle w:val="Heading2"/>
+      </w:pPr>
+      <w:r>
+        <w:t xml:space="preserve">7.8 Qwen3 output có block</w:t>
+      </w:r>
+      <w:r>
+        <w:t xml:space="preserve"> </w:t>
+      </w:r>
+      <w:r>
+        <w:rPr>
+          <w:rStyle w:val="VerbatimChar"/>
+        </w:rPr>
+        <w:t xml:space="preserve">&lt;think&gt;...&lt;/think&gt;</w:t>
+      </w:r>
+      <w:r>
+        <w:t xml:space="preserve"> </w:t>
+      </w:r>
+      <w:r>
+        <w:t xml:space="preserve">dài</w:t>
+      </w:r>
+    </w:p>
+    <w:p>
+      <w:pPr>
+        <w:pStyle w:val="FirstParagraph"/>
       </w:pPr>
       <w:r>
         <w:rPr>
           <w:b/>
           <w:bCs/>
         </w:rPr>
-        <w:t xml:space="preserve">Fix</w:t>
-      </w:r>
-      <w:r>
-        <w:t xml:space="preserve">: thêm</w:t>
-      </w:r>
-      <w:r>
-        <w:t xml:space="preserve"> </w:t>
-      </w:r>
-      <w:r>
-        <w:rPr>
-          <w:rStyle w:val="VerbatimChar"/>
-        </w:rPr>
-        <w:t xml:space="preserve">think=False</w:t>
-      </w:r>
-      <w:r>
-        <w:t xml:space="preserve"> </w:t>
-      </w:r>
-      <w:r>
-        <w:t xml:space="preserve">vào</w:t>
-      </w:r>
-      <w:r>
-        <w:t xml:space="preserve"> </w:t>
-      </w:r>
-      <w:r>
-        <w:rPr>
-          <w:rStyle w:val="VerbatimChar"/>
-        </w:rPr>
-        <w:t xml:space="preserve">ollama.chat()</w:t>
-      </w:r>
-      <w:r>
-        <w:t xml:space="preserve">:</w:t>
-      </w:r>
-    </w:p>
-    <w:p>
-      <w:pPr>
-        <w:pStyle w:val="SourceCode"/>
-      </w:pPr>
-      <w:r>
-        <w:rPr>
-          <w:rStyle w:val="NormalTok"/>
-        </w:rPr>
-        <w:t xml:space="preserve">ollama.chat(model</w:t>
-      </w:r>
-      <w:r>
-        <w:rPr>
-          <w:rStyle w:val="OperatorTok"/>
-        </w:rPr>
-        <w:t xml:space="preserve">=</w:t>
-      </w:r>
-      <w:r>
-        <w:rPr>
-          <w:rStyle w:val="StringTok"/>
-        </w:rPr>
-        <w:t xml:space="preserve">"qwen3:1.7b"</w:t>
-      </w:r>
-      <w:r>
-        <w:rPr>
-          <w:rStyle w:val="NormalTok"/>
-        </w:rPr>
-        <w:t xml:space="preserve">, messages</w:t>
-      </w:r>
-      <w:r>
-        <w:rPr>
-          <w:rStyle w:val="OperatorTok"/>
-        </w:rPr>
-        <w:t xml:space="preserve">=</w:t>
-      </w:r>
-      <w:r>
-        <w:rPr>
-          <w:rStyle w:val="NormalTok"/>
-        </w:rPr>
-        <w:t xml:space="preserve">[...], think</w:t>
-      </w:r>
-      <w:r>
-        <w:rPr>
-          <w:rStyle w:val="OperatorTok"/>
-        </w:rPr>
-        <w:t xml:space="preserve">=</w:t>
-      </w:r>
-      <w:r>
-        <w:rPr>
-          <w:rStyle w:val="VariableTok"/>
-        </w:rPr>
-        <w:t xml:space="preserve">False</w:t>
-      </w:r>
-      <w:r>
-        <w:rPr>
-          <w:rStyle w:val="NormalTok"/>
-        </w:rPr>
-        <w:t xml:space="preserve">)</w:t>
-      </w:r>
-    </w:p>
-    <w:p>
-      <w:pPr>
-        <w:pStyle w:val="FirstParagraph"/>
+        <w:t xml:space="preserve">Triệu chứng</w:t>
+      </w:r>
+      <w:r>
+        <w:t xml:space="preserve">: chạy ollama chat ra block thinking trước câu trả lời.</w:t>
+      </w:r>
+    </w:p>
+    <w:p>
+      <w:pPr>
+        <w:pStyle w:val="BodyText"/>
       </w:pPr>
       <w:r>
         <w:rPr>
           <w:b/>
           <w:bCs/>
         </w:rPr>
-        <w:t xml:space="preserve">Lưu ý</w:t>
-      </w:r>
-      <w:r>
-        <w:t xml:space="preserve">:</w:t>
-      </w:r>
-      <w:r>
-        <w:t xml:space="preserve"> </w:t>
-      </w:r>
-      <w:r>
-        <w:rPr>
-          <w:rStyle w:val="VerbatimChar"/>
-        </w:rPr>
-        <w:t xml:space="preserve">think=False</w:t>
-      </w:r>
-      <w:r>
-        <w:t xml:space="preserve"> </w:t>
-      </w:r>
-      <w:r>
-        <w:t xml:space="preserve">work tốt với qwen3:</w:t>
-      </w:r>
+        <w:t xml:space="preserve">Nguyên nhân</w:t>
+      </w:r>
+      <w:r>
+        <w:t xml:space="preserve">: Qwen3 mặc định bật thinking mode.</w:t>
+      </w:r>
+    </w:p>
+    <w:p>
+      <w:pPr>
+        <w:pStyle w:val="BodyText"/>
+      </w:pPr>
       <w:r>
         <w:rPr>
           <w:b/>
           <w:bCs/>
         </w:rPr>
-        <w:t xml:space="preserve">1.7b</w:t>
-      </w:r>
-      <w:r>
-        <w:t xml:space="preserve">, nhưng qwen3:</w:t>
-      </w:r>
+        <w:t xml:space="preserve">Fix</w:t>
+      </w:r>
+      <w:r>
+        <w:t xml:space="preserve">: thêm</w:t>
+      </w:r>
+      <w:r>
+        <w:t xml:space="preserve"> </w:t>
+      </w:r>
+      <w:r>
+        <w:rPr>
+          <w:rStyle w:val="VerbatimChar"/>
+        </w:rPr>
+        <w:t xml:space="preserve">think=False</w:t>
+      </w:r>
+      <w:r>
+        <w:t xml:space="preserve"> </w:t>
+      </w:r>
+      <w:r>
+        <w:t xml:space="preserve">vào</w:t>
+      </w:r>
+      <w:r>
+        <w:t xml:space="preserve"> </w:t>
+      </w:r>
+      <w:r>
+        <w:rPr>
+          <w:rStyle w:val="VerbatimChar"/>
+        </w:rPr>
+        <w:t xml:space="preserve">ollama.chat()</w:t>
+      </w:r>
+      <w:r>
+        <w:t xml:space="preserve">:</w:t>
+      </w:r>
+    </w:p>
+    <w:p>
+      <w:pPr>
+        <w:pStyle w:val="SourceCode"/>
+      </w:pPr>
+      <w:r>
+        <w:rPr>
+          <w:rStyle w:val="NormalTok"/>
+        </w:rPr>
+        <w:t xml:space="preserve">ollama.chat(model</w:t>
+      </w:r>
+      <w:r>
+        <w:rPr>
+          <w:rStyle w:val="OperatorTok"/>
+        </w:rPr>
+        <w:t xml:space="preserve">=</w:t>
+      </w:r>
+      <w:r>
+        <w:rPr>
+          <w:rStyle w:val="StringTok"/>
+        </w:rPr>
+        <w:t xml:space="preserve">"qwen3:1.7b"</w:t>
+      </w:r>
+      <w:r>
+        <w:rPr>
+          <w:rStyle w:val="NormalTok"/>
+        </w:rPr>
+        <w:t xml:space="preserve">, messages</w:t>
+      </w:r>
+      <w:r>
+        <w:rPr>
+          <w:rStyle w:val="OperatorTok"/>
+        </w:rPr>
+        <w:t xml:space="preserve">=</w:t>
+      </w:r>
+      <w:r>
+        <w:rPr>
+          <w:rStyle w:val="NormalTok"/>
+        </w:rPr>
+        <w:t xml:space="preserve">[...], think</w:t>
+      </w:r>
+      <w:r>
+        <w:rPr>
+          <w:rStyle w:val="OperatorTok"/>
+        </w:rPr>
+        <w:t xml:space="preserve">=</w:t>
+      </w:r>
+      <w:r>
+        <w:rPr>
+          <w:rStyle w:val="VariableTok"/>
+        </w:rPr>
+        <w:t xml:space="preserve">False</w:t>
+      </w:r>
+      <w:r>
+        <w:rPr>
+          <w:rStyle w:val="NormalTok"/>
+        </w:rPr>
+        <w:t xml:space="preserve">)</w:t>
+      </w:r>
+    </w:p>
+    <w:p>
+      <w:pPr>
+        <w:pStyle w:val="FirstParagraph"/>
+      </w:pPr>
       <w:r>
         <w:rPr>
           <w:b/>
           <w:bCs/>
         </w:rPr>
+        <w:t xml:space="preserve">Lưu ý</w:t>
+      </w:r>
+      <w:r>
+        <w:t xml:space="preserve">:</w:t>
+      </w:r>
+      <w:r>
+        <w:t xml:space="preserve"> </w:t>
+      </w:r>
+      <w:r>
+        <w:rPr>
+          <w:rStyle w:val="VerbatimChar"/>
+        </w:rPr>
+        <w:t xml:space="preserve">think=False</w:t>
+      </w:r>
+      <w:r>
+        <w:t xml:space="preserve"> </w:t>
+      </w:r>
+      <w:r>
+        <w:t xml:space="preserve">work tốt với qwen3:</w:t>
+      </w:r>
+      <w:r>
+        <w:rPr>
+          <w:b/>
+          <w:bCs/>
+        </w:rPr>
+        <w:t xml:space="preserve">1.7b</w:t>
+      </w:r>
+      <w:r>
+        <w:t xml:space="preserve">, nhưng qwen3:</w:t>
+      </w:r>
+      <w:r>
+        <w:rPr>
+          <w:b/>
+          <w:bCs/>
+        </w:rPr>
         <w:t xml:space="preserve">4b</w:t>
       </w:r>
       <w:r>
@@ -16320,8 +16712,8 @@
         <w:t xml:space="preserve">vẫn có khuynh hướng "nghĩ ra mặt giấy" trong content chính. Dùng 1.7b cho output sạch nhất.</w:t>
       </w:r>
     </w:p>
-    <w:bookmarkEnd w:id="121"/>
-    <w:bookmarkStart w:id="122" w:name="X9c87e7c6f500a280bf60c4b6b3f464aa31ca3fc"/>
+    <w:bookmarkEnd w:id="123"/>
+    <w:bookmarkStart w:id="124" w:name="X9c87e7c6f500a280bf60c4b6b3f464aa31ca3fc"/>
     <w:p>
       <w:pPr>
         <w:pStyle w:val="Heading2"/>
@@ -16548,8 +16940,8 @@
         <w:t xml:space="preserve">để cover cả Gradio 4.x và 6.x — pip install version nào cũng chạy.</w:t>
       </w:r>
     </w:p>
-    <w:bookmarkEnd w:id="122"/>
-    <w:bookmarkStart w:id="123" w:name="Xf0cbc06f439db82011fcb61359326f39a65e2b5"/>
+    <w:bookmarkEnd w:id="124"/>
+    <w:bookmarkStart w:id="125" w:name="Xf0cbc06f439db82011fcb61359326f39a65e2b5"/>
     <w:p>
       <w:pPr>
         <w:pStyle w:val="Heading2"/>
@@ -16752,8 +17144,8 @@
         <w:t xml:space="preserve"> OpenAIModel</w:t>
       </w:r>
     </w:p>
-    <w:bookmarkEnd w:id="123"/>
-    <w:bookmarkStart w:id="124" w:name="Xc0f08f7442dc217e0ae8f4000cf39018be84d32"/>
+    <w:bookmarkEnd w:id="125"/>
+    <w:bookmarkStart w:id="126" w:name="Xc0f08f7442dc217e0ae8f4000cf39018be84d32"/>
     <w:p>
       <w:pPr>
         <w:pStyle w:val="Heading2"/>
@@ -16880,8 +17272,8 @@
         <w:t xml:space="preserve">trước.</w:t>
       </w:r>
     </w:p>
-    <w:bookmarkEnd w:id="124"/>
-    <w:bookmarkStart w:id="125" w:name="Xd45033f979cbf56fa1d744ce46370a83da6c199"/>
+    <w:bookmarkEnd w:id="126"/>
+    <w:bookmarkStart w:id="127" w:name="Xd45033f979cbf56fa1d744ce46370a83da6c199"/>
     <w:p>
       <w:pPr>
         <w:pStyle w:val="Heading2"/>
@@ -17053,9 +17445,9 @@
         </w:pict>
       </w:r>
     </w:p>
-    <w:bookmarkEnd w:id="125"/>
-    <w:bookmarkEnd w:id="126"/>
-    <w:bookmarkStart w:id="213" w:name="phần-8--tài-liệu-tham-khảo"/>
+    <w:bookmarkEnd w:id="127"/>
+    <w:bookmarkEnd w:id="128"/>
+    <w:bookmarkStart w:id="215" w:name="phần-8--tài-liệu-tham-khảo"/>
     <w:p>
       <w:pPr>
         <w:pStyle w:val="Heading1"/>
@@ -17088,7 +17480,7 @@
         <w:t xml:space="preserve">— tránh blog không rõ nguồn.</w:t>
       </w:r>
     </w:p>
-    <w:bookmarkStart w:id="143" w:name="Xdc19e93d93f88b175bd8a7463ef94be2e7ffc43"/>
+    <w:bookmarkStart w:id="145" w:name="Xdc19e93d93f88b175bd8a7463ef94be2e7ffc43"/>
     <w:p>
       <w:pPr>
         <w:pStyle w:val="Heading2"/>
@@ -17097,7 +17489,7 @@
         <w:t xml:space="preserve">8.1 Nhà cung cấp LLM (model weights &amp; API)</w:t>
       </w:r>
     </w:p>
-    <w:bookmarkStart w:id="135" w:name="open-source-labscompanies"/>
+    <w:bookmarkStart w:id="137" w:name="open-source-labscompanies"/>
     <w:p>
       <w:pPr>
         <w:pStyle w:val="Heading3"/>
@@ -17200,7 +17592,7 @@
             <w:pPr>
               <w:pStyle w:val="Compact"/>
             </w:pPr>
-            <w:hyperlink r:id="rId26">
+            <w:hyperlink r:id="rId28">
               <w:r>
                 <w:rPr>
                   <w:rStyle w:val="Hyperlink"/>
@@ -17216,7 +17608,7 @@
             <w:pPr>
               <w:pStyle w:val="Compact"/>
             </w:pPr>
-            <w:hyperlink r:id="rId127">
+            <w:hyperlink r:id="rId129">
               <w:r>
                 <w:rPr>
                   <w:rStyle w:val="Hyperlink"/>
@@ -17260,7 +17652,7 @@
             <w:pPr>
               <w:pStyle w:val="Compact"/>
             </w:pPr>
-            <w:hyperlink r:id="rId27">
+            <w:hyperlink r:id="rId29">
               <w:r>
                 <w:rPr>
                   <w:rStyle w:val="Hyperlink"/>
@@ -17276,7 +17668,7 @@
             <w:pPr>
               <w:pStyle w:val="Compact"/>
             </w:pPr>
-            <w:hyperlink r:id="rId128">
+            <w:hyperlink r:id="rId130">
               <w:r>
                 <w:rPr>
                   <w:rStyle w:val="Hyperlink"/>
@@ -17320,7 +17712,7 @@
             <w:pPr>
               <w:pStyle w:val="Compact"/>
             </w:pPr>
-            <w:hyperlink r:id="rId28">
+            <w:hyperlink r:id="rId30">
               <w:r>
                 <w:rPr>
                   <w:rStyle w:val="Hyperlink"/>
@@ -17336,7 +17728,7 @@
             <w:pPr>
               <w:pStyle w:val="Compact"/>
             </w:pPr>
-            <w:hyperlink r:id="rId129">
+            <w:hyperlink r:id="rId131">
               <w:r>
                 <w:rPr>
                   <w:rStyle w:val="Hyperlink"/>
@@ -17380,7 +17772,7 @@
             <w:pPr>
               <w:pStyle w:val="Compact"/>
             </w:pPr>
-            <w:hyperlink r:id="rId29">
+            <w:hyperlink r:id="rId31">
               <w:r>
                 <w:rPr>
                   <w:rStyle w:val="Hyperlink"/>
@@ -17396,7 +17788,7 @@
             <w:pPr>
               <w:pStyle w:val="Compact"/>
             </w:pPr>
-            <w:hyperlink r:id="rId130">
+            <w:hyperlink r:id="rId132">
               <w:r>
                 <w:rPr>
                   <w:rStyle w:val="Hyperlink"/>
@@ -17440,7 +17832,7 @@
             <w:pPr>
               <w:pStyle w:val="Compact"/>
             </w:pPr>
-            <w:hyperlink r:id="rId30">
+            <w:hyperlink r:id="rId32">
               <w:r>
                 <w:rPr>
                   <w:rStyle w:val="Hyperlink"/>
@@ -17456,7 +17848,7 @@
             <w:pPr>
               <w:pStyle w:val="Compact"/>
             </w:pPr>
-            <w:hyperlink r:id="rId131">
+            <w:hyperlink r:id="rId133">
               <w:r>
                 <w:rPr>
                   <w:rStyle w:val="Hyperlink"/>
@@ -17500,7 +17892,7 @@
             <w:pPr>
               <w:pStyle w:val="Compact"/>
             </w:pPr>
-            <w:hyperlink r:id="rId132">
+            <w:hyperlink r:id="rId134">
               <w:r>
                 <w:rPr>
                   <w:rStyle w:val="Hyperlink"/>
@@ -17516,7 +17908,7 @@
             <w:pPr>
               <w:pStyle w:val="Compact"/>
             </w:pPr>
-            <w:hyperlink r:id="rId133">
+            <w:hyperlink r:id="rId135">
               <w:r>
                 <w:rPr>
                   <w:rStyle w:val="Hyperlink"/>
@@ -17560,7 +17952,7 @@
             <w:pPr>
               <w:pStyle w:val="Compact"/>
             </w:pPr>
-            <w:hyperlink r:id="rId134">
+            <w:hyperlink r:id="rId136">
               <w:r>
                 <w:rPr>
                   <w:rStyle w:val="Hyperlink"/>
@@ -17576,7 +17968,7 @@
             <w:pPr>
               <w:pStyle w:val="Compact"/>
             </w:pPr>
-            <w:hyperlink r:id="rId31">
+            <w:hyperlink r:id="rId33">
               <w:r>
                 <w:rPr>
                   <w:rStyle w:val="Hyperlink"/>
@@ -17588,8 +17980,8 @@
         </w:tc>
       </w:tr>
     </w:tbl>
-    <w:bookmarkEnd w:id="135"/>
-    <w:bookmarkStart w:id="142" w:name="closed-source-cloud-api"/>
+    <w:bookmarkEnd w:id="137"/>
+    <w:bookmarkStart w:id="144" w:name="closed-source-cloud-api"/>
     <w:p>
       <w:pPr>
         <w:pStyle w:val="Heading3"/>
@@ -17672,7 +18064,7 @@
             <w:pPr>
               <w:pStyle w:val="Compact"/>
             </w:pPr>
-            <w:hyperlink r:id="rId136">
+            <w:hyperlink r:id="rId138">
               <w:r>
                 <w:rPr>
                   <w:rStyle w:val="Hyperlink"/>
@@ -17688,7 +18080,7 @@
             <w:pPr>
               <w:pStyle w:val="Compact"/>
             </w:pPr>
-            <w:hyperlink r:id="rId137">
+            <w:hyperlink r:id="rId139">
               <w:r>
                 <w:rPr>
                   <w:rStyle w:val="Hyperlink"/>
@@ -17727,7 +18119,7 @@
             <w:pPr>
               <w:pStyle w:val="Compact"/>
             </w:pPr>
-            <w:hyperlink r:id="rId138">
+            <w:hyperlink r:id="rId140">
               <w:r>
                 <w:rPr>
                   <w:rStyle w:val="Hyperlink"/>
@@ -17743,7 +18135,7 @@
             <w:pPr>
               <w:pStyle w:val="Compact"/>
             </w:pPr>
-            <w:hyperlink r:id="rId139">
+            <w:hyperlink r:id="rId141">
               <w:r>
                 <w:rPr>
                   <w:rStyle w:val="Hyperlink"/>
@@ -17782,7 +18174,7 @@
             <w:pPr>
               <w:pStyle w:val="Compact"/>
             </w:pPr>
-            <w:hyperlink r:id="rId140">
+            <w:hyperlink r:id="rId142">
               <w:r>
                 <w:rPr>
                   <w:rStyle w:val="Hyperlink"/>
@@ -17798,7 +18190,7 @@
             <w:pPr>
               <w:pStyle w:val="Compact"/>
             </w:pPr>
-            <w:hyperlink r:id="rId141">
+            <w:hyperlink r:id="rId143">
               <w:r>
                 <w:rPr>
                   <w:rStyle w:val="Hyperlink"/>
@@ -17810,9 +18202,9 @@
         </w:tc>
       </w:tr>
     </w:tbl>
-    <w:bookmarkEnd w:id="142"/>
-    <w:bookmarkEnd w:id="143"/>
-    <w:bookmarkStart w:id="152" w:name="X44dd7843cc26c0770341de4b662aa0c31e97c66"/>
+    <w:bookmarkEnd w:id="144"/>
+    <w:bookmarkEnd w:id="145"/>
+    <w:bookmarkStart w:id="154" w:name="X44dd7843cc26c0770341de4b662aa0c31e97c66"/>
     <w:p>
       <w:pPr>
         <w:pStyle w:val="Heading2"/>
@@ -17889,7 +18281,7 @@
             <w:pPr>
               <w:pStyle w:val="Compact"/>
             </w:pPr>
-            <w:hyperlink r:id="rId144">
+            <w:hyperlink r:id="rId146">
               <w:r>
                 <w:rPr>
                   <w:rStyle w:val="Hyperlink"/>
@@ -17905,7 +18297,7 @@
             <w:pPr>
               <w:pStyle w:val="Compact"/>
             </w:pPr>
-            <w:hyperlink r:id="rId145">
+            <w:hyperlink r:id="rId147">
               <w:r>
                 <w:rPr>
                   <w:rStyle w:val="Hyperlink"/>
@@ -17938,7 +18330,7 @@
             <w:pPr>
               <w:pStyle w:val="Compact"/>
             </w:pPr>
-            <w:hyperlink r:id="rId146">
+            <w:hyperlink r:id="rId148">
               <w:r>
                 <w:rPr>
                   <w:rStyle w:val="Hyperlink"/>
@@ -17993,7 +18385,7 @@
             <w:pPr>
               <w:pStyle w:val="Compact"/>
             </w:pPr>
-            <w:hyperlink r:id="rId19">
+            <w:hyperlink r:id="rId21">
               <w:r>
                 <w:rPr>
                   <w:rStyle w:val="Hyperlink"/>
@@ -18026,7 +18418,7 @@
             <w:pPr>
               <w:pStyle w:val="Compact"/>
             </w:pPr>
-            <w:hyperlink r:id="rId147">
+            <w:hyperlink r:id="rId149">
               <w:r>
                 <w:rPr>
                   <w:rStyle w:val="Hyperlink"/>
@@ -18042,7 +18434,7 @@
             <w:pPr>
               <w:pStyle w:val="Compact"/>
             </w:pPr>
-            <w:hyperlink r:id="rId148">
+            <w:hyperlink r:id="rId150">
               <w:r>
                 <w:rPr>
                   <w:rStyle w:val="Hyperlink"/>
@@ -18081,7 +18473,7 @@
             <w:pPr>
               <w:pStyle w:val="Compact"/>
             </w:pPr>
-            <w:hyperlink r:id="rId149">
+            <w:hyperlink r:id="rId151">
               <w:r>
                 <w:rPr>
                   <w:rStyle w:val="Hyperlink"/>
@@ -18097,7 +18489,7 @@
             <w:pPr>
               <w:pStyle w:val="Compact"/>
             </w:pPr>
-            <w:hyperlink r:id="rId150">
+            <w:hyperlink r:id="rId152">
               <w:r>
                 <w:rPr>
                   <w:rStyle w:val="Hyperlink"/>
@@ -18147,7 +18539,7 @@
             <w:pPr>
               <w:pStyle w:val="Compact"/>
             </w:pPr>
-            <w:hyperlink r:id="rId151">
+            <w:hyperlink r:id="rId153">
               <w:r>
                 <w:rPr>
                   <w:rStyle w:val="Hyperlink"/>
@@ -18159,8 +18551,8 @@
         </w:tc>
       </w:tr>
     </w:tbl>
-    <w:bookmarkEnd w:id="152"/>
-    <w:bookmarkStart w:id="163" w:name="X0a8c9d7ca5fd6c058ef6f18b7aa9c75b330cc40"/>
+    <w:bookmarkEnd w:id="154"/>
+    <w:bookmarkStart w:id="165" w:name="X0a8c9d7ca5fd6c058ef6f18b7aa9c75b330cc40"/>
     <w:p>
       <w:pPr>
         <w:pStyle w:val="Heading2"/>
@@ -18237,7 +18629,7 @@
             <w:pPr>
               <w:pStyle w:val="Compact"/>
             </w:pPr>
-            <w:hyperlink r:id="rId153">
+            <w:hyperlink r:id="rId155">
               <w:r>
                 <w:rPr>
                   <w:rStyle w:val="Hyperlink"/>
@@ -18253,7 +18645,7 @@
             <w:pPr>
               <w:pStyle w:val="Compact"/>
             </w:pPr>
-            <w:hyperlink r:id="rId154">
+            <w:hyperlink r:id="rId156">
               <w:r>
                 <w:rPr>
                   <w:rStyle w:val="Hyperlink"/>
@@ -18286,7 +18678,7 @@
             <w:pPr>
               <w:pStyle w:val="Compact"/>
             </w:pPr>
-            <w:hyperlink r:id="rId155">
+            <w:hyperlink r:id="rId157">
               <w:r>
                 <w:rPr>
                   <w:rStyle w:val="Hyperlink"/>
@@ -18302,7 +18694,7 @@
             <w:pPr>
               <w:pStyle w:val="Compact"/>
             </w:pPr>
-            <w:hyperlink r:id="rId156">
+            <w:hyperlink r:id="rId158">
               <w:r>
                 <w:rPr>
                   <w:rStyle w:val="Hyperlink"/>
@@ -18335,7 +18727,7 @@
             <w:pPr>
               <w:pStyle w:val="Compact"/>
             </w:pPr>
-            <w:hyperlink r:id="rId157">
+            <w:hyperlink r:id="rId159">
               <w:r>
                 <w:rPr>
                   <w:rStyle w:val="Hyperlink"/>
@@ -18351,7 +18743,7 @@
             <w:pPr>
               <w:pStyle w:val="Compact"/>
             </w:pPr>
-            <w:hyperlink r:id="rId158">
+            <w:hyperlink r:id="rId160">
               <w:r>
                 <w:rPr>
                   <w:rStyle w:val="Hyperlink"/>
@@ -18384,7 +18776,7 @@
             <w:pPr>
               <w:pStyle w:val="Compact"/>
             </w:pPr>
-            <w:hyperlink r:id="rId159">
+            <w:hyperlink r:id="rId161">
               <w:r>
                 <w:rPr>
                   <w:rStyle w:val="Hyperlink"/>
@@ -18400,7 +18792,7 @@
             <w:pPr>
               <w:pStyle w:val="Compact"/>
             </w:pPr>
-            <w:hyperlink r:id="rId160">
+            <w:hyperlink r:id="rId162">
               <w:r>
                 <w:rPr>
                   <w:rStyle w:val="Hyperlink"/>
@@ -18444,7 +18836,7 @@
             <w:pPr>
               <w:pStyle w:val="Compact"/>
             </w:pPr>
-            <w:hyperlink r:id="rId161">
+            <w:hyperlink r:id="rId163">
               <w:r>
                 <w:rPr>
                   <w:rStyle w:val="Hyperlink"/>
@@ -18494,7 +18886,7 @@
             <w:pPr>
               <w:pStyle w:val="Compact"/>
             </w:pPr>
-            <w:hyperlink r:id="rId162">
+            <w:hyperlink r:id="rId164">
               <w:r>
                 <w:rPr>
                   <w:rStyle w:val="Hyperlink"/>
@@ -18506,8 +18898,8 @@
         </w:tc>
       </w:tr>
     </w:tbl>
-    <w:bookmarkEnd w:id="163"/>
-    <w:bookmarkStart w:id="172" w:name="X6cef33d2193996fdd3fdc1e750d4fc06a296677"/>
+    <w:bookmarkEnd w:id="165"/>
+    <w:bookmarkStart w:id="174" w:name="X6cef33d2193996fdd3fdc1e750d4fc06a296677"/>
     <w:p>
       <w:pPr>
         <w:pStyle w:val="Heading2"/>
@@ -18572,7 +18964,7 @@
             <w:pPr>
               <w:pStyle w:val="Compact"/>
             </w:pPr>
-            <w:hyperlink r:id="rId164">
+            <w:hyperlink r:id="rId166">
               <w:r>
                 <w:rPr>
                   <w:rStyle w:val="Hyperlink"/>
@@ -18605,7 +18997,7 @@
             <w:pPr>
               <w:pStyle w:val="Compact"/>
             </w:pPr>
-            <w:hyperlink r:id="rId165">
+            <w:hyperlink r:id="rId167">
               <w:r>
                 <w:rPr>
                   <w:rStyle w:val="Hyperlink"/>
@@ -18622,7 +19014,7 @@
             <w:r>
               <w:t xml:space="preserve"> </w:t>
             </w:r>
-            <w:hyperlink r:id="rId166">
+            <w:hyperlink r:id="rId168">
               <w:r>
                 <w:rPr>
                   <w:rStyle w:val="Hyperlink"/>
@@ -18655,7 +19047,7 @@
             <w:pPr>
               <w:pStyle w:val="Compact"/>
             </w:pPr>
-            <w:hyperlink r:id="rId84">
+            <w:hyperlink r:id="rId86">
               <w:r>
                 <w:rPr>
                   <w:rStyle w:val="Hyperlink"/>
@@ -18688,7 +19080,7 @@
             <w:pPr>
               <w:pStyle w:val="Compact"/>
             </w:pPr>
-            <w:hyperlink r:id="rId167">
+            <w:hyperlink r:id="rId169">
               <w:r>
                 <w:rPr>
                   <w:rStyle w:val="Hyperlink"/>
@@ -18705,7 +19097,7 @@
             <w:r>
               <w:t xml:space="preserve"> </w:t>
             </w:r>
-            <w:hyperlink r:id="rId168">
+            <w:hyperlink r:id="rId170">
               <w:r>
                 <w:rPr>
                   <w:rStyle w:val="Hyperlink"/>
@@ -18738,7 +19130,7 @@
             <w:pPr>
               <w:pStyle w:val="Compact"/>
             </w:pPr>
-            <w:hyperlink r:id="rId169">
+            <w:hyperlink r:id="rId171">
               <w:r>
                 <w:rPr>
                   <w:rStyle w:val="Hyperlink"/>
@@ -18771,7 +19163,7 @@
             <w:pPr>
               <w:pStyle w:val="Compact"/>
             </w:pPr>
-            <w:hyperlink r:id="rId170">
+            <w:hyperlink r:id="rId172">
               <w:r>
                 <w:rPr>
                   <w:rStyle w:val="Hyperlink"/>
@@ -18810,7 +19202,7 @@
             <w:pPr>
               <w:pStyle w:val="Compact"/>
             </w:pPr>
-            <w:hyperlink r:id="rId83">
+            <w:hyperlink r:id="rId85">
               <w:r>
                 <w:rPr>
                   <w:rStyle w:val="Hyperlink"/>
@@ -18843,7 +19235,7 @@
             <w:pPr>
               <w:pStyle w:val="Compact"/>
             </w:pPr>
-            <w:hyperlink r:id="rId171">
+            <w:hyperlink r:id="rId173">
               <w:r>
                 <w:rPr>
                   <w:rStyle w:val="Hyperlink"/>
@@ -18882,7 +19274,7 @@
             <w:pPr>
               <w:pStyle w:val="Compact"/>
             </w:pPr>
-            <w:hyperlink r:id="rId97">
+            <w:hyperlink r:id="rId99">
               <w:r>
                 <w:rPr>
                   <w:rStyle w:val="Hyperlink"/>
@@ -18894,8 +19286,8 @@
         </w:tc>
       </w:tr>
     </w:tbl>
-    <w:bookmarkEnd w:id="172"/>
-    <w:bookmarkStart w:id="179" w:name="X011570783de1287755e50c3f490af8b8964278f"/>
+    <w:bookmarkEnd w:id="174"/>
+    <w:bookmarkStart w:id="181" w:name="X011570783de1287755e50c3f490af8b8964278f"/>
     <w:p>
       <w:pPr>
         <w:pStyle w:val="Heading2"/>
@@ -18966,7 +19358,7 @@
             <w:pPr>
               <w:pStyle w:val="Compact"/>
             </w:pPr>
-            <w:hyperlink r:id="rId173">
+            <w:hyperlink r:id="rId175">
               <w:r>
                 <w:rPr>
                   <w:rStyle w:val="Hyperlink"/>
@@ -18999,7 +19391,7 @@
             <w:pPr>
               <w:pStyle w:val="Compact"/>
             </w:pPr>
-            <w:hyperlink r:id="rId174">
+            <w:hyperlink r:id="rId176">
               <w:r>
                 <w:rPr>
                   <w:rStyle w:val="Hyperlink"/>
@@ -19038,7 +19430,7 @@
             <w:pPr>
               <w:pStyle w:val="Compact"/>
             </w:pPr>
-            <w:hyperlink r:id="rId175">
+            <w:hyperlink r:id="rId177">
               <w:r>
                 <w:rPr>
                   <w:rStyle w:val="Hyperlink"/>
@@ -19077,7 +19469,7 @@
             <w:pPr>
               <w:pStyle w:val="Compact"/>
             </w:pPr>
-            <w:hyperlink r:id="rId176">
+            <w:hyperlink r:id="rId178">
               <w:r>
                 <w:rPr>
                   <w:rStyle w:val="Hyperlink"/>
@@ -19094,7 +19486,7 @@
             <w:r>
               <w:t xml:space="preserve"> </w:t>
             </w:r>
-            <w:hyperlink r:id="rId177">
+            <w:hyperlink r:id="rId179">
               <w:r>
                 <w:rPr>
                   <w:rStyle w:val="Hyperlink"/>
@@ -19127,7 +19519,7 @@
             <w:pPr>
               <w:pStyle w:val="Compact"/>
             </w:pPr>
-            <w:hyperlink r:id="rId178">
+            <w:hyperlink r:id="rId180">
               <w:r>
                 <w:rPr>
                   <w:rStyle w:val="Hyperlink"/>
@@ -19139,8 +19531,8 @@
         </w:tc>
       </w:tr>
     </w:tbl>
-    <w:bookmarkEnd w:id="179"/>
-    <w:bookmarkStart w:id="181" w:name="X082dd34c61e8e62b7c7863d3fda7caa433b35da"/>
+    <w:bookmarkEnd w:id="181"/>
+    <w:bookmarkStart w:id="183" w:name="X082dd34c61e8e62b7c7863d3fda7caa433b35da"/>
     <w:p>
       <w:pPr>
         <w:pStyle w:val="Heading2"/>
@@ -19176,7 +19568,7 @@
       <w:r>
         <w:t xml:space="preserve">(</w:t>
       </w:r>
-      <w:hyperlink r:id="rId34">
+      <w:hyperlink r:id="rId36">
         <w:r>
           <w:rPr>
             <w:rStyle w:val="Hyperlink"/>
@@ -19203,7 +19595,7 @@
       <w:r>
         <w:t xml:space="preserve">(</w:t>
       </w:r>
-      <w:hyperlink r:id="rId35">
+      <w:hyperlink r:id="rId37">
         <w:r>
           <w:rPr>
             <w:rStyle w:val="Hyperlink"/>
@@ -19217,7 +19609,7 @@
       <w:r>
         <w:t xml:space="preserve"> </w:t>
       </w:r>
-      <w:hyperlink r:id="rId38">
+      <w:hyperlink r:id="rId40">
         <w:r>
           <w:rPr>
             <w:rStyle w:val="Hyperlink"/>
@@ -19256,7 +19648,7 @@
       <w:r>
         <w:t xml:space="preserve">(</w:t>
       </w:r>
-      <w:hyperlink r:id="rId68">
+      <w:hyperlink r:id="rId70">
         <w:r>
           <w:rPr>
             <w:rStyle w:val="Hyperlink"/>
@@ -19283,7 +19675,7 @@
       <w:r>
         <w:t xml:space="preserve">(</w:t>
       </w:r>
-      <w:hyperlink r:id="rId180">
+      <w:hyperlink r:id="rId182">
         <w:r>
           <w:rPr>
             <w:rStyle w:val="Hyperlink"/>
@@ -19322,7 +19714,7 @@
       <w:r>
         <w:t xml:space="preserve">(</w:t>
       </w:r>
-      <w:hyperlink r:id="rId111">
+      <w:hyperlink r:id="rId113">
         <w:r>
           <w:rPr>
             <w:rStyle w:val="Hyperlink"/>
@@ -19334,8 +19726,8 @@
         <w:t xml:space="preserve">).</w:t>
       </w:r>
     </w:p>
-    <w:bookmarkEnd w:id="181"/>
-    <w:bookmarkStart w:id="186" w:name="X14ec8f5b1622609a9f583df5640a9e05ed39ace"/>
+    <w:bookmarkEnd w:id="183"/>
+    <w:bookmarkStart w:id="188" w:name="X14ec8f5b1622609a9f583df5640a9e05ed39ace"/>
     <w:p>
       <w:pPr>
         <w:pStyle w:val="Heading2"/>
@@ -19406,7 +19798,7 @@
             <w:pPr>
               <w:pStyle w:val="Compact"/>
             </w:pPr>
-            <w:hyperlink r:id="rId182">
+            <w:hyperlink r:id="rId184">
               <w:r>
                 <w:rPr>
                   <w:rStyle w:val="Hyperlink"/>
@@ -19439,7 +19831,7 @@
             <w:pPr>
               <w:pStyle w:val="Compact"/>
             </w:pPr>
-            <w:hyperlink r:id="rId183">
+            <w:hyperlink r:id="rId185">
               <w:r>
                 <w:rPr>
                   <w:rStyle w:val="Hyperlink"/>
@@ -19472,7 +19864,7 @@
             <w:pPr>
               <w:pStyle w:val="Compact"/>
             </w:pPr>
-            <w:hyperlink r:id="rId184">
+            <w:hyperlink r:id="rId186">
               <w:r>
                 <w:rPr>
                   <w:rStyle w:val="Hyperlink"/>
@@ -19505,7 +19897,7 @@
             <w:pPr>
               <w:pStyle w:val="Compact"/>
             </w:pPr>
-            <w:hyperlink r:id="rId185">
+            <w:hyperlink r:id="rId187">
               <w:r>
                 <w:rPr>
                   <w:rStyle w:val="Hyperlink"/>
@@ -19544,7 +19936,7 @@
             <w:pPr>
               <w:pStyle w:val="Compact"/>
             </w:pPr>
-            <w:hyperlink r:id="rId76">
+            <w:hyperlink r:id="rId78">
               <w:r>
                 <w:rPr>
                   <w:rStyle w:val="Hyperlink"/>
@@ -19556,8 +19948,8 @@
         </w:tc>
       </w:tr>
     </w:tbl>
-    <w:bookmarkEnd w:id="186"/>
-    <w:bookmarkStart w:id="193" w:name="Xc7ed05af28feb682c190837c8bc1a9af1ba32c8"/>
+    <w:bookmarkEnd w:id="188"/>
+    <w:bookmarkStart w:id="195" w:name="Xc7ed05af28feb682c190837c8bc1a9af1ba32c8"/>
     <w:p>
       <w:pPr>
         <w:pStyle w:val="Heading2"/>
@@ -19677,7 +20069,7 @@
             <w:pPr>
               <w:pStyle w:val="Compact"/>
             </w:pPr>
-            <w:hyperlink r:id="rId187">
+            <w:hyperlink r:id="rId189">
               <w:r>
                 <w:rPr>
                   <w:rStyle w:val="Hyperlink"/>
@@ -19738,7 +20130,7 @@
             <w:pPr>
               <w:pStyle w:val="Compact"/>
             </w:pPr>
-            <w:hyperlink r:id="rId81">
+            <w:hyperlink r:id="rId83">
               <w:r>
                 <w:rPr>
                   <w:rStyle w:val="Hyperlink"/>
@@ -19799,7 +20191,7 @@
             <w:pPr>
               <w:pStyle w:val="Compact"/>
             </w:pPr>
-            <w:hyperlink r:id="rId188">
+            <w:hyperlink r:id="rId190">
               <w:r>
                 <w:rPr>
                   <w:rStyle w:val="Hyperlink"/>
@@ -19860,7 +20252,7 @@
             <w:pPr>
               <w:pStyle w:val="Compact"/>
             </w:pPr>
-            <w:hyperlink r:id="rId189">
+            <w:hyperlink r:id="rId191">
               <w:r>
                 <w:rPr>
                   <w:rStyle w:val="Hyperlink"/>
@@ -19921,7 +20313,7 @@
             <w:pPr>
               <w:pStyle w:val="Compact"/>
             </w:pPr>
-            <w:hyperlink r:id="rId75">
+            <w:hyperlink r:id="rId77">
               <w:r>
                 <w:rPr>
                   <w:rStyle w:val="Hyperlink"/>
@@ -19982,7 +20374,7 @@
             <w:pPr>
               <w:pStyle w:val="Compact"/>
             </w:pPr>
-            <w:hyperlink r:id="rId190">
+            <w:hyperlink r:id="rId192">
               <w:r>
                 <w:rPr>
                   <w:rStyle w:val="Hyperlink"/>
@@ -20037,7 +20429,7 @@
             <w:pPr>
               <w:pStyle w:val="Compact"/>
             </w:pPr>
-            <w:hyperlink r:id="rId191">
+            <w:hyperlink r:id="rId193">
               <w:r>
                 <w:rPr>
                   <w:rStyle w:val="Hyperlink"/>
@@ -20092,7 +20484,7 @@
             <w:pPr>
               <w:pStyle w:val="Compact"/>
             </w:pPr>
-            <w:hyperlink r:id="rId192">
+            <w:hyperlink r:id="rId194">
               <w:r>
                 <w:rPr>
                   <w:rStyle w:val="Hyperlink"/>
@@ -20104,8 +20496,8 @@
         </w:tc>
       </w:tr>
     </w:tbl>
-    <w:bookmarkEnd w:id="193"/>
-    <w:bookmarkStart w:id="200" w:name="Xcd001e6730cf48d19baf540729163167a4350db"/>
+    <w:bookmarkEnd w:id="195"/>
+    <w:bookmarkStart w:id="202" w:name="Xcd001e6730cf48d19baf540729163167a4350db"/>
     <w:p>
       <w:pPr>
         <w:pStyle w:val="Heading2"/>
@@ -20196,7 +20588,7 @@
             <w:pPr>
               <w:pStyle w:val="Compact"/>
             </w:pPr>
-            <w:hyperlink r:id="rId194">
+            <w:hyperlink r:id="rId196">
               <w:r>
                 <w:rPr>
                   <w:rStyle w:val="Hyperlink"/>
@@ -20240,7 +20632,7 @@
             <w:pPr>
               <w:pStyle w:val="Compact"/>
             </w:pPr>
-            <w:hyperlink r:id="rId195">
+            <w:hyperlink r:id="rId197">
               <w:r>
                 <w:rPr>
                   <w:rStyle w:val="Hyperlink"/>
@@ -20290,7 +20682,7 @@
             <w:pPr>
               <w:pStyle w:val="Compact"/>
             </w:pPr>
-            <w:hyperlink r:id="rId196">
+            <w:hyperlink r:id="rId198">
               <w:r>
                 <w:rPr>
                   <w:rStyle w:val="Hyperlink"/>
@@ -20334,7 +20726,7 @@
             <w:pPr>
               <w:pStyle w:val="Compact"/>
             </w:pPr>
-            <w:hyperlink r:id="rId197">
+            <w:hyperlink r:id="rId199">
               <w:r>
                 <w:rPr>
                   <w:rStyle w:val="Hyperlink"/>
@@ -20378,7 +20770,7 @@
             <w:pPr>
               <w:pStyle w:val="Compact"/>
             </w:pPr>
-            <w:hyperlink r:id="rId198">
+            <w:hyperlink r:id="rId200">
               <w:r>
                 <w:rPr>
                   <w:rStyle w:val="Hyperlink"/>
@@ -20422,7 +20814,7 @@
             <w:pPr>
               <w:pStyle w:val="Compact"/>
             </w:pPr>
-            <w:hyperlink r:id="rId199">
+            <w:hyperlink r:id="rId201">
               <w:r>
                 <w:rPr>
                   <w:rStyle w:val="Hyperlink"/>
@@ -20434,8 +20826,8 @@
         </w:tc>
       </w:tr>
     </w:tbl>
-    <w:bookmarkEnd w:id="200"/>
-    <w:bookmarkStart w:id="203" w:name="X08937572949dd7c9fa04fb3f18b6ea1349e11db"/>
+    <w:bookmarkEnd w:id="202"/>
+    <w:bookmarkStart w:id="205" w:name="X08937572949dd7c9fa04fb3f18b6ea1349e11db"/>
     <w:p>
       <w:pPr>
         <w:pStyle w:val="Heading2"/>
@@ -20461,7 +20853,7 @@
       <w:r>
         <w:t xml:space="preserve">(</w:t>
       </w:r>
-      <w:hyperlink r:id="rId201">
+      <w:hyperlink r:id="rId203">
         <w:r>
           <w:rPr>
             <w:rStyle w:val="Hyperlink"/>
@@ -20488,7 +20880,7 @@
       <w:r>
         <w:t xml:space="preserve">(</w:t>
       </w:r>
-      <w:hyperlink r:id="rId202">
+      <w:hyperlink r:id="rId204">
         <w:r>
           <w:rPr>
             <w:rStyle w:val="Hyperlink"/>
@@ -20500,8 +20892,8 @@
         <w:t xml:space="preserve">) — model &amp; kỹ thuật mới.</w:t>
       </w:r>
     </w:p>
-    <w:bookmarkEnd w:id="203"/>
-    <w:bookmarkStart w:id="208" w:name="Xf339164448bf29985a99b2ada7551988d18d607"/>
+    <w:bookmarkEnd w:id="205"/>
+    <w:bookmarkStart w:id="210" w:name="Xf339164448bf29985a99b2ada7551988d18d607"/>
     <w:p>
       <w:pPr>
         <w:pStyle w:val="Heading2"/>
@@ -20592,7 +20984,7 @@
             <w:pPr>
               <w:pStyle w:val="Compact"/>
             </w:pPr>
-            <w:hyperlink r:id="rId204">
+            <w:hyperlink r:id="rId206">
               <w:r>
                 <w:rPr>
                   <w:rStyle w:val="Hyperlink"/>
@@ -20636,7 +21028,7 @@
             <w:pPr>
               <w:pStyle w:val="Compact"/>
             </w:pPr>
-            <w:hyperlink r:id="rId205">
+            <w:hyperlink r:id="rId207">
               <w:r>
                 <w:rPr>
                   <w:rStyle w:val="Hyperlink"/>
@@ -20680,7 +21072,7 @@
             <w:pPr>
               <w:pStyle w:val="Compact"/>
             </w:pPr>
-            <w:hyperlink r:id="rId204">
+            <w:hyperlink r:id="rId206">
               <w:r>
                 <w:rPr>
                   <w:rStyle w:val="Hyperlink"/>
@@ -20724,7 +21116,7 @@
             <w:pPr>
               <w:pStyle w:val="Compact"/>
             </w:pPr>
-            <w:hyperlink r:id="rId206">
+            <w:hyperlink r:id="rId208">
               <w:r>
                 <w:rPr>
                   <w:rStyle w:val="Hyperlink"/>
@@ -20768,7 +21160,7 @@
             <w:pPr>
               <w:pStyle w:val="Compact"/>
             </w:pPr>
-            <w:hyperlink r:id="rId207">
+            <w:hyperlink r:id="rId209">
               <w:r>
                 <w:rPr>
                   <w:rStyle w:val="Hyperlink"/>
@@ -20780,8 +21172,8 @@
         </w:tc>
       </w:tr>
     </w:tbl>
-    <w:bookmarkEnd w:id="208"/>
-    <w:bookmarkStart w:id="211" w:name="Xcba3139b96dacb5f9b764aeace9786b3e5a135c"/>
+    <w:bookmarkEnd w:id="210"/>
+    <w:bookmarkStart w:id="213" w:name="Xcba3139b96dacb5f9b764aeace9786b3e5a135c"/>
     <w:p>
       <w:pPr>
         <w:pStyle w:val="Heading2"/>
@@ -20852,7 +21244,7 @@
             <w:r>
               <w:t xml:space="preserve"> </w:t>
             </w:r>
-            <w:hyperlink r:id="rId209">
+            <w:hyperlink r:id="rId211">
               <w:r>
                 <w:rPr>
                   <w:rStyle w:val="Hyperlink"/>
@@ -20891,7 +21283,7 @@
             <w:r>
               <w:t xml:space="preserve"> </w:t>
             </w:r>
-            <w:hyperlink r:id="rId210">
+            <w:hyperlink r:id="rId212">
               <w:r>
                 <w:rPr>
                   <w:rStyle w:val="Hyperlink"/>
@@ -20982,8 +21374,8 @@
         </w:pict>
       </w:r>
     </w:p>
-    <w:bookmarkEnd w:id="211"/>
-    <w:bookmarkStart w:id="212" w:name="lời-kết"/>
+    <w:bookmarkEnd w:id="213"/>
+    <w:bookmarkStart w:id="214" w:name="lời-kết"/>
     <w:p>
       <w:pPr>
         <w:pStyle w:val="Heading2"/>
@@ -21121,8 +21513,8 @@
         <w:t xml:space="preserve">Chúc các bạn build được dự án AI có ý nghĩa cho đơn vị mình.</w:t>
       </w:r>
     </w:p>
-    <w:bookmarkEnd w:id="212"/>
-    <w:bookmarkEnd w:id="213"/>
+    <w:bookmarkEnd w:id="214"/>
+    <w:bookmarkEnd w:id="215"/>
     <w:sectPr>
       <w:footerReference w:type="default" r:id="rId10"/>
       <w:footnotePr>

</xml_diff>

<commit_message>
Them fallback khi Docker bi chan (sau khi TEST THAT pip open-webui)
Review thuan tien (8/10) goi y dung pip lam duong UI chinh vi 'nhe hon Docker'. TEST THAT: pip install open-webui = 2.5GB, ~24 phut -> KHONG nhe, con nang hon Docker. Vi vay GIU Docker la duong UI chinh; chi them note trung thuc cho truong hop Docker bi chan (may cong ty): (a) van hoc day du bang notebook/CLI - UI khong bat buoc; (b) pip install open-webui (port 8000) - khong can Docker nhung lan dau nang ~2.5GB/~20'. Them o README sec5 + 0_setup + handbook (rebuild docx).

Co-Authored-By: Claude Opus 4.8 (1M context) <noreply@anthropic.com>
</commit_message>
<xml_diff>
--- a/docs/TAI_LIEU_CHI_TIET.docx
+++ b/docs/TAI_LIEU_CHI_TIET.docx
@@ -1492,7 +1492,22 @@
         <w:t xml:space="preserve"> </w:t>
       </w:r>
       <w:r>
-        <w:t xml:space="preserve">(đẹp như ChatGPT, kéo–thả tài liệu để hỏi đáp): cài thêm Docker Desktop. Lưu ý: RAG trong Open WebUI là</w:t>
+        <w:t xml:space="preserve">(đẹp như ChatGPT, kéo–thả tài liệu để hỏi đáp): cài thêm Docker Desktop. (Docker bị chặn? Học đủ bằng notebook/CLI; hoặc</w:t>
+      </w:r>
+      <w:r>
+        <w:t xml:space="preserve"> </w:t>
+      </w:r>
+      <w:r>
+        <w:rPr>
+          <w:rStyle w:val="VerbatimChar"/>
+        </w:rPr>
+        <w:t xml:space="preserve">pip install open-webui</w:t>
+      </w:r>
+      <w:r>
+        <w:t xml:space="preserve"> </w:t>
+      </w:r>
+      <w:r>
+        <w:t xml:space="preserve">— không cần Docker nhưng lần đầu nặng ~2.5GB/~20'.) Lưu ý: RAG trong Open WebUI là</w:t>
       </w:r>
       <w:r>
         <w:t xml:space="preserve"> </w:t>

</xml_diff>